<commit_message>
Makale sunumu yenilendi: eleştirisiz aktarım, makalenin özgün tabloları
Eleştirel değerlendirme ve odds/risk oranı slaytları çıkarıldı; sunum
yalnızca makaleyi aktaracak şekilde düzenlendi. Bulgular bölümünde kendi
grafikler yerine makalenin Tablo 1-6'sı kaynak gösterilerek özgün
halleriyle kullanıldı (Tablo 2 iki slayta bölündü). Konuşma notları ve
olası sorular buna göre yeniden yazıldı.

Co-Authored-By: Claude Opus 5.5 <noreply@anthropic.com>
Claude-Session: https://claude.ai/code/session_013LLNDYinKcb3EYpgyk92AX
</commit_message>
<xml_diff>
--- a/Sunumlar/Konusma_Notlari_Sigara_Birakma.docx
+++ b/Sunumlar/Konusma_Notlari_Sigara_Birakma.docx
@@ -65,7 +65,7 @@
         <w:jc w:val="both"/>
       </w:pPr>
       <w:r>
-        <w:t xml:space="preserve">Sunum 28 slayttan oluşmaktadır. Konuşma süresi yaklaşık 32 dakikadır; ardından 10 dakikalık tartışma planlanmıştır.</w:t>
+        <w:t xml:space="preserve">Sunum 28 slayttan oluşmaktadır. Konuşma süresi yaklaşık 29 dakikadır; ardından kısa bir tartışma planlanmıştır.</w:t>
       </w:r>
     </w:p>
     <w:p>
@@ -108,20 +108,6 @@
       </w:pPr>
       <w:r>
         <w:t xml:space="preserve">Köşeli parantez içindeki [Ad Soyad], [kaçıncı yıl] ve [e-posta adresi] alanlarını sunumdan önce doldurun. Bu alanlar 1. ve 28. slaytta da yer almaktadır.</w:t>
-      </w:r>
-    </w:p>
-    <w:p>
-      <w:pPr>
-        <w:pStyle w:val="ListParagraph"/>
-        <w:numPr>
-          <w:ilvl w:val="0"/>
-          <w:numId w:val="1"/>
-        </w:numPr>
-        <w:spacing w:after="80" w:line="290"/>
-        <w:jc w:val="both"/>
-      </w:pPr>
-      <w:r>
-        <w:t xml:space="preserve">Makalenin üçüncü yazarı Prof. Dr. Onur Öztürk, Amasya Üniversitesi Aile Hekimliği Ana Bilim Dalı'ndandır. Hoca dinleyiciler arasında olabilir. Eleştirel değerlendirme slaytlarındaki (22–23) noktaları yapıcı ve soru biçiminde dile getirmeniz önerilir.</w:t>
       </w:r>
     </w:p>
     <w:p>
@@ -518,38 +504,38 @@
                 <w:sz w:val="20"/>
                 <w:szCs w:val="20"/>
               </w:rPr>
-              <w:t xml:space="preserve">1 dk</w:t>
-            </w:r>
-          </w:p>
-        </w:tc>
-        <w:tc>
-          <w:tcPr>
-            <w:tcW w:type="dxa" w:w="1450"/>
-            <w:tcBorders>
-              <w:top w:val="single" w:color="C9DCDF" w:sz="4"/>
-              <w:left w:val="single" w:color="C9DCDF" w:sz="4"/>
-              <w:bottom w:val="single" w:color="C9DCDF" w:sz="4"/>
-              <w:right w:val="single" w:color="C9DCDF" w:sz="4"/>
-            </w:tcBorders>
-            <w:tcMar>
-              <w:top w:type="dxa" w:w="40"/>
-              <w:left w:type="dxa" w:w="100"/>
-              <w:bottom w:type="dxa" w:w="40"/>
-              <w:right w:type="dxa" w:w="100"/>
-            </w:tcMar>
-          </w:tcPr>
-          <w:p>
-            <w:pPr>
-              <w:jc w:val="center"/>
-            </w:pPr>
-            <w:r>
-              <w:rPr>
-                <w:b w:val="false"/>
-                <w:bCs w:val="false"/>
-                <w:sz w:val="20"/>
-                <w:szCs w:val="20"/>
-              </w:rPr>
-              <w:t xml:space="preserve">2 dk</w:t>
+              <w:t xml:space="preserve">30 sn</w:t>
+            </w:r>
+          </w:p>
+        </w:tc>
+        <w:tc>
+          <w:tcPr>
+            <w:tcW w:type="dxa" w:w="1450"/>
+            <w:tcBorders>
+              <w:top w:val="single" w:color="C9DCDF" w:sz="4"/>
+              <w:left w:val="single" w:color="C9DCDF" w:sz="4"/>
+              <w:bottom w:val="single" w:color="C9DCDF" w:sz="4"/>
+              <w:right w:val="single" w:color="C9DCDF" w:sz="4"/>
+            </w:tcBorders>
+            <w:tcMar>
+              <w:top w:type="dxa" w:w="40"/>
+              <w:left w:type="dxa" w:w="100"/>
+              <w:bottom w:type="dxa" w:w="40"/>
+              <w:right w:type="dxa" w:w="100"/>
+            </w:tcMar>
+          </w:tcPr>
+          <w:p>
+            <w:pPr>
+              <w:jc w:val="center"/>
+            </w:pPr>
+            <w:r>
+              <w:rPr>
+                <w:b w:val="false"/>
+                <w:bCs w:val="false"/>
+                <w:sz w:val="20"/>
+                <w:szCs w:val="20"/>
+              </w:rPr>
+              <w:t xml:space="preserve">1 dk 30 sn</w:t>
             </w:r>
           </w:p>
         </w:tc>
@@ -644,38 +630,38 @@
                 <w:sz w:val="20"/>
                 <w:szCs w:val="20"/>
               </w:rPr>
-              <w:t xml:space="preserve">1 dk</w:t>
-            </w:r>
-          </w:p>
-        </w:tc>
-        <w:tc>
-          <w:tcPr>
-            <w:tcW w:type="dxa" w:w="1450"/>
-            <w:tcBorders>
-              <w:top w:val="single" w:color="C9DCDF" w:sz="4"/>
-              <w:left w:val="single" w:color="C9DCDF" w:sz="4"/>
-              <w:bottom w:val="single" w:color="C9DCDF" w:sz="4"/>
-              <w:right w:val="single" w:color="C9DCDF" w:sz="4"/>
-            </w:tcBorders>
-            <w:tcMar>
-              <w:top w:type="dxa" w:w="40"/>
-              <w:left w:type="dxa" w:w="100"/>
-              <w:bottom w:type="dxa" w:w="40"/>
-              <w:right w:type="dxa" w:w="100"/>
-            </w:tcMar>
-          </w:tcPr>
-          <w:p>
-            <w:pPr>
-              <w:jc w:val="center"/>
-            </w:pPr>
-            <w:r>
-              <w:rPr>
-                <w:b w:val="false"/>
-                <w:bCs w:val="false"/>
-                <w:sz w:val="20"/>
-                <w:szCs w:val="20"/>
-              </w:rPr>
-              <w:t xml:space="preserve">3 dk</w:t>
+              <w:t xml:space="preserve">30 sn</w:t>
+            </w:r>
+          </w:p>
+        </w:tc>
+        <w:tc>
+          <w:tcPr>
+            <w:tcW w:type="dxa" w:w="1450"/>
+            <w:tcBorders>
+              <w:top w:val="single" w:color="C9DCDF" w:sz="4"/>
+              <w:left w:val="single" w:color="C9DCDF" w:sz="4"/>
+              <w:bottom w:val="single" w:color="C9DCDF" w:sz="4"/>
+              <w:right w:val="single" w:color="C9DCDF" w:sz="4"/>
+            </w:tcBorders>
+            <w:tcMar>
+              <w:top w:type="dxa" w:w="40"/>
+              <w:left w:type="dxa" w:w="100"/>
+              <w:bottom w:type="dxa" w:w="40"/>
+              <w:right w:type="dxa" w:w="100"/>
+            </w:tcMar>
+          </w:tcPr>
+          <w:p>
+            <w:pPr>
+              <w:jc w:val="center"/>
+            </w:pPr>
+            <w:r>
+              <w:rPr>
+                <w:b w:val="false"/>
+                <w:bCs w:val="false"/>
+                <w:sz w:val="20"/>
+                <w:szCs w:val="20"/>
+              </w:rPr>
+              <w:t xml:space="preserve">2 dk</w:t>
             </w:r>
           </w:p>
         </w:tc>
@@ -801,7 +787,7 @@
                 <w:sz w:val="20"/>
                 <w:szCs w:val="20"/>
               </w:rPr>
-              <w:t xml:space="preserve">4 dk</w:t>
+              <w:t xml:space="preserve">3 dk</w:t>
             </w:r>
           </w:p>
         </w:tc>
@@ -927,7 +913,7 @@
                 <w:sz w:val="20"/>
                 <w:szCs w:val="20"/>
               </w:rPr>
-              <w:t xml:space="preserve">5 dk</w:t>
+              <w:t xml:space="preserve">4 dk</w:t>
             </w:r>
           </w:p>
         </w:tc>
@@ -1053,7 +1039,7 @@
                 <w:sz w:val="20"/>
                 <w:szCs w:val="20"/>
               </w:rPr>
-              <w:t xml:space="preserve">6 dk</w:t>
+              <w:t xml:space="preserve">5 dk</w:t>
             </w:r>
           </w:p>
         </w:tc>
@@ -1179,7 +1165,7 @@
                 <w:sz w:val="20"/>
                 <w:szCs w:val="20"/>
               </w:rPr>
-              <w:t xml:space="preserve">6 dk 30 sn</w:t>
+              <w:t xml:space="preserve">5 dk 30 sn</w:t>
             </w:r>
           </w:p>
         </w:tc>
@@ -1274,38 +1260,38 @@
                 <w:sz w:val="20"/>
                 <w:szCs w:val="20"/>
               </w:rPr>
-              <w:t xml:space="preserve">1 dk 30 sn</w:t>
-            </w:r>
-          </w:p>
-        </w:tc>
-        <w:tc>
-          <w:tcPr>
-            <w:tcW w:type="dxa" w:w="1450"/>
-            <w:tcBorders>
-              <w:top w:val="single" w:color="C9DCDF" w:sz="4"/>
-              <w:left w:val="single" w:color="C9DCDF" w:sz="4"/>
-              <w:bottom w:val="single" w:color="C9DCDF" w:sz="4"/>
-              <w:right w:val="single" w:color="C9DCDF" w:sz="4"/>
-            </w:tcBorders>
-            <w:tcMar>
-              <w:top w:type="dxa" w:w="40"/>
-              <w:left w:type="dxa" w:w="100"/>
-              <w:bottom w:type="dxa" w:w="40"/>
-              <w:right w:type="dxa" w:w="100"/>
-            </w:tcMar>
-          </w:tcPr>
-          <w:p>
-            <w:pPr>
-              <w:jc w:val="center"/>
-            </w:pPr>
-            <w:r>
-              <w:rPr>
-                <w:b w:val="false"/>
-                <w:bCs w:val="false"/>
-                <w:sz w:val="20"/>
-                <w:szCs w:val="20"/>
-              </w:rPr>
-              <w:t xml:space="preserve">8 dk</w:t>
+              <w:t xml:space="preserve">1 dk</w:t>
+            </w:r>
+          </w:p>
+        </w:tc>
+        <w:tc>
+          <w:tcPr>
+            <w:tcW w:type="dxa" w:w="1450"/>
+            <w:tcBorders>
+              <w:top w:val="single" w:color="C9DCDF" w:sz="4"/>
+              <w:left w:val="single" w:color="C9DCDF" w:sz="4"/>
+              <w:bottom w:val="single" w:color="C9DCDF" w:sz="4"/>
+              <w:right w:val="single" w:color="C9DCDF" w:sz="4"/>
+            </w:tcBorders>
+            <w:tcMar>
+              <w:top w:type="dxa" w:w="40"/>
+              <w:left w:type="dxa" w:w="100"/>
+              <w:bottom w:type="dxa" w:w="40"/>
+              <w:right w:type="dxa" w:w="100"/>
+            </w:tcMar>
+          </w:tcPr>
+          <w:p>
+            <w:pPr>
+              <w:jc w:val="center"/>
+            </w:pPr>
+            <w:r>
+              <w:rPr>
+                <w:b w:val="false"/>
+                <w:bCs w:val="false"/>
+                <w:sz w:val="20"/>
+                <w:szCs w:val="20"/>
+              </w:rPr>
+              <w:t xml:space="preserve">6 dk 30 sn</w:t>
             </w:r>
           </w:p>
         </w:tc>
@@ -1431,7 +1417,7 @@
                 <w:sz w:val="20"/>
                 <w:szCs w:val="20"/>
               </w:rPr>
-              <w:t xml:space="preserve">9 dk</w:t>
+              <w:t xml:space="preserve">7 dk 30 sn</w:t>
             </w:r>
           </w:p>
         </w:tc>
@@ -1557,7 +1543,7 @@
                 <w:sz w:val="20"/>
                 <w:szCs w:val="20"/>
               </w:rPr>
-              <w:t xml:space="preserve">10 dk</w:t>
+              <w:t xml:space="preserve">8 dk 30 sn</w:t>
             </w:r>
           </w:p>
         </w:tc>
@@ -1652,38 +1638,38 @@
                 <w:sz w:val="20"/>
                 <w:szCs w:val="20"/>
               </w:rPr>
-              <w:t xml:space="preserve">1 dk 30 sn</w:t>
-            </w:r>
-          </w:p>
-        </w:tc>
-        <w:tc>
-          <w:tcPr>
-            <w:tcW w:type="dxa" w:w="1450"/>
-            <w:tcBorders>
-              <w:top w:val="single" w:color="C9DCDF" w:sz="4"/>
-              <w:left w:val="single" w:color="C9DCDF" w:sz="4"/>
-              <w:bottom w:val="single" w:color="C9DCDF" w:sz="4"/>
-              <w:right w:val="single" w:color="C9DCDF" w:sz="4"/>
-            </w:tcBorders>
-            <w:tcMar>
-              <w:top w:type="dxa" w:w="40"/>
-              <w:left w:type="dxa" w:w="100"/>
-              <w:bottom w:type="dxa" w:w="40"/>
-              <w:right w:type="dxa" w:w="100"/>
-            </w:tcMar>
-          </w:tcPr>
-          <w:p>
-            <w:pPr>
-              <w:jc w:val="center"/>
-            </w:pPr>
-            <w:r>
-              <w:rPr>
-                <w:b w:val="false"/>
-                <w:bCs w:val="false"/>
-                <w:sz w:val="20"/>
-                <w:szCs w:val="20"/>
-              </w:rPr>
-              <w:t xml:space="preserve">11 dk 30 sn</w:t>
+              <w:t xml:space="preserve">1 dk</w:t>
+            </w:r>
+          </w:p>
+        </w:tc>
+        <w:tc>
+          <w:tcPr>
+            <w:tcW w:type="dxa" w:w="1450"/>
+            <w:tcBorders>
+              <w:top w:val="single" w:color="C9DCDF" w:sz="4"/>
+              <w:left w:val="single" w:color="C9DCDF" w:sz="4"/>
+              <w:bottom w:val="single" w:color="C9DCDF" w:sz="4"/>
+              <w:right w:val="single" w:color="C9DCDF" w:sz="4"/>
+            </w:tcBorders>
+            <w:tcMar>
+              <w:top w:type="dxa" w:w="40"/>
+              <w:left w:type="dxa" w:w="100"/>
+              <w:bottom w:type="dxa" w:w="40"/>
+              <w:right w:type="dxa" w:w="100"/>
+            </w:tcMar>
+          </w:tcPr>
+          <w:p>
+            <w:pPr>
+              <w:jc w:val="center"/>
+            </w:pPr>
+            <w:r>
+              <w:rPr>
+                <w:b w:val="false"/>
+                <w:bCs w:val="false"/>
+                <w:sz w:val="20"/>
+                <w:szCs w:val="20"/>
+              </w:rPr>
+              <w:t xml:space="preserve">9 dk 30 sn</w:t>
             </w:r>
           </w:p>
         </w:tc>
@@ -1809,7 +1795,7 @@
                 <w:sz w:val="20"/>
                 <w:szCs w:val="20"/>
               </w:rPr>
-              <w:t xml:space="preserve">12 dk 30 sn</w:t>
+              <w:t xml:space="preserve">10 dk 30 sn</w:t>
             </w:r>
           </w:p>
         </w:tc>
@@ -1935,7 +1921,7 @@
                 <w:sz w:val="20"/>
                 <w:szCs w:val="20"/>
               </w:rPr>
-              <w:t xml:space="preserve">13 dk 30 sn</w:t>
+              <w:t xml:space="preserve">11 dk 30 sn</w:t>
             </w:r>
           </w:p>
         </w:tc>
@@ -1999,7 +1985,7 @@
                 <w:sz w:val="20"/>
                 <w:szCs w:val="20"/>
               </w:rPr>
-              <w:t xml:space="preserve">Evde sigara içilmesi başarıyı azaltmaktadır</w:t>
+              <w:t xml:space="preserve">Tablo 1: Sosyodemografik özellikler</w:t>
             </w:r>
           </w:p>
         </w:tc>
@@ -2061,7 +2047,7 @@
                 <w:sz w:val="20"/>
                 <w:szCs w:val="20"/>
               </w:rPr>
-              <w:t xml:space="preserve">14 dk 30 sn</w:t>
+              <w:t xml:space="preserve">12 dk 30 sn</w:t>
             </w:r>
           </w:p>
         </w:tc>
@@ -2125,7 +2111,7 @@
                 <w:sz w:val="20"/>
                 <w:szCs w:val="20"/>
               </w:rPr>
-              <w:t xml:space="preserve">En sık kombine tedavi uygulanmıştır</w:t>
+              <w:t xml:space="preserve">Tablo 2: Sosyodemografik özellikler ve bırakma (1)</w:t>
             </w:r>
           </w:p>
         </w:tc>
@@ -2187,7 +2173,7 @@
                 <w:sz w:val="20"/>
                 <w:szCs w:val="20"/>
               </w:rPr>
-              <w:t xml:space="preserve">15 dk 30 sn</w:t>
+              <w:t xml:space="preserve">13 dk 30 sn</w:t>
             </w:r>
           </w:p>
         </w:tc>
@@ -2251,69 +2237,69 @@
                 <w:sz w:val="20"/>
                 <w:szCs w:val="20"/>
               </w:rPr>
-              <w:t xml:space="preserve">En düşük başarı bupropion monoterapisinde</w:t>
-            </w:r>
-          </w:p>
-        </w:tc>
-        <w:tc>
-          <w:tcPr>
-            <w:tcW w:type="dxa" w:w="1450"/>
-            <w:tcBorders>
-              <w:top w:val="single" w:color="C9DCDF" w:sz="4"/>
-              <w:left w:val="single" w:color="C9DCDF" w:sz="4"/>
-              <w:bottom w:val="single" w:color="C9DCDF" w:sz="4"/>
-              <w:right w:val="single" w:color="C9DCDF" w:sz="4"/>
-            </w:tcBorders>
-            <w:tcMar>
-              <w:top w:type="dxa" w:w="40"/>
-              <w:left w:type="dxa" w:w="100"/>
-              <w:bottom w:type="dxa" w:w="40"/>
-              <w:right w:type="dxa" w:w="100"/>
-            </w:tcMar>
-          </w:tcPr>
-          <w:p>
-            <w:pPr>
-              <w:jc w:val="center"/>
-            </w:pPr>
-            <w:r>
-              <w:rPr>
-                <w:b w:val="false"/>
-                <w:bCs w:val="false"/>
-                <w:sz w:val="20"/>
-                <w:szCs w:val="20"/>
-              </w:rPr>
-              <w:t xml:space="preserve">1 dk 30 sn</w:t>
-            </w:r>
-          </w:p>
-        </w:tc>
-        <w:tc>
-          <w:tcPr>
-            <w:tcW w:type="dxa" w:w="1450"/>
-            <w:tcBorders>
-              <w:top w:val="single" w:color="C9DCDF" w:sz="4"/>
-              <w:left w:val="single" w:color="C9DCDF" w:sz="4"/>
-              <w:bottom w:val="single" w:color="C9DCDF" w:sz="4"/>
-              <w:right w:val="single" w:color="C9DCDF" w:sz="4"/>
-            </w:tcBorders>
-            <w:tcMar>
-              <w:top w:type="dxa" w:w="40"/>
-              <w:left w:type="dxa" w:w="100"/>
-              <w:bottom w:type="dxa" w:w="40"/>
-              <w:right w:type="dxa" w:w="100"/>
-            </w:tcMar>
-          </w:tcPr>
-          <w:p>
-            <w:pPr>
-              <w:jc w:val="center"/>
-            </w:pPr>
-            <w:r>
-              <w:rPr>
-                <w:b w:val="false"/>
-                <w:bCs w:val="false"/>
-                <w:sz w:val="20"/>
-                <w:szCs w:val="20"/>
-              </w:rPr>
-              <w:t xml:space="preserve">17 dk</w:t>
+              <w:t xml:space="preserve">Tablo 2: Sosyodemografik özellikler ve bırakma (2)</w:t>
+            </w:r>
+          </w:p>
+        </w:tc>
+        <w:tc>
+          <w:tcPr>
+            <w:tcW w:type="dxa" w:w="1450"/>
+            <w:tcBorders>
+              <w:top w:val="single" w:color="C9DCDF" w:sz="4"/>
+              <w:left w:val="single" w:color="C9DCDF" w:sz="4"/>
+              <w:bottom w:val="single" w:color="C9DCDF" w:sz="4"/>
+              <w:right w:val="single" w:color="C9DCDF" w:sz="4"/>
+            </w:tcBorders>
+            <w:tcMar>
+              <w:top w:type="dxa" w:w="40"/>
+              <w:left w:type="dxa" w:w="100"/>
+              <w:bottom w:type="dxa" w:w="40"/>
+              <w:right w:type="dxa" w:w="100"/>
+            </w:tcMar>
+          </w:tcPr>
+          <w:p>
+            <w:pPr>
+              <w:jc w:val="center"/>
+            </w:pPr>
+            <w:r>
+              <w:rPr>
+                <w:b w:val="false"/>
+                <w:bCs w:val="false"/>
+                <w:sz w:val="20"/>
+                <w:szCs w:val="20"/>
+              </w:rPr>
+              <w:t xml:space="preserve">1 dk</w:t>
+            </w:r>
+          </w:p>
+        </w:tc>
+        <w:tc>
+          <w:tcPr>
+            <w:tcW w:type="dxa" w:w="1450"/>
+            <w:tcBorders>
+              <w:top w:val="single" w:color="C9DCDF" w:sz="4"/>
+              <w:left w:val="single" w:color="C9DCDF" w:sz="4"/>
+              <w:bottom w:val="single" w:color="C9DCDF" w:sz="4"/>
+              <w:right w:val="single" w:color="C9DCDF" w:sz="4"/>
+            </w:tcBorders>
+            <w:tcMar>
+              <w:top w:type="dxa" w:w="40"/>
+              <w:left w:type="dxa" w:w="100"/>
+              <w:bottom w:type="dxa" w:w="40"/>
+              <w:right w:type="dxa" w:w="100"/>
+            </w:tcMar>
+          </w:tcPr>
+          <w:p>
+            <w:pPr>
+              <w:jc w:val="center"/>
+            </w:pPr>
+            <w:r>
+              <w:rPr>
+                <w:b w:val="false"/>
+                <w:bCs w:val="false"/>
+                <w:sz w:val="20"/>
+                <w:szCs w:val="20"/>
+              </w:rPr>
+              <w:t xml:space="preserve">14 dk 30 sn</w:t>
             </w:r>
           </w:p>
         </w:tc>
@@ -2377,7 +2363,7 @@
                 <w:sz w:val="20"/>
                 <w:szCs w:val="20"/>
               </w:rPr>
-              <w:t xml:space="preserve">Başarı görüşme sayısıyla artmaktadır</w:t>
+              <w:t xml:space="preserve">Tablo 3: Tedavi seçenekleri</w:t>
             </w:r>
           </w:p>
         </w:tc>
@@ -2439,7 +2425,7 @@
                 <w:sz w:val="20"/>
                 <w:szCs w:val="20"/>
               </w:rPr>
-              <w:t xml:space="preserve">18 dk</w:t>
+              <w:t xml:space="preserve">15 dk 30 sn</w:t>
             </w:r>
           </w:p>
         </w:tc>
@@ -2503,69 +2489,69 @@
                 <w:sz w:val="20"/>
                 <w:szCs w:val="20"/>
               </w:rPr>
-              <w:t xml:space="preserve">Lojistik regresyon (Tablo 6)</w:t>
-            </w:r>
-          </w:p>
-        </w:tc>
-        <w:tc>
-          <w:tcPr>
-            <w:tcW w:type="dxa" w:w="1450"/>
-            <w:tcBorders>
-              <w:top w:val="single" w:color="C9DCDF" w:sz="4"/>
-              <w:left w:val="single" w:color="C9DCDF" w:sz="4"/>
-              <w:bottom w:val="single" w:color="C9DCDF" w:sz="4"/>
-              <w:right w:val="single" w:color="C9DCDF" w:sz="4"/>
-            </w:tcBorders>
-            <w:tcMar>
-              <w:top w:type="dxa" w:w="40"/>
-              <w:left w:type="dxa" w:w="100"/>
-              <w:bottom w:type="dxa" w:w="40"/>
-              <w:right w:type="dxa" w:w="100"/>
-            </w:tcMar>
-          </w:tcPr>
-          <w:p>
-            <w:pPr>
-              <w:jc w:val="center"/>
-            </w:pPr>
-            <w:r>
-              <w:rPr>
-                <w:b w:val="false"/>
-                <w:bCs w:val="false"/>
-                <w:sz w:val="20"/>
-                <w:szCs w:val="20"/>
-              </w:rPr>
-              <w:t xml:space="preserve">2 dk</w:t>
-            </w:r>
-          </w:p>
-        </w:tc>
-        <w:tc>
-          <w:tcPr>
-            <w:tcW w:type="dxa" w:w="1450"/>
-            <w:tcBorders>
-              <w:top w:val="single" w:color="C9DCDF" w:sz="4"/>
-              <w:left w:val="single" w:color="C9DCDF" w:sz="4"/>
-              <w:bottom w:val="single" w:color="C9DCDF" w:sz="4"/>
-              <w:right w:val="single" w:color="C9DCDF" w:sz="4"/>
-            </w:tcBorders>
-            <w:tcMar>
-              <w:top w:type="dxa" w:w="40"/>
-              <w:left w:type="dxa" w:w="100"/>
-              <w:bottom w:type="dxa" w:w="40"/>
-              <w:right w:type="dxa" w:w="100"/>
-            </w:tcMar>
-          </w:tcPr>
-          <w:p>
-            <w:pPr>
-              <w:jc w:val="center"/>
-            </w:pPr>
-            <w:r>
-              <w:rPr>
-                <w:b w:val="false"/>
-                <w:bCs w:val="false"/>
-                <w:sz w:val="20"/>
-                <w:szCs w:val="20"/>
-              </w:rPr>
-              <w:t xml:space="preserve">20 dk</w:t>
+              <w:t xml:space="preserve">Tablo 4: Görüşme sayısı, FNBT ve paket-yıl</w:t>
+            </w:r>
+          </w:p>
+        </w:tc>
+        <w:tc>
+          <w:tcPr>
+            <w:tcW w:type="dxa" w:w="1450"/>
+            <w:tcBorders>
+              <w:top w:val="single" w:color="C9DCDF" w:sz="4"/>
+              <w:left w:val="single" w:color="C9DCDF" w:sz="4"/>
+              <w:bottom w:val="single" w:color="C9DCDF" w:sz="4"/>
+              <w:right w:val="single" w:color="C9DCDF" w:sz="4"/>
+            </w:tcBorders>
+            <w:tcMar>
+              <w:top w:type="dxa" w:w="40"/>
+              <w:left w:type="dxa" w:w="100"/>
+              <w:bottom w:type="dxa" w:w="40"/>
+              <w:right w:type="dxa" w:w="100"/>
+            </w:tcMar>
+          </w:tcPr>
+          <w:p>
+            <w:pPr>
+              <w:jc w:val="center"/>
+            </w:pPr>
+            <w:r>
+              <w:rPr>
+                <w:b w:val="false"/>
+                <w:bCs w:val="false"/>
+                <w:sz w:val="20"/>
+                <w:szCs w:val="20"/>
+              </w:rPr>
+              <w:t xml:space="preserve">1 dk</w:t>
+            </w:r>
+          </w:p>
+        </w:tc>
+        <w:tc>
+          <w:tcPr>
+            <w:tcW w:type="dxa" w:w="1450"/>
+            <w:tcBorders>
+              <w:top w:val="single" w:color="C9DCDF" w:sz="4"/>
+              <w:left w:val="single" w:color="C9DCDF" w:sz="4"/>
+              <w:bottom w:val="single" w:color="C9DCDF" w:sz="4"/>
+              <w:right w:val="single" w:color="C9DCDF" w:sz="4"/>
+            </w:tcBorders>
+            <w:tcMar>
+              <w:top w:type="dxa" w:w="40"/>
+              <w:left w:type="dxa" w:w="100"/>
+              <w:bottom w:type="dxa" w:w="40"/>
+              <w:right w:type="dxa" w:w="100"/>
+            </w:tcMar>
+          </w:tcPr>
+          <w:p>
+            <w:pPr>
+              <w:jc w:val="center"/>
+            </w:pPr>
+            <w:r>
+              <w:rPr>
+                <w:b w:val="false"/>
+                <w:bCs w:val="false"/>
+                <w:sz w:val="20"/>
+                <w:szCs w:val="20"/>
+              </w:rPr>
+              <w:t xml:space="preserve">16 dk 30 sn</w:t>
             </w:r>
           </w:p>
         </w:tc>
@@ -2629,7 +2615,7 @@
                 <w:sz w:val="20"/>
                 <w:szCs w:val="20"/>
               </w:rPr>
-              <w:t xml:space="preserve">Odds oranı, risk oranı değildir</w:t>
+              <w:t xml:space="preserve">Tablo 5: Tedaviye göre bırakma</w:t>
             </w:r>
           </w:p>
         </w:tc>
@@ -2691,7 +2677,7 @@
                 <w:sz w:val="20"/>
                 <w:szCs w:val="20"/>
               </w:rPr>
-              <w:t xml:space="preserve">21 dk 30 sn</w:t>
+              <w:t xml:space="preserve">18 dk</w:t>
             </w:r>
           </w:p>
         </w:tc>
@@ -2755,7 +2741,7 @@
                 <w:sz w:val="20"/>
                 <w:szCs w:val="20"/>
               </w:rPr>
-              <w:t xml:space="preserve">Tartışma: literatürle uyum</w:t>
+              <w:t xml:space="preserve">Tablo 6: Lojistik regresyon</w:t>
             </w:r>
           </w:p>
         </w:tc>
@@ -2817,7 +2803,7 @@
                 <w:sz w:val="20"/>
                 <w:szCs w:val="20"/>
               </w:rPr>
-              <w:t xml:space="preserve">23 dk</w:t>
+              <w:t xml:space="preserve">19 dk 30 sn</w:t>
             </w:r>
           </w:p>
         </w:tc>
@@ -2881,69 +2867,69 @@
                 <w:sz w:val="20"/>
                 <w:szCs w:val="20"/>
               </w:rPr>
-              <w:t xml:space="preserve">Kısıtlılıklar</w:t>
-            </w:r>
-          </w:p>
-        </w:tc>
-        <w:tc>
-          <w:tcPr>
-            <w:tcW w:type="dxa" w:w="1450"/>
-            <w:tcBorders>
-              <w:top w:val="single" w:color="C9DCDF" w:sz="4"/>
-              <w:left w:val="single" w:color="C9DCDF" w:sz="4"/>
-              <w:bottom w:val="single" w:color="C9DCDF" w:sz="4"/>
-              <w:right w:val="single" w:color="C9DCDF" w:sz="4"/>
-            </w:tcBorders>
-            <w:tcMar>
-              <w:top w:type="dxa" w:w="40"/>
-              <w:left w:type="dxa" w:w="100"/>
-              <w:bottom w:type="dxa" w:w="40"/>
-              <w:right w:type="dxa" w:w="100"/>
-            </w:tcMar>
-          </w:tcPr>
-          <w:p>
-            <w:pPr>
-              <w:jc w:val="center"/>
-            </w:pPr>
-            <w:r>
-              <w:rPr>
-                <w:b w:val="false"/>
-                <w:bCs w:val="false"/>
-                <w:sz w:val="20"/>
-                <w:szCs w:val="20"/>
-              </w:rPr>
-              <w:t xml:space="preserve">1 dk</w:t>
-            </w:r>
-          </w:p>
-        </w:tc>
-        <w:tc>
-          <w:tcPr>
-            <w:tcW w:type="dxa" w:w="1450"/>
-            <w:tcBorders>
-              <w:top w:val="single" w:color="C9DCDF" w:sz="4"/>
-              <w:left w:val="single" w:color="C9DCDF" w:sz="4"/>
-              <w:bottom w:val="single" w:color="C9DCDF" w:sz="4"/>
-              <w:right w:val="single" w:color="C9DCDF" w:sz="4"/>
-            </w:tcBorders>
-            <w:tcMar>
-              <w:top w:type="dxa" w:w="40"/>
-              <w:left w:type="dxa" w:w="100"/>
-              <w:bottom w:type="dxa" w:w="40"/>
-              <w:right w:type="dxa" w:w="100"/>
-            </w:tcMar>
-          </w:tcPr>
-          <w:p>
-            <w:pPr>
-              <w:jc w:val="center"/>
-            </w:pPr>
-            <w:r>
-              <w:rPr>
-                <w:b w:val="false"/>
-                <w:bCs w:val="false"/>
-                <w:sz w:val="20"/>
-                <w:szCs w:val="20"/>
-              </w:rPr>
-              <w:t xml:space="preserve">24 dk</w:t>
+              <w:t xml:space="preserve">Tartışma: tedaviler</w:t>
+            </w:r>
+          </w:p>
+        </w:tc>
+        <w:tc>
+          <w:tcPr>
+            <w:tcW w:type="dxa" w:w="1450"/>
+            <w:tcBorders>
+              <w:top w:val="single" w:color="C9DCDF" w:sz="4"/>
+              <w:left w:val="single" w:color="C9DCDF" w:sz="4"/>
+              <w:bottom w:val="single" w:color="C9DCDF" w:sz="4"/>
+              <w:right w:val="single" w:color="C9DCDF" w:sz="4"/>
+            </w:tcBorders>
+            <w:tcMar>
+              <w:top w:type="dxa" w:w="40"/>
+              <w:left w:type="dxa" w:w="100"/>
+              <w:bottom w:type="dxa" w:w="40"/>
+              <w:right w:type="dxa" w:w="100"/>
+            </w:tcMar>
+          </w:tcPr>
+          <w:p>
+            <w:pPr>
+              <w:jc w:val="center"/>
+            </w:pPr>
+            <w:r>
+              <w:rPr>
+                <w:b w:val="false"/>
+                <w:bCs w:val="false"/>
+                <w:sz w:val="20"/>
+                <w:szCs w:val="20"/>
+              </w:rPr>
+              <w:t xml:space="preserve">1 dk 30 sn</w:t>
+            </w:r>
+          </w:p>
+        </w:tc>
+        <w:tc>
+          <w:tcPr>
+            <w:tcW w:type="dxa" w:w="1450"/>
+            <w:tcBorders>
+              <w:top w:val="single" w:color="C9DCDF" w:sz="4"/>
+              <w:left w:val="single" w:color="C9DCDF" w:sz="4"/>
+              <w:bottom w:val="single" w:color="C9DCDF" w:sz="4"/>
+              <w:right w:val="single" w:color="C9DCDF" w:sz="4"/>
+            </w:tcBorders>
+            <w:tcMar>
+              <w:top w:type="dxa" w:w="40"/>
+              <w:left w:type="dxa" w:w="100"/>
+              <w:bottom w:type="dxa" w:w="40"/>
+              <w:right w:type="dxa" w:w="100"/>
+            </w:tcMar>
+          </w:tcPr>
+          <w:p>
+            <w:pPr>
+              <w:jc w:val="center"/>
+            </w:pPr>
+            <w:r>
+              <w:rPr>
+                <w:b w:val="false"/>
+                <w:bCs w:val="false"/>
+                <w:sz w:val="20"/>
+                <w:szCs w:val="20"/>
+              </w:rPr>
+              <w:t xml:space="preserve">21 dk</w:t>
             </w:r>
           </w:p>
         </w:tc>
@@ -3007,7 +2993,7 @@
                 <w:sz w:val="20"/>
                 <w:szCs w:val="20"/>
               </w:rPr>
-              <w:t xml:space="preserve">Eleştirel değerlendirme: yöntem</w:t>
+              <w:t xml:space="preserve">Tartışma: başarıyı etkileyen faktörler</w:t>
             </w:r>
           </w:p>
         </w:tc>
@@ -3069,7 +3055,7 @@
                 <w:sz w:val="20"/>
                 <w:szCs w:val="20"/>
               </w:rPr>
-              <w:t xml:space="preserve">25 dk 30 sn</w:t>
+              <w:t xml:space="preserve">22 dk 30 sn</w:t>
             </w:r>
           </w:p>
         </w:tc>
@@ -3133,69 +3119,69 @@
                 <w:sz w:val="20"/>
                 <w:szCs w:val="20"/>
               </w:rPr>
-              <w:t xml:space="preserve">Eleştirel değerlendirme: raporlama</w:t>
-            </w:r>
-          </w:p>
-        </w:tc>
-        <w:tc>
-          <w:tcPr>
-            <w:tcW w:type="dxa" w:w="1450"/>
-            <w:tcBorders>
-              <w:top w:val="single" w:color="C9DCDF" w:sz="4"/>
-              <w:left w:val="single" w:color="C9DCDF" w:sz="4"/>
-              <w:bottom w:val="single" w:color="C9DCDF" w:sz="4"/>
-              <w:right w:val="single" w:color="C9DCDF" w:sz="4"/>
-            </w:tcBorders>
-            <w:tcMar>
-              <w:top w:type="dxa" w:w="40"/>
-              <w:left w:type="dxa" w:w="100"/>
-              <w:bottom w:type="dxa" w:w="40"/>
-              <w:right w:type="dxa" w:w="100"/>
-            </w:tcMar>
-          </w:tcPr>
-          <w:p>
-            <w:pPr>
-              <w:jc w:val="center"/>
-            </w:pPr>
-            <w:r>
-              <w:rPr>
-                <w:b w:val="false"/>
-                <w:bCs w:val="false"/>
-                <w:sz w:val="20"/>
-                <w:szCs w:val="20"/>
-              </w:rPr>
-              <w:t xml:space="preserve">1 dk 30 sn</w:t>
-            </w:r>
-          </w:p>
-        </w:tc>
-        <w:tc>
-          <w:tcPr>
-            <w:tcW w:type="dxa" w:w="1450"/>
-            <w:tcBorders>
-              <w:top w:val="single" w:color="C9DCDF" w:sz="4"/>
-              <w:left w:val="single" w:color="C9DCDF" w:sz="4"/>
-              <w:bottom w:val="single" w:color="C9DCDF" w:sz="4"/>
-              <w:right w:val="single" w:color="C9DCDF" w:sz="4"/>
-            </w:tcBorders>
-            <w:tcMar>
-              <w:top w:type="dxa" w:w="40"/>
-              <w:left w:type="dxa" w:w="100"/>
-              <w:bottom w:type="dxa" w:w="40"/>
-              <w:right w:type="dxa" w:w="100"/>
-            </w:tcMar>
-          </w:tcPr>
-          <w:p>
-            <w:pPr>
-              <w:jc w:val="center"/>
-            </w:pPr>
-            <w:r>
-              <w:rPr>
-                <w:b w:val="false"/>
-                <w:bCs w:val="false"/>
-                <w:sz w:val="20"/>
-                <w:szCs w:val="20"/>
-              </w:rPr>
-              <w:t xml:space="preserve">27 dk</w:t>
+              <w:t xml:space="preserve">Kısıtlılıklar ve güçlü yönler</w:t>
+            </w:r>
+          </w:p>
+        </w:tc>
+        <w:tc>
+          <w:tcPr>
+            <w:tcW w:type="dxa" w:w="1450"/>
+            <w:tcBorders>
+              <w:top w:val="single" w:color="C9DCDF" w:sz="4"/>
+              <w:left w:val="single" w:color="C9DCDF" w:sz="4"/>
+              <w:bottom w:val="single" w:color="C9DCDF" w:sz="4"/>
+              <w:right w:val="single" w:color="C9DCDF" w:sz="4"/>
+            </w:tcBorders>
+            <w:tcMar>
+              <w:top w:type="dxa" w:w="40"/>
+              <w:left w:type="dxa" w:w="100"/>
+              <w:bottom w:type="dxa" w:w="40"/>
+              <w:right w:type="dxa" w:w="100"/>
+            </w:tcMar>
+          </w:tcPr>
+          <w:p>
+            <w:pPr>
+              <w:jc w:val="center"/>
+            </w:pPr>
+            <w:r>
+              <w:rPr>
+                <w:b w:val="false"/>
+                <w:bCs w:val="false"/>
+                <w:sz w:val="20"/>
+                <w:szCs w:val="20"/>
+              </w:rPr>
+              <w:t xml:space="preserve">1 dk</w:t>
+            </w:r>
+          </w:p>
+        </w:tc>
+        <w:tc>
+          <w:tcPr>
+            <w:tcW w:type="dxa" w:w="1450"/>
+            <w:tcBorders>
+              <w:top w:val="single" w:color="C9DCDF" w:sz="4"/>
+              <w:left w:val="single" w:color="C9DCDF" w:sz="4"/>
+              <w:bottom w:val="single" w:color="C9DCDF" w:sz="4"/>
+              <w:right w:val="single" w:color="C9DCDF" w:sz="4"/>
+            </w:tcBorders>
+            <w:tcMar>
+              <w:top w:type="dxa" w:w="40"/>
+              <w:left w:type="dxa" w:w="100"/>
+              <w:bottom w:type="dxa" w:w="40"/>
+              <w:right w:type="dxa" w:w="100"/>
+            </w:tcMar>
+          </w:tcPr>
+          <w:p>
+            <w:pPr>
+              <w:jc w:val="center"/>
+            </w:pPr>
+            <w:r>
+              <w:rPr>
+                <w:b w:val="false"/>
+                <w:bCs w:val="false"/>
+                <w:sz w:val="20"/>
+                <w:szCs w:val="20"/>
+              </w:rPr>
+              <w:t xml:space="preserve">23 dk 30 sn</w:t>
             </w:r>
           </w:p>
         </w:tc>
@@ -3259,7 +3245,7 @@
                 <w:sz w:val="20"/>
                 <w:szCs w:val="20"/>
               </w:rPr>
-              <w:t xml:space="preserve">Sonuç</w:t>
+              <w:t xml:space="preserve">Sonuç ve öneriler</w:t>
             </w:r>
           </w:p>
         </w:tc>
@@ -3321,7 +3307,7 @@
                 <w:sz w:val="20"/>
                 <w:szCs w:val="20"/>
               </w:rPr>
-              <w:t xml:space="preserve">27 dk 30 sn</w:t>
+              <w:t xml:space="preserve">24 dk</w:t>
             </w:r>
           </w:p>
         </w:tc>
@@ -3447,7 +3433,7 @@
                 <w:sz w:val="20"/>
                 <w:szCs w:val="20"/>
               </w:rPr>
-              <w:t xml:space="preserve">30 dk 30 sn</w:t>
+              <w:t xml:space="preserve">27 dk</w:t>
             </w:r>
           </w:p>
         </w:tc>
@@ -3573,7 +3559,7 @@
                 <w:sz w:val="20"/>
                 <w:szCs w:val="20"/>
               </w:rPr>
-              <w:t xml:space="preserve">31 dk 30 sn</w:t>
+              <w:t xml:space="preserve">28 dk</w:t>
             </w:r>
           </w:p>
         </w:tc>
@@ -3699,7 +3685,7 @@
                 <w:sz w:val="20"/>
                 <w:szCs w:val="20"/>
               </w:rPr>
-              <w:t xml:space="preserve">31 dk 45 sn</w:t>
+              <w:t xml:space="preserve">28 dk 15 sn</w:t>
             </w:r>
           </w:p>
         </w:tc>
@@ -3825,7 +3811,7 @@
                 <w:sz w:val="20"/>
                 <w:szCs w:val="20"/>
               </w:rPr>
-              <w:t xml:space="preserve">32 dk</w:t>
+              <w:t xml:space="preserve">28 dk 30 sn</w:t>
             </w:r>
           </w:p>
         </w:tc>
@@ -3869,7 +3855,7 @@
         <w:jc w:val="both"/>
       </w:pPr>
       <w:r>
-        <w:t xml:space="preserve">Bugün sizlere, Turkish Journal of Family Practice dergisinin 2026 yılı 30. cilt 2. sayısında yayımlanan, Cenberlitaş, Gökçe ve Öztürk'ün “Bir üniversite hastanesine bağlı sigara bırakma polikliniğine başvuran hastaların demografik ve klinik özellikleri ile sigara bırakma durumlarını etkileyen faktörler” başlıklı özgün araştırma makalesini sunacağım.</w:t>
+        <w:t xml:space="preserve">Bugün sizlere Turkish Journal of Family Practice dergisinin 2026 yılı 30. cilt 2. sayısında yayımlanan, Cenberlitaş, Gökçe ve Öztürk'ün “Bir üniversite hastanesine bağlı sigara bırakma polikliniğine başvuran hastaların demografik ve klinik özellikleri ile sigara bırakma durumlarını etkileyen faktörler” başlıklı özgün araştırma makalesini sunacağım.</w:t>
       </w:r>
     </w:p>
     <w:p>
@@ -3887,34 +3873,25 @@
         <w:spacing w:after="140" w:before="280"/>
       </w:pPr>
       <w:r>
-        <w:t xml:space="preserve">Slayt 2: İçerik  (≈ 1 dk)</w:t>
-      </w:r>
-    </w:p>
-    <w:p>
-      <w:pPr>
-        <w:spacing w:after="140" w:line="300"/>
-        <w:jc w:val="both"/>
-      </w:pPr>
-      <w:r>
-        <w:t xml:space="preserve">Sunum 28 slayttan oluşmakta ve yaklaşık yarım saat sürecektir. Sonunda 10 dakikalık bir tartışma bölümü planladım.</w:t>
-      </w:r>
-    </w:p>
-    <w:p>
-      <w:pPr>
-        <w:spacing w:after="140" w:line="300"/>
-        <w:jc w:val="both"/>
-      </w:pPr>
-      <w:r>
-        <w:t xml:space="preserve">Önce makalenin künyesini ve giriş bölümünü, ardından gereç ve yöntemi aktaracağım. Bulgular bölümünde makaledeki altı tablonun öne çıkan sonuçlarını grafiklerle göstereceğim.</w:t>
-      </w:r>
-    </w:p>
-    <w:p>
-      <w:pPr>
-        <w:spacing w:after="140" w:line="300"/>
-        <w:jc w:val="both"/>
-      </w:pPr>
-      <w:r>
-        <w:t xml:space="preserve">Tartışma ve kısıtlılıklardan sonra makaleyi eleştirel gözle değerlendireceğim. Son olarak kısa bir olgu üzerinden sizlerin görüşlerini almak istiyorum.</w:t>
+        <w:t xml:space="preserve">Slayt 2: İçerik  (≈ 30 sn)</w:t>
+      </w:r>
+    </w:p>
+    <w:p>
+      <w:pPr>
+        <w:spacing w:after="140" w:line="300"/>
+        <w:jc w:val="both"/>
+      </w:pPr>
+      <w:r>
+        <w:t xml:space="preserve">Sunum 28 slayttan oluşmakta ve yaklaşık yarım saat sürecektir. Sonunda kısa bir tartışma bölümü planladım.</w:t>
+      </w:r>
+    </w:p>
+    <w:p>
+      <w:pPr>
+        <w:spacing w:after="140" w:line="300"/>
+        <w:jc w:val="both"/>
+      </w:pPr>
+      <w:r>
+        <w:t xml:space="preserve">Makalenin künyesi ve giriş bölümüyle başlayıp gereç ve yöntemi aktaracağım. Bulgular bölümünde makaledeki altı tabloyu özgün halleriyle göstereceğim. Ardından yazarların tartışma ve sonuçlarını aktaracak, kısa bir olgu üzerinden görüşlerinizi alacağım.</w:t>
       </w:r>
     </w:p>
     <w:p>
@@ -3923,34 +3900,16 @@
         <w:spacing w:after="140" w:before="280"/>
       </w:pPr>
       <w:r>
-        <w:t xml:space="preserve">Slayt 3: Hedefler  (≈ 1 dk)</w:t>
-      </w:r>
-    </w:p>
-    <w:p>
-      <w:pPr>
-        <w:spacing w:after="140" w:line="300"/>
-        <w:jc w:val="both"/>
-      </w:pPr>
-      <w:r>
-        <w:t xml:space="preserve">Bu sunumun sonunda üç şeyi hedefliyorum.</w:t>
-      </w:r>
-    </w:p>
-    <w:p>
-      <w:pPr>
-        <w:spacing w:after="140" w:line="300"/>
-        <w:jc w:val="both"/>
-      </w:pPr>
-      <w:r>
-        <w:t xml:space="preserve">Birincisi, sigara bırakma tedavilerinin gerçek yaşam koşullarındaki etkinliğini karşılaştırmak. İkincisi, bırakma başarısını etkileyen hasta ve çevre faktörlerini tanımak.</w:t>
-      </w:r>
-    </w:p>
-    <w:p>
-      <w:pPr>
-        <w:spacing w:after="140" w:line="300"/>
-        <w:jc w:val="both"/>
-      </w:pPr>
-      <w:r>
-        <w:t xml:space="preserve">Üçüncüsü ve belki en önemlisi, makaleyi yalnızca özetlemek değil, yöntem ve raporlama açısından eleştirel bir gözle değerlendirmek.</w:t>
+        <w:t xml:space="preserve">Slayt 3: Hedefler  (≈ 30 sn)</w:t>
+      </w:r>
+    </w:p>
+    <w:p>
+      <w:pPr>
+        <w:spacing w:after="140" w:line="300"/>
+        <w:jc w:val="both"/>
+      </w:pPr>
+      <w:r>
+        <w:t xml:space="preserve">Bu sunumun sonunda sigara bırakma tedavilerinin etkinliğini makalenin bulgularıyla karşılaştırmayı, bırakma başarısını etkileyen faktörleri tanımayı ve bu bulguları bir olgu üzerinden klinik pratiğimize aktarmayı hedefliyorum.</w:t>
       </w:r>
     </w:p>
     <w:p>
@@ -3968,25 +3927,16 @@
         <w:jc w:val="both"/>
       </w:pPr>
       <w:r>
-        <w:t xml:space="preserve">Solda makalenin ilk sayfasını görüyorsunuz. Makale, Türkiye Aile Hekimleri Uzmanlık Derneği'nin yayın organı olan Turkish Journal of Family Practice'te 2026 yılında yayımlanmıştır. Açık erişimli olup CC BY lisansı ile yayımlanmıştır.</w:t>
-      </w:r>
-    </w:p>
-    <w:p>
-      <w:pPr>
-        <w:spacing w:after="140" w:line="300"/>
-        <w:jc w:val="both"/>
-      </w:pPr>
-      <w:r>
-        <w:t xml:space="preserve">Çalışma retrospektif, kesitsel bir araştırma olarak tanımlanmıştır. Veriler Samsun Eğitim ve Araştırma Hastanesi Sigara Bırakma Polikliniği'nden elde edilmiştir.</w:t>
-      </w:r>
-    </w:p>
-    <w:p>
-      <w:pPr>
-        <w:spacing w:after="140" w:line="300"/>
-        <w:jc w:val="both"/>
-      </w:pPr>
-      <w:r>
-        <w:t xml:space="preserve">Bir bilgi notu olarak: Dergi PubMed'de dizinlenmemektedir. Makaleye DOI numarası üzerinden ulaşılabilmektedir.</w:t>
+        <w:t xml:space="preserve">Solda makalenin ilk sayfasını görüyorsunuz. Makale Türkiye Aile Hekimleri Uzmanlık Derneği'nin yayın organı olan Turkish Journal of Family Practice'te 2026 yılında yayımlanmıştır. Açık erişimlidir ve CC BY lisansıyla yayımlanmıştır.</w:t>
+      </w:r>
+    </w:p>
+    <w:p>
+      <w:pPr>
+        <w:spacing w:after="140" w:line="300"/>
+        <w:jc w:val="both"/>
+      </w:pPr>
+      <w:r>
+        <w:t xml:space="preserve">Çalışma retrospektif, kesitsel bir araştırmadır. Veriler Samsun Eğitim ve Araştırma Hastanesi Sigara Bırakma Polikliniği'nden elde edilmiştir.</w:t>
       </w:r>
     </w:p>
     <w:p>
@@ -4004,25 +3954,16 @@
         <w:jc w:val="both"/>
       </w:pPr>
       <w:r>
-        <w:t xml:space="preserve">Giriş bölümünde yazarlar sorunun büyüklüğünü vurgulamaktadır. Küresel Yetişkin Tütün Araştırması 2016 verilerine göre Türkiye'de sigara içme prevalansı erkeklerde yüzde 44,1, kadınlarda yüzde 19,2'dir.</w:t>
-      </w:r>
-    </w:p>
-    <w:p>
-      <w:pPr>
-        <w:spacing w:after="140" w:line="300"/>
-        <w:jc w:val="both"/>
-      </w:pPr>
-      <w:r>
-        <w:t xml:space="preserve">Ülkemizde 500'ün üzerinde sigara bırakma polikliniği bulunmakta ve bu polikliniklere 2,5 milyondan fazla kişi başvurmuştur.</w:t>
-      </w:r>
-    </w:p>
-    <w:p>
-      <w:pPr>
-        <w:spacing w:after="140" w:line="300"/>
-        <w:jc w:val="both"/>
-      </w:pPr>
-      <w:r>
-        <w:t xml:space="preserve">Polikliniklerde bildirilen bırakma oranları ise yüzde 20 ile 50 arasında değişmektedir. Bu geniş aralık, hangi faktörlerin başarıyı belirlediği sorusunu gündeme getirmektedir.</w:t>
+        <w:t xml:space="preserve">Yazarlar giriş bölümünde tütün bağımlılığının önlenebilir ölüm nedenlerinin başında geldiğini vurgulamaktadır. Küresel Yetişkin Tütün Araştırması 2016 verilerine göre Türkiye'de sigara içme sıklığı erkeklerde yüzde 44,1, kadınlarda yüzde 19,2'dir.</w:t>
+      </w:r>
+    </w:p>
+    <w:p>
+      <w:pPr>
+        <w:spacing w:after="140" w:line="300"/>
+        <w:jc w:val="both"/>
+      </w:pPr>
+      <w:r>
+        <w:t xml:space="preserve">Ülkemizde 500'ün üzerinde sigara bırakma polikliniği bulunmakta, bu polikliniklere 2,5 milyondan fazla kişi başvurmuş bulunmaktadır. Polikliniklerde bırakma oranları yüzde 20 ile 50 arasında değişmektedir.</w:t>
       </w:r>
     </w:p>
     <w:p>
@@ -4040,25 +3981,16 @@
         <w:jc w:val="both"/>
       </w:pPr>
       <w:r>
-        <w:t xml:space="preserve">Sigara bırakma tedavisi iki ayak üzerinde durmaktadır. Davranışsal tarafta motivasyonel görüşme ve davranış değişikliği modelleri yer almaktadır; bunlardan en sık kullanılanı Transteorik Model'dir.</w:t>
-      </w:r>
-    </w:p>
-    <w:p>
-      <w:pPr>
-        <w:spacing w:after="140" w:line="300"/>
-        <w:jc w:val="both"/>
-      </w:pPr>
-      <w:r>
-        <w:t xml:space="preserve">Farmakolojik tarafta nikotin replasman tedavisi, bupropion ve vareniklin klasik seçeneklerdir. Sitizin ise ülkemizde son yıllarda kullanıma giren, vareniklinle benzer mekanizmaya sahip bir parsiyel agonisttir.</w:t>
-      </w:r>
-    </w:p>
-    <w:p>
-      <w:pPr>
-        <w:spacing w:after="140" w:line="300"/>
-        <w:jc w:val="both"/>
-      </w:pPr>
-      <w:r>
-        <w:t xml:space="preserve">Kılavuzlar farmakoterapinin davranışsal destekle birlikte verilmesini ve gerektiğinde kombinasyonların kullanılmasını önermektedir.</w:t>
+        <w:t xml:space="preserve">Sigara bırakma tedavisi davranışsal yaklaşımlar ve farmakoterapiden oluşmaktadır. Davranışsal tarafta motivasyonel görüşme ve Transteorik Model gibi davranış değişikliği modelleri kullanılmaktadır.</w:t>
+      </w:r>
+    </w:p>
+    <w:p>
+      <w:pPr>
+        <w:spacing w:after="140" w:line="300"/>
+        <w:jc w:val="both"/>
+      </w:pPr>
+      <w:r>
+        <w:t xml:space="preserve">Farmakoterapi nikotin replasman tedavisi, bupropion ve vareniklinden oluşmaktadır. Sitizin son yıllarda ek bir seçenek olarak kullanıma girmiştir. Farmakoterapinin davranışsal destekle birlikte verilmesi ve gerektiğinde kombinasyonların düşünülmesi önerilmektedir.</w:t>
       </w:r>
     </w:p>
     <w:p>
@@ -4081,47 +4013,29 @@
     </w:p>
     <w:p>
       <w:pPr>
-        <w:spacing w:after="140" w:line="300"/>
-        <w:jc w:val="both"/>
-      </w:pPr>
-      <w:r>
-        <w:t xml:space="preserve">Bu amacın ileride bulgular bölümünde nasıl karşılandığına dikkatinizi çekmek istiyorum.</w:t>
-      </w:r>
-    </w:p>
-    <w:p>
-      <w:pPr>
         <w:pStyle w:val="Heading2"/>
         <w:spacing w:after="140" w:before="280"/>
       </w:pPr>
       <w:r>
-        <w:t xml:space="preserve">Slayt 8: Tasarım ve örneklem  (≈ 1 dk 30 sn)</w:t>
-      </w:r>
-    </w:p>
-    <w:p>
-      <w:pPr>
-        <w:spacing w:after="140" w:line="300"/>
-        <w:jc w:val="both"/>
-      </w:pPr>
-      <w:r>
-        <w:t xml:space="preserve">Çalışma 1 Ağustos 2020 ile 31 Ağustos 2024 arasındaki dört yıllık dönemi kapsamaktadır. Polikliniğe başvuran, 18 yaş ve üzeri, sigara içen 432 hastanın dosyası taranmıştır.</w:t>
-      </w:r>
-    </w:p>
-    <w:p>
-      <w:pPr>
-        <w:spacing w:after="140" w:line="300"/>
-        <w:jc w:val="both"/>
-      </w:pPr>
-      <w:r>
-        <w:t xml:space="preserve">Bunlardan 33 dosyada veriler eksik olduğu için 399 hasta analize alınmıştır. Tüm kayıtlar kullanıldığından örneklem büyüklüğü hesaplanmamıştır.</w:t>
-      </w:r>
-    </w:p>
-    <w:p>
-      <w:pPr>
-        <w:spacing w:after="140" w:line="300"/>
-        <w:jc w:val="both"/>
-      </w:pPr>
-      <w:r>
-        <w:t xml:space="preserve">Yıllık kontrolünü kaçıran hastaların takip bilgileri asistan hekimler tarafından uzaktan görüşmeyle tamamlanmıştır. Bu noktaya kısıtlılıklarda tekrar değineceğim.</w:t>
+        <w:t xml:space="preserve">Slayt 8: Tasarım ve örneklem  (≈ 1 dk)</w:t>
+      </w:r>
+    </w:p>
+    <w:p>
+      <w:pPr>
+        <w:spacing w:after="140" w:line="300"/>
+        <w:jc w:val="both"/>
+      </w:pPr>
+      <w:r>
+        <w:t xml:space="preserve">Çalışma 1 Ağustos 2020 ile 31 Ağustos 2024 arasını kapsamaktadır. Polikliniğe başvuran, 18 yaş ve üzeri, sigara içen 432 hastanın dosyası taranmıştır.</w:t>
+      </w:r>
+    </w:p>
+    <w:p>
+      <w:pPr>
+        <w:spacing w:after="140" w:line="300"/>
+        <w:jc w:val="both"/>
+      </w:pPr>
+      <w:r>
+        <w:t xml:space="preserve">Verilerine eksiksiz ulaşılan 399 hasta analize alınmıştır. Tüm kayıtlar kullanıldığından örneklem büyüklüğü hesaplanmamıştır. Yıllık kontrolüne gelmeyen hastaların takip bilgileri asistan hekimlerin yaptığı uzaktan görüşmelerle tamamlanmıştır.</w:t>
       </w:r>
     </w:p>
     <w:p>
@@ -4148,16 +4062,7 @@
         <w:jc w:val="both"/>
       </w:pPr>
       <w:r>
-        <w:t xml:space="preserve">Nikotin bağımlılığı ilk vizitte Fagerström Nikotin Bağımlılık Testi ile ölçülmüştür. Altı sorudan oluşan test 0 ile 10 arasında puanlanmakta; 0–2 düşük, 3–7 orta, 8–10 yüksek bağımlılık olarak sınıflanmaktadır.</w:t>
-      </w:r>
-    </w:p>
-    <w:p>
-      <w:pPr>
-        <w:spacing w:after="140" w:line="300"/>
-        <w:jc w:val="both"/>
-      </w:pPr>
-      <w:r>
-        <w:t xml:space="preserve">Testin Türkçe geçerlik çalışmasında Cronbach alfa değeri 0,56 bulunmuştur. Bu değer iç tutarlılığın sınırlı olduğunu göstermektedir; ancak özgün İngilizce sürümde de 0,61 civarındadır ve testin az sayıda, farklı yönleri ölçen sorudan oluşmasıyla ilişkilidir.</w:t>
+        <w:t xml:space="preserve">Nikotin bağımlılığı ilk vizitte Fagerström Nikotin Bağımlılık Testi ile değerlendirilmiştir. 0–2 puan düşük, 3–7 puan orta, 8–10 puan yüksek bağımlılık olarak sınıflanmıştır. Testin Türkçe geçerlik ve güvenilirlik çalışması 2004 yılında Uysal ve arkadaşları tarafından yapılmıştır.</w:t>
       </w:r>
     </w:p>
     <w:p>
@@ -4175,25 +4080,16 @@
         <w:jc w:val="both"/>
       </w:pPr>
       <w:r>
-        <w:t xml:space="preserve">Tedavi; FNBT puanı, kronik hastalıklar, kullanılan ilaçlar, kontrendikasyonlar ve hasta uyumuna göre bireyselleştirilmiştir.</w:t>
-      </w:r>
-    </w:p>
-    <w:p>
-      <w:pPr>
-        <w:spacing w:after="140" w:line="300"/>
-        <w:jc w:val="both"/>
-      </w:pPr>
-      <w:r>
-        <w:t xml:space="preserve">Hastalar üç gruba ayrılmıştır: yalnızca davranışsal tedavi, monoterapi ve kombine tedavi. Kombine tedavi seçenekleri bupropion ile NRT, vareniklin ile NRT, sitizin ile NRT ve üçlü tedavidir.</w:t>
-      </w:r>
-    </w:p>
-    <w:p>
-      <w:pPr>
-        <w:spacing w:after="140" w:line="300"/>
-        <w:jc w:val="both"/>
-      </w:pPr>
-      <w:r>
-        <w:t xml:space="preserve">Önemli bir ayrıntı: Sağlık Bakanlığı politikaları doğrultusunda NRT ve sitizin belirli dönemlerde ücretsiz verilmiştir. Bu durum tedavi seçimini ve uyumu etkilemiş olabilir.</w:t>
+        <w:t xml:space="preserve">Tedavi FNBT puanı, kronik hastalıklar, kullanılan ilaçlar, kontrendikasyonlar ve hasta uyumuna göre bireyselleştirilmiştir.</w:t>
+      </w:r>
+    </w:p>
+    <w:p>
+      <w:pPr>
+        <w:spacing w:after="140" w:line="300"/>
+        <w:jc w:val="both"/>
+      </w:pPr>
+      <w:r>
+        <w:t xml:space="preserve">Hastalara yalnızca davranışsal tedavi, monoterapi ya da kombine tedavi uygulanmıştır. Kombine tedavi seçenekleri bupropion ile NRT, vareniklin ile NRT, sitizin ile NRT ve üçlü tedavidir. Sağlık Bakanlığı politikaları doğrultusunda NRT ve sitizin belirli dönemlerde ücretsiz sağlanmıştır.</w:t>
       </w:r>
     </w:p>
     <w:p>
@@ -4202,34 +4098,34 @@
         <w:spacing w:after="140" w:before="280"/>
       </w:pPr>
       <w:r>
-        <w:t xml:space="preserve">Slayt 11: İstatistiksel analiz  (≈ 1 dk 30 sn)</w:t>
-      </w:r>
-    </w:p>
-    <w:p>
-      <w:pPr>
-        <w:spacing w:after="140" w:line="300"/>
-        <w:jc w:val="both"/>
-      </w:pPr>
-      <w:r>
-        <w:t xml:space="preserve">Analizler SPSS 25 ile yapılmıştır. Dağılımın normalliği histogram ve Kolmogorov–Smirnov testiyle değerlendirilmiş, veriler normal dağılmadığı için non-parametrik testler tercih edilmiştir.</w:t>
-      </w:r>
-    </w:p>
-    <w:p>
-      <w:pPr>
-        <w:spacing w:after="140" w:line="300"/>
-        <w:jc w:val="both"/>
-      </w:pPr>
-      <w:r>
-        <w:t xml:space="preserve">Kategorik değişkenler ki-kare testiyle, iki grup karşılaştırmaları Mann–Whitney U, ikiden fazla grup karşılaştırmaları Kruskal–Wallis testiyle yapılmıştır. Post-hoc karşılaştırmalar için Duncan testi bildirilmiştir.</w:t>
-      </w:r>
-    </w:p>
-    <w:p>
-      <w:pPr>
-        <w:spacing w:after="140" w:line="300"/>
-        <w:jc w:val="both"/>
-      </w:pPr>
-      <w:r>
-        <w:t xml:space="preserve">Bağımsız belirleyicileri bulmak için ikili lojistik regresyon kurulmuş ve çoklu karşılaştırma için Bonferroni düzeltmesi uygulanarak anlamlılık eşiği p&lt;0,003 olarak belirlenmiştir. Bu eşiği aklınızda tutmanızı rica ediyorum; regresyon sonuçlarında önemli olacak.</w:t>
+        <w:t xml:space="preserve">Slayt 11: İstatistiksel analiz  (≈ 1 dk)</w:t>
+      </w:r>
+    </w:p>
+    <w:p>
+      <w:pPr>
+        <w:spacing w:after="140" w:line="300"/>
+        <w:jc w:val="both"/>
+      </w:pPr>
+      <w:r>
+        <w:t xml:space="preserve">Analizler SPSS 25 ile yapılmıştır. Normallik histogram ve Kolmogorov–Smirnov testiyle değerlendirilmiştir.</w:t>
+      </w:r>
+    </w:p>
+    <w:p>
+      <w:pPr>
+        <w:spacing w:after="140" w:line="300"/>
+        <w:jc w:val="both"/>
+      </w:pPr>
+      <w:r>
+        <w:t xml:space="preserve">Kategorik değişkenler ki-kare testiyle, iki grup karşılaştırmaları Mann–Whitney U, ikiden fazla grup karşılaştırmaları Kruskal–Wallis testiyle yapılmıştır. Post-hoc karşılaştırmalarda Duncan testi kullanılmıştır.</w:t>
+      </w:r>
+    </w:p>
+    <w:p>
+      <w:pPr>
+        <w:spacing w:after="140" w:line="300"/>
+        <w:jc w:val="both"/>
+      </w:pPr>
+      <w:r>
+        <w:t xml:space="preserve">Tedavi yöntemlerinin bırakma üzerindeki etkisi ikili lojistik regresyonla değerlendirilmiş ve Bonferroni düzeltmesi uygulanmıştır.</w:t>
       </w:r>
     </w:p>
     <w:p>
@@ -4247,25 +4143,16 @@
         <w:jc w:val="both"/>
       </w:pPr>
       <w:r>
-        <w:t xml:space="preserve">Bulgulara geçiyorum. Analize alınan 399 hastanın yaş ortalaması 44,7 yıldır; standart sapma 12,1 olup hastaların yaklaşık üçte ikisi 33–57 yaş aralığındadır.</w:t>
-      </w:r>
-    </w:p>
-    <w:p>
-      <w:pPr>
-        <w:spacing w:after="140" w:line="300"/>
-        <w:jc w:val="both"/>
-      </w:pPr>
-      <w:r>
-        <w:t xml:space="preserve">Hastaların yüzde 63,7'si erkektir. Ortalama FNBT puanı 5,66 ile orta düzey bağımlılığa karşılık gelmektedir. Ortalama tüketim 27,4 paket-yıl, hasta başına ortalama görüşme sayısı 2,21'dir.</w:t>
-      </w:r>
-    </w:p>
-    <w:p>
-      <w:pPr>
-        <w:spacing w:after="140" w:line="300"/>
-        <w:jc w:val="both"/>
-      </w:pPr>
-      <w:r>
-        <w:t xml:space="preserve">Genel bırakma oranı yüzde 34,1'dir; yani her üç hastadan biri sigarayı bırakmıştır.</w:t>
+        <w:t xml:space="preserve">Bulgulara geçiyorum. Analize 399 hasta alınmıştır. Yaş ortalaması 44,7 yıldır ve hastaların yüzde 63,7'si erkektir.</w:t>
+      </w:r>
+    </w:p>
+    <w:p>
+      <w:pPr>
+        <w:spacing w:after="140" w:line="300"/>
+        <w:jc w:val="both"/>
+      </w:pPr>
+      <w:r>
+        <w:t xml:space="preserve">Ortalama FNBT puanı 5,66, ortalama tüketim 27,4 paket-yıl, hasta başına ortalama görüşme sayısı 2,21'dir. Hastaların yüzde 34,1'i, yani yaklaşık üçte biri sigarayı bırakmıştır.</w:t>
       </w:r>
     </w:p>
     <w:p>
@@ -4283,25 +4170,16 @@
         <w:jc w:val="both"/>
       </w:pPr>
       <w:r>
-        <w:t xml:space="preserve">Hastaların büyük çoğunluğu, yüzde 61'i, orta düzey bağımlılık grubundadır. Dörtte biri yüksek bağımlılık göstermektedir.</w:t>
-      </w:r>
-    </w:p>
-    <w:p>
-      <w:pPr>
-        <w:spacing w:after="140" w:line="300"/>
-        <w:jc w:val="both"/>
-      </w:pPr>
-      <w:r>
-        <w:t xml:space="preserve">Hastaların dörtte üçü daha önce bırakmayı denemiş, bunların yaklaşık yarısı profesyonel destek almıştır. Yüzde 7,2'si sigara dışında elektronik sigara, nargile veya puro gibi ürünler kullanmaktadır.</w:t>
-      </w:r>
-    </w:p>
-    <w:p>
-      <w:pPr>
-        <w:spacing w:after="140" w:line="300"/>
-        <w:jc w:val="both"/>
-      </w:pPr>
-      <w:r>
-        <w:t xml:space="preserve">Bir ayrıntıya dikkatinizi çekmek isterim: Bu yüzdeler makalede 399 değil 432 hasta üzerinden hesaplanmıştır. Örneğin 57, 265 ve 110 toplandığında 432 elde edilmektedir. Eleştirel değerlendirmede bu noktaya döneceğim.</w:t>
+        <w:t xml:space="preserve">FNBT puanlarına göre hastaların yüzde 13,2'si düşük, yüzde 61,3'ü orta, yüzde 25,5'i yüksek bağımlılık düzeyindedir.</w:t>
+      </w:r>
+    </w:p>
+    <w:p>
+      <w:pPr>
+        <w:spacing w:after="140" w:line="300"/>
+        <w:jc w:val="both"/>
+      </w:pPr>
+      <w:r>
+        <w:t xml:space="preserve">Hastaların yüzde 75,7'si daha önce sigarayı bırakmayı denemiş ve bunların yaklaşık yarısı bu denemede profesyonel destek almıştır. Yüzde 7,2'si sigara dışında elektronik sigara, nargile veya puro gibi tütün ürünleri kullanmaktadır.</w:t>
       </w:r>
     </w:p>
     <w:p>
@@ -4310,34 +4188,25 @@
         <w:spacing w:after="140" w:before="280"/>
       </w:pPr>
       <w:r>
-        <w:t xml:space="preserve">Slayt 14: Evde sigara içilmesi başarıyı azaltmaktadır  (≈ 1 dk)</w:t>
-      </w:r>
-    </w:p>
-    <w:p>
-      <w:pPr>
-        <w:spacing w:after="140" w:line="300"/>
-        <w:jc w:val="both"/>
-      </w:pPr>
-      <w:r>
-        <w:t xml:space="preserve">Tablo 2'de sosyodemografik özellikler ile bırakma durumu karşılaştırılmıştır. Anlamlı fark yalnızca bir değişkende bulunmuştur: hanede başka bir sigara içicisinin varlığı.</w:t>
-      </w:r>
-    </w:p>
-    <w:p>
-      <w:pPr>
-        <w:spacing w:after="140" w:line="300"/>
-        <w:jc w:val="both"/>
-      </w:pPr>
-      <w:r>
-        <w:t xml:space="preserve">Hanesinde sigara içen olmayanların yüzde 39,8'i, olanların ise yüzde 25,3'ü sigarayı bırakmıştır; p değeri 0,003'tür.</w:t>
-      </w:r>
-    </w:p>
-    <w:p>
-      <w:pPr>
-        <w:spacing w:after="140" w:line="300"/>
-        <w:jc w:val="both"/>
-      </w:pPr>
-      <w:r>
-        <w:t xml:space="preserve">Cinsiyet, yaş, medeni durum, eğitim, yerleşim yeri, çalışma durumu ve alkol kullanımı ile bırakma arasında anlamlı ilişki saptanmamıştır. Kırsalda yaşayanlarda oran yüzde 23 ile düşük görünse de bu grup yalnızca 56 kişidir ve fark anlamlı değildir.</w:t>
+        <w:t xml:space="preserve">Slayt 14: Tablo 1: Sosyodemografik özellikler  (≈ 1 dk)</w:t>
+      </w:r>
+    </w:p>
+    <w:p>
+      <w:pPr>
+        <w:spacing w:after="140" w:line="300"/>
+        <w:jc w:val="both"/>
+      </w:pPr>
+      <w:r>
+        <w:t xml:space="preserve">Tablo 1'de katılımcıların sosyodemografik özellikleri yer almaktadır. Hastaların çoğu 26–44 yaş grubundadır, yüzde 82'si evlidir ve yüzde 43'ü yükseköğretim mezunudur.</w:t>
+      </w:r>
+    </w:p>
+    <w:p>
+      <w:pPr>
+        <w:spacing w:after="140" w:line="300"/>
+        <w:jc w:val="both"/>
+      </w:pPr>
+      <w:r>
+        <w:t xml:space="preserve">Hastaların yüzde 86'sı il merkezinde yaşamaktadır. Yüzde 39,6'sının hanesinde sigara içen başka biri bulunmaktadır.</w:t>
       </w:r>
     </w:p>
     <w:p>
@@ -4346,34 +4215,25 @@
         <w:spacing w:after="140" w:before="280"/>
       </w:pPr>
       <w:r>
-        <w:t xml:space="preserve">Slayt 15: En sık kombine tedavi uygulanmıştır  (≈ 1 dk)</w:t>
-      </w:r>
-    </w:p>
-    <w:p>
-      <w:pPr>
-        <w:spacing w:after="140" w:line="300"/>
-        <w:jc w:val="both"/>
-      </w:pPr>
-      <w:r>
-        <w:t xml:space="preserve">Tablo 3'te tedavi dağılımı görülmektedir. En sık uygulanan yöntem 141 hasta ile kombine tedavidir; bunu 109 hasta ile bupropion monoterapisi ve 80 hasta ile NRT monoterapisi izlemektedir.</w:t>
-      </w:r>
-    </w:p>
-    <w:p>
-      <w:pPr>
-        <w:spacing w:after="140" w:line="300"/>
-        <w:jc w:val="both"/>
-      </w:pPr>
-      <w:r>
-        <w:t xml:space="preserve">Vareniklin yalnızca 18 hastada kullanılmıştır; bunun nedeni çalışma döneminde vareniklinin piyasadan çekilmesidir. Sitizin 34 hastada tek başına verilmiştir.</w:t>
-      </w:r>
-    </w:p>
-    <w:p>
-      <w:pPr>
-        <w:spacing w:after="140" w:line="300"/>
-        <w:jc w:val="both"/>
-      </w:pPr>
-      <w:r>
-        <w:t xml:space="preserve">Kombine tedavi alanların büyük çoğunluğu, 141 hastanın 125'i, bupropion ile NRT almıştır. Özette bu sayı 134 olarak geçmektedir; tablo ile özet arasında küçük bir tutarsızlık bulunmaktadır.</w:t>
+        <w:t xml:space="preserve">Slayt 15: Tablo 2: Sosyodemografik özellikler ve bırakma (1)  (≈ 1 dk)</w:t>
+      </w:r>
+    </w:p>
+    <w:p>
+      <w:pPr>
+        <w:spacing w:after="140" w:line="300"/>
+        <w:jc w:val="both"/>
+      </w:pPr>
+      <w:r>
+        <w:t xml:space="preserve">Tablo 2'de sosyodemografik özelliklere göre bırakma durumu karşılaştırılmıştır. Tablonun ilk bölümünde cinsiyet, yaş grubu, medeni durum ve eğitim durumu yer almaktadır.</w:t>
+      </w:r>
+    </w:p>
+    <w:p>
+      <w:pPr>
+        <w:spacing w:after="140" w:line="300"/>
+        <w:jc w:val="both"/>
+      </w:pPr>
+      <w:r>
+        <w:t xml:space="preserve">Bu değişkenlerin hiçbirinde başarılı ve başarısız gruplar arasında anlamlı fark bulunmamıştır.</w:t>
       </w:r>
     </w:p>
     <w:p>
@@ -4382,34 +4242,25 @@
         <w:spacing w:after="140" w:before="280"/>
       </w:pPr>
       <w:r>
-        <w:t xml:space="preserve">Slayt 16: En düşük başarı bupropion monoterapisinde  (≈ 1 dk 30 sn)</w:t>
-      </w:r>
-    </w:p>
-    <w:p>
-      <w:pPr>
-        <w:spacing w:after="140" w:line="300"/>
-        <w:jc w:val="both"/>
-      </w:pPr>
-      <w:r>
-        <w:t xml:space="preserve">Tablo 5 çalışmanın ana bulgusunu göstermektedir. Bupropion monoterapisi alanların yalnızca yüzde 16,5'i sigarayı bırakmıştır.</w:t>
-      </w:r>
-    </w:p>
-    <w:p>
-      <w:pPr>
-        <w:spacing w:after="140" w:line="300"/>
-        <w:jc w:val="both"/>
-      </w:pPr>
-      <w:r>
-        <w:t xml:space="preserve">Diğer tüm gruplarda bu oran yüzde 35 ile 44 arasındadır. En yüksek oranlar vareniklin ve kombine tedavi gruplarındadır; altı grup arasındaki fark anlamlıdır, p&lt;0,001.</w:t>
-      </w:r>
-    </w:p>
-    <w:p>
-      <w:pPr>
-        <w:spacing w:after="140" w:line="300"/>
-        <w:jc w:val="both"/>
-      </w:pPr>
-      <w:r>
-        <w:t xml:space="preserve">İlginç bir nokta, hiç ilaç almayan 17 hastada bile oranın yüzde 35 olmasıdır. Bu grup küçüktür ve büyük olasılıkla motivasyonu yüksek, bağımlılığı düşük hastalardan oluşmaktadır. Bu durum seçim yanlılığının bir göstergesi olabilir.</w:t>
+        <w:t xml:space="preserve">Slayt 16: Tablo 2: Sosyodemografik özellikler ve bırakma (2)  (≈ 1 dk)</w:t>
+      </w:r>
+    </w:p>
+    <w:p>
+      <w:pPr>
+        <w:spacing w:after="140" w:line="300"/>
+        <w:jc w:val="both"/>
+      </w:pPr>
+      <w:r>
+        <w:t xml:space="preserve">Tablonun ikinci bölümünde yerleşim yeri, çalışma durumu, hanede başka sigara içen varlığı ve alkol kullanımı yer almaktadır.</w:t>
+      </w:r>
+    </w:p>
+    <w:p>
+      <w:pPr>
+        <w:spacing w:after="140" w:line="300"/>
+        <w:jc w:val="both"/>
+      </w:pPr>
+      <w:r>
+        <w:t xml:space="preserve">Anlamlı fark yalnızca hanede başka sigara içen varlığında bulunmuştur. Hanesinde sigara içen olmayanların yüzde 39,8'i, olanların yüzde 25,3'ü sigarayı bırakmıştır; p değeri 0,003'tür.</w:t>
       </w:r>
     </w:p>
     <w:p>
@@ -4418,34 +4269,25 @@
         <w:spacing w:after="140" w:before="280"/>
       </w:pPr>
       <w:r>
-        <w:t xml:space="preserve">Slayt 17: Başarı görüşme sayısıyla artmaktadır  (≈ 1 dk)</w:t>
-      </w:r>
-    </w:p>
-    <w:p>
-      <w:pPr>
-        <w:spacing w:after="140" w:line="300"/>
-        <w:jc w:val="both"/>
-      </w:pPr>
-      <w:r>
-        <w:t xml:space="preserve">Tablo 4'te sürekli değişkenler karşılaştırılmıştır. Sigarayı bırakanlar ortalama 2,83 kez, bırakamayanlar 1,96 kez görüşmeye gelmiştir; fark yüksek düzeyde anlamlıdır.</w:t>
-      </w:r>
-    </w:p>
-    <w:p>
-      <w:pPr>
-        <w:spacing w:after="140" w:line="300"/>
-        <w:jc w:val="both"/>
-      </w:pPr>
-      <w:r>
-        <w:t xml:space="preserve">Bırakanların FNBT puanı da daha düşüktür: 5,26'ya karşı 5,85. Fark istatistiksel olarak anlamlı olmakla birlikte yarım puan civarındadır ve bireysel hasta düzeyinde klinik önemi sınırlıdır.</w:t>
-      </w:r>
-    </w:p>
-    <w:p>
-      <w:pPr>
-        <w:spacing w:after="140" w:line="300"/>
-        <w:jc w:val="both"/>
-      </w:pPr>
-      <w:r>
-        <w:t xml:space="preserve">Paket-yıl açısından iki grup arasında fark bulunmamıştır. Görüşme sayısı bulgusunun yönü konusunda dikkatli olmak gerekir: Sık gelen hasta mı bırakıyor, yoksa bırakmayı başaran hasta mı kontrollere gelmeye devam ediyor? Retrospektif tasarım bu soruyu yanıtlayamamaktadır.</w:t>
+        <w:t xml:space="preserve">Slayt 17: Tablo 3: Tedavi seçenekleri  (≈ 1 dk)</w:t>
+      </w:r>
+    </w:p>
+    <w:p>
+      <w:pPr>
+        <w:spacing w:after="140" w:line="300"/>
+        <w:jc w:val="both"/>
+      </w:pPr>
+      <w:r>
+        <w:t xml:space="preserve">Tablo 3'te uygulanan tedaviler görülmektedir. En sık uygulanan yöntem 141 hasta ile kombine tedavidir. Bunu 109 hasta ile bupropion ve 80 hasta ile NRT monoterapisi izlemektedir.</w:t>
+      </w:r>
+    </w:p>
+    <w:p>
+      <w:pPr>
+        <w:spacing w:after="140" w:line="300"/>
+        <w:jc w:val="both"/>
+      </w:pPr>
+      <w:r>
+        <w:t xml:space="preserve">Kombine tedavi alan hastaların 125'i bupropion ile NRT almıştır. Vareniklin 18, sitizin 34 hastada tek başına kullanılmış; 17 hastaya yalnızca farmakolojik olmayan tedavi uygulanmıştır.</w:t>
       </w:r>
     </w:p>
     <w:p>
@@ -4454,43 +4296,25 @@
         <w:spacing w:after="140" w:before="280"/>
       </w:pPr>
       <w:r>
-        <w:t xml:space="preserve">Slayt 18: Lojistik regresyon (Tablo 6)  (≈ 2 dk)</w:t>
-      </w:r>
-    </w:p>
-    <w:p>
-      <w:pPr>
-        <w:spacing w:after="140" w:line="300"/>
-        <w:jc w:val="both"/>
-      </w:pPr>
-      <w:r>
-        <w:t xml:space="preserve">Bu slaytta makalenin Tablo 6'sını özgün haliyle görüyorsunuz. Referans grup bupropion monoterapisidir; Exp(B) sütunu odds oranını vermektedir.</w:t>
-      </w:r>
-    </w:p>
-    <w:p>
-      <w:pPr>
-        <w:spacing w:after="140" w:line="300"/>
-        <w:jc w:val="both"/>
-      </w:pPr>
-      <w:r>
-        <w:t xml:space="preserve">Bupropiona göre bırakma odds'u vareniklinde 4,0, kombine tedavide 4,0, NRT'de 3,0, sitizinde 2,8 kat yüksektir. Hanede sigara içen olmaması odds'u yaklaşık 2 kat, sigaraya bağlı yakınma olmaması 1,6 kat artırmaktadır.</w:t>
-      </w:r>
-    </w:p>
-    <w:p>
-      <w:pPr>
-        <w:spacing w:after="140" w:line="300"/>
-        <w:jc w:val="both"/>
-      </w:pPr>
-      <w:r>
-        <w:t xml:space="preserve">Burada önemli bir nokta var: Yazarların kendi belirlediği Bonferroni eşiği p&lt;0,003'tür. Bu eşiğe göre yalnızca NRT ve kombine tedavi anlamlı kalmaktadır; hane faktörü tam sınırdadır. Vareniklin, sitizin ve yakınma satırları 0,05'in altında olsa da düzeltilmiş eşiği geçmemektedir.</w:t>
-      </w:r>
-    </w:p>
-    <w:p>
-      <w:pPr>
-        <w:spacing w:after="140" w:line="300"/>
-        <w:jc w:val="both"/>
-      </w:pPr>
-      <w:r>
-        <w:t xml:space="preserve">Ayrıca tabloda bazı değerlerin başındaki “0,” basımda düşmüştür; örneğin standart hata 540 yerine 0,540 olarak okunmalıdır. Wald değerleri bu okumayı doğrulamaktadır.</w:t>
+        <w:t xml:space="preserve">Slayt 18: Tablo 4: Görüşme sayısı, FNBT ve paket-yıl  (≈ 1 dk)</w:t>
+      </w:r>
+    </w:p>
+    <w:p>
+      <w:pPr>
+        <w:spacing w:after="140" w:line="300"/>
+        <w:jc w:val="both"/>
+      </w:pPr>
+      <w:r>
+        <w:t xml:space="preserve">Tablo 4'te sürekli değişkenler bırakma durumuna göre karşılaştırılmıştır. Sigarayı bırakanlar ortalama 2,83 kez, bırakamayanlar 1,96 kez görüşmeye gelmiştir; fark anlamlıdır, p&lt;0,001.</w:t>
+      </w:r>
+    </w:p>
+    <w:p>
+      <w:pPr>
+        <w:spacing w:after="140" w:line="300"/>
+        <w:jc w:val="both"/>
+      </w:pPr>
+      <w:r>
+        <w:t xml:space="preserve">Bırakanların FNBT puanı daha düşüktür: 5,26'ya karşı 5,85; p değeri 0,024'tür. Paket-yıl açısından iki grup arasında anlamlı fark bulunmamıştır.</w:t>
       </w:r>
     </w:p>
     <w:p>
@@ -4499,34 +4323,25 @@
         <w:spacing w:after="140" w:before="280"/>
       </w:pPr>
       <w:r>
-        <w:t xml:space="preserve">Slayt 19: Odds oranı, risk oranı değildir  (≈ 1 dk 30 sn)</w:t>
-      </w:r>
-    </w:p>
-    <w:p>
-      <w:pPr>
-        <w:spacing w:after="140" w:line="300"/>
-        <w:jc w:val="both"/>
-      </w:pPr>
-      <w:r>
-        <w:t xml:space="preserve">Asistan arkadaşlarım için kısa bir istatistik notu eklemek istedim. Makalede kombine tedavi için “bırakma olasılığı yaklaşık dört kat yüksek” denmektedir. Bu ifade odds oranına dayanmaktadır.</w:t>
-      </w:r>
-    </w:p>
-    <w:p>
-      <w:pPr>
-        <w:spacing w:after="140" w:line="300"/>
-        <w:jc w:val="both"/>
-      </w:pPr>
-      <w:r>
-        <w:t xml:space="preserve">Gerçek oranlara baktığımızda bupropion grubunda bırakma yüzde 16,5, kombine grupta yüzde 44'tür. Yani risk oranı yaklaşık 2,7'dir. Odds oranı ise 0,78'in 0,20'ye bölünmesiyle 3,97 çıkmaktadır.</w:t>
-      </w:r>
-    </w:p>
-    <w:p>
-      <w:pPr>
-        <w:spacing w:after="140" w:line="300"/>
-        <w:jc w:val="both"/>
-      </w:pPr>
-      <w:r>
-        <w:t xml:space="preserve">Sonuç sık görüldüğünde, bu çalışmada olduğu gibi yüzde 34 civarında, odds oranı etkiyi olduğundan büyük gösterir. Hastaya anlatırken “kombine tedavide başarı şansınız yaklaşık 2,5–3 kat artıyor” demek daha doğru olacaktır.</w:t>
+        <w:t xml:space="preserve">Slayt 19: Tablo 5: Tedaviye göre bırakma  (≈ 1 dk 30 sn)</w:t>
+      </w:r>
+    </w:p>
+    <w:p>
+      <w:pPr>
+        <w:spacing w:after="140" w:line="300"/>
+        <w:jc w:val="both"/>
+      </w:pPr>
+      <w:r>
+        <w:t xml:space="preserve">Tablo 5'te tedavi yöntemlerine göre bırakma oranları yer almaktadır. En yüksek oranlar vareniklin grubunda yüzde 44,5 ve kombine tedavi grubunda yüzde 44,0 olarak bulunmuştur.</w:t>
+      </w:r>
+    </w:p>
+    <w:p>
+      <w:pPr>
+        <w:spacing w:after="140" w:line="300"/>
+        <w:jc w:val="both"/>
+      </w:pPr>
+      <w:r>
+        <w:t xml:space="preserve">NRT grubunda oran yüzde 37,5, sitizin ve yalnızca davranışsal tedavi gruplarında yüzde 35,3'tür. En düşük oran yüzde 16,5 ile bupropion monoterapisindedir. Gruplar arasındaki fark anlamlıdır, p&lt;0,001.</w:t>
       </w:r>
     </w:p>
     <w:p>
@@ -4535,34 +4350,34 @@
         <w:spacing w:after="140" w:before="280"/>
       </w:pPr>
       <w:r>
-        <w:t xml:space="preserve">Slayt 20: Tartışma: literatürle uyum  (≈ 1 dk 30 sn)</w:t>
-      </w:r>
-    </w:p>
-    <w:p>
-      <w:pPr>
-        <w:spacing w:after="140" w:line="300"/>
-        <w:jc w:val="both"/>
-      </w:pPr>
-      <w:r>
-        <w:t xml:space="preserve">Yazarlar bulgularını literatürle karşılaştırmıştır. Vareniklinin bupropiona üstünlüğü Cochrane ağ meta-analizi ve EAGLES çalışmasıyla uyumludur.</w:t>
-      </w:r>
-    </w:p>
-    <w:p>
-      <w:pPr>
-        <w:spacing w:after="140" w:line="300"/>
-        <w:jc w:val="both"/>
-      </w:pPr>
-      <w:r>
-        <w:t xml:space="preserve">Sitizin plaseboya üstün, NRT ile benzer bulunmuştur; Avustralya'daki randomize çalışmada vareniklinle benzer etkinlik ve daha az yan etki bildirilmiştir.</w:t>
-      </w:r>
-    </w:p>
-    <w:p>
-      <w:pPr>
-        <w:spacing w:after="140" w:line="300"/>
-        <w:jc w:val="both"/>
-      </w:pPr>
-      <w:r>
-        <w:t xml:space="preserve">Kombine tedavinin üstünlüğü kılavuzların monoterapi başarısız olduğunda veya bağımlılık ağır olduğunda kombinasyon önerisiyle örtüşmektedir. Hane faktörü ise eş desteğine yönelik Cochrane derlemesindeki bulgularla uyumludur.</w:t>
+        <w:t xml:space="preserve">Slayt 20: Tablo 6: Lojistik regresyon  (≈ 1 dk 30 sn)</w:t>
+      </w:r>
+    </w:p>
+    <w:p>
+      <w:pPr>
+        <w:spacing w:after="140" w:line="300"/>
+        <w:jc w:val="both"/>
+      </w:pPr>
+      <w:r>
+        <w:t xml:space="preserve">Tablo 6'da lojistik regresyon sonuçları görülmektedir. Referans grup bupropion monoterapisidir ve Exp(B) sütunu odds oranını vermektedir.</w:t>
+      </w:r>
+    </w:p>
+    <w:p>
+      <w:pPr>
+        <w:spacing w:after="140" w:line="300"/>
+        <w:jc w:val="both"/>
+      </w:pPr>
+      <w:r>
+        <w:t xml:space="preserve">Bupropiona göre bırakma olasılığı vareniklinde 4,0, kombine tedavide 4,0, NRT'de 3,0, sitizinde 2,8 kat yüksektir. Farmakolojik tedavi almayanlarda görülen 2,8 katlık fark anlamlı değildir.</w:t>
+      </w:r>
+    </w:p>
+    <w:p>
+      <w:pPr>
+        <w:spacing w:after="140" w:line="300"/>
+        <w:jc w:val="both"/>
+      </w:pPr>
+      <w:r>
+        <w:t xml:space="preserve">Hanede sigara içen olmaması bırakma olasılığını yaklaşık iki katına, sigaraya bağlı yakınma olmaması 1,6 katına çıkarmaktadır. Yazarlar ayrıca FNBT puanının bırakma başarısının negatif bir öngörücüsü olduğunu bildirmektedir.</w:t>
       </w:r>
     </w:p>
     <w:p>
@@ -4571,34 +4386,34 @@
         <w:spacing w:after="140" w:before="280"/>
       </w:pPr>
       <w:r>
-        <w:t xml:space="preserve">Slayt 21: Kısıtlılıklar  (≈ 1 dk)</w:t>
-      </w:r>
-    </w:p>
-    <w:p>
-      <w:pPr>
-        <w:spacing w:after="140" w:line="300"/>
-        <w:jc w:val="both"/>
-      </w:pPr>
-      <w:r>
-        <w:t xml:space="preserve">Yazarlar üç kısıtlılık bildirmiştir. Birincisi, görüşmeleri yürüten asistanların rotasyonlar nedeniyle değişmesidir; bu durum takip sürekliliğini ve öz bildirimin doğruluğunu etkilemiş olabilir.</w:t>
-      </w:r>
-    </w:p>
-    <w:p>
-      <w:pPr>
-        <w:spacing w:after="140" w:line="300"/>
-        <w:jc w:val="both"/>
-      </w:pPr>
-      <w:r>
-        <w:t xml:space="preserve">İkincisi, eksik verilerin telefonla ve hasta beyanıyla tamamlanmasıdır. Üçüncüsü, vareniklinin piyasadan çekilmesi ve sitizinin kullanıma girmesinin ilaç seçimini değiştirmesidir.</w:t>
-      </w:r>
-    </w:p>
-    <w:p>
-      <w:pPr>
-        <w:spacing w:after="140" w:line="300"/>
-        <w:jc w:val="both"/>
-      </w:pPr>
-      <w:r>
-        <w:t xml:space="preserve">Yazarlar ayrıca ilaçların ücretsiz sağlanıp sağlanmadığının analiz edilmediğini ve bunun olası bir karıştırıcı faktör olduğunu belirtmektedir.</w:t>
+        <w:t xml:space="preserve">Slayt 21: Tartışma: tedaviler  (≈ 1 dk 30 sn)</w:t>
+      </w:r>
+    </w:p>
+    <w:p>
+      <w:pPr>
+        <w:spacing w:after="140" w:line="300"/>
+        <w:jc w:val="both"/>
+      </w:pPr>
+      <w:r>
+        <w:t xml:space="preserve">Yazarlar bulgularını literatürle karşılaştırmıştır. Vareniklinin bupropiona üstünlüğü büyük meta-analizler ve EAGLES çalışmasıyla uyumludur. Bu üstünlük, vareniklinin α4β2 nikotinik reseptördeki parsiyel agonist etkisiyle açıklanmaktadır.</w:t>
+      </w:r>
+    </w:p>
+    <w:p>
+      <w:pPr>
+        <w:spacing w:after="140" w:line="300"/>
+        <w:jc w:val="both"/>
+      </w:pPr>
+      <w:r>
+        <w:t xml:space="preserve">Sitizin vareniklinle benzer mekanizmaya sahip, maliyet-etkin bir seçenektir; plaseboya üstün ve NRT ile benzer etkinlikte bulunmuştur. Kombine tedavinin üstünlüğü, monoterapi yetersiz kaldığında kombinasyon öneren kılavuzlarla uyumludur.</w:t>
+      </w:r>
+    </w:p>
+    <w:p>
+      <w:pPr>
+        <w:spacing w:after="140" w:line="300"/>
+        <w:jc w:val="both"/>
+      </w:pPr>
+      <w:r>
+        <w:t xml:space="preserve">Benli ve arkadaşlarının çalışmasında da vareniklin ilk altı ayda bupropiondan daha yüksek bırakma oranı sağlamıştır.</w:t>
       </w:r>
     </w:p>
     <w:p>
@@ -4607,34 +4422,34 @@
         <w:spacing w:after="140" w:before="280"/>
       </w:pPr>
       <w:r>
-        <w:t xml:space="preserve">Slayt 22: Eleştirel değerlendirme: yöntem  (≈ 1 dk 30 sn)</w:t>
-      </w:r>
-    </w:p>
-    <w:p>
-      <w:pPr>
-        <w:spacing w:after="140" w:line="300"/>
-        <w:jc w:val="both"/>
-      </w:pPr>
-      <w:r>
-        <w:t xml:space="preserve">Makalenin güçlü yönleriyle başlamak istiyorum. Gerçek yaşam verisi sunmaktadır, beş farklı tedavi seçeneğini bir arada değerlendirmektedir ve yazarların ifadesiyle sitizin ile ilgili erişilebilir ilk tez verisidir. Ayrıca bir yıllık takip süresi uygundur.</w:t>
-      </w:r>
-    </w:p>
-    <w:p>
-      <w:pPr>
-        <w:spacing w:after="140" w:line="300"/>
-        <w:jc w:val="both"/>
-      </w:pPr>
-      <w:r>
-        <w:t xml:space="preserve">Geliştirilebilecek yönlere gelince, en önemlisi randomizasyon olmamasıdır. Tedaviyi hekim ve hasta birlikte seçmiştir; bu da endikasyona bağlı karıştırıcılık yaratır. Örneğin ilaçsız grubun başarısı bunu düşündürmektedir.</w:t>
-      </w:r>
-    </w:p>
-    <w:p>
-      <w:pPr>
-        <w:spacing w:after="140" w:line="300"/>
-        <w:jc w:val="both"/>
-      </w:pPr>
-      <w:r>
-        <w:t xml:space="preserve">Bırakma durumu karbonmonoksit ölçümü gibi biyokimyasal bir yöntemle doğrulanmamıştır. Son olarak çalışma kesitsel olarak tanımlanmış olsa da başvurudaki özellikler ve bir yıl sonraki sonuç kullanıldığı için metodolojik olarak retrospektif kohort tasarımına daha yakındır.</w:t>
+        <w:t xml:space="preserve">Slayt 22: Tartışma: başarıyı etkileyen faktörler  (≈ 1 dk 30 sn)</w:t>
+      </w:r>
+    </w:p>
+    <w:p>
+      <w:pPr>
+        <w:spacing w:after="140" w:line="300"/>
+        <w:jc w:val="both"/>
+      </w:pPr>
+      <w:r>
+        <w:t xml:space="preserve">Yazarlar davranışsal desteğin önemini vurgulamaktadır: Daha fazla görüşmeye gelen hastalarda bırakma oranı daha yüksektir.</w:t>
+      </w:r>
+    </w:p>
+    <w:p>
+      <w:pPr>
+        <w:spacing w:after="140" w:line="300"/>
+        <w:jc w:val="both"/>
+      </w:pPr>
+      <w:r>
+        <w:t xml:space="preserve">Hanede sigara içen olmaması bırakma olasılığını neredeyse iki katına çıkarmaktadır. Literatürde eşin veya aile bireylerinin sigara içmesi hem tetikleyici hem de motivasyon engeli olarak tanımlanmaktadır.</w:t>
+      </w:r>
+    </w:p>
+    <w:p>
+      <w:pPr>
+        <w:spacing w:after="140" w:line="300"/>
+        <w:jc w:val="both"/>
+      </w:pPr>
+      <w:r>
+        <w:t xml:space="preserve">Yüksek FNBT puanı düşük başarıyla ilişkilidir. Yakınması olmayan hastalarda başarının daha yüksek olması ise uzun vadeli sağlığı korumaya yönelik içsel motivasyonla açıklanmaktadır.</w:t>
       </w:r>
     </w:p>
     <w:p>
@@ -4643,43 +4458,25 @@
         <w:spacing w:after="140" w:before="280"/>
       </w:pPr>
       <w:r>
-        <w:t xml:space="preserve">Slayt 23: Eleştirel değerlendirme: raporlama  (≈ 1 dk 30 sn)</w:t>
-      </w:r>
-    </w:p>
-    <w:p>
-      <w:pPr>
-        <w:spacing w:after="140" w:line="300"/>
-        <w:jc w:val="both"/>
-      </w:pPr>
-      <w:r>
-        <w:t xml:space="preserve">Raporlamada dikkatimi çeken noktaları yapıcı bir gözle paylaşmak istiyorum.</w:t>
-      </w:r>
-    </w:p>
-    <w:p>
-      <w:pPr>
-        <w:spacing w:after="140" w:line="300"/>
-        <w:jc w:val="both"/>
-      </w:pPr>
-      <w:r>
-        <w:t xml:space="preserve">Bonferroni eşiği yöntemde belirtilmiş ancak yorumda uygulanmamıştır. Kruskal–Wallis sonrası parametrik bir test olan Duncan kullanılmıştır; bu durumda Dunn testi daha uygun olurdu.</w:t>
-      </w:r>
-    </w:p>
-    <w:p>
-      <w:pPr>
-        <w:spacing w:after="140" w:line="300"/>
-        <w:jc w:val="both"/>
-      </w:pPr>
-      <w:r>
-        <w:t xml:space="preserve">Bazı yüzdeler 432, bazıları 399 hasta üzerinden verilmiştir. Özette erkek hasta sayısı 275, tablolarda 254'tür; kombine tedavi oranı da özet ve tabloda farklıdır.</w:t>
-      </w:r>
-    </w:p>
-    <w:p>
-      <w:pPr>
-        <w:spacing w:after="140" w:line="300"/>
-        <w:jc w:val="both"/>
-      </w:pPr>
-      <w:r>
-        <w:t xml:space="preserve">Yöntemde “sigarayı bırakamayanlar dışlandı” ifadesi yer almaktadır; bu ifade bulgularla çelişmektedir ve büyük olasılıkla bir yazım hatasıdır. Son olarak Tablo 4 ve 6'da bazı değerlerin başındaki sıfırlar basımda düşmüştür.</w:t>
+        <w:t xml:space="preserve">Slayt 23: Kısıtlılıklar ve güçlü yönler  (≈ 1 dk)</w:t>
+      </w:r>
+    </w:p>
+    <w:p>
+      <w:pPr>
+        <w:spacing w:after="140" w:line="300"/>
+        <w:jc w:val="both"/>
+      </w:pPr>
+      <w:r>
+        <w:t xml:space="preserve">Yazarlar kısıtlılık olarak asistan rotasyonlarının takip sürekliliğini etkileyebileceğini, eksik verilerin telefonla ve hasta beyanıyla tamamlandığını ve vareniklinin piyasadan çekilmesinin ilaç seçimini etkilediğini belirtmektedir.</w:t>
+      </w:r>
+    </w:p>
+    <w:p>
+      <w:pPr>
+        <w:spacing w:after="140" w:line="300"/>
+        <w:jc w:val="both"/>
+      </w:pPr>
+      <w:r>
+        <w:t xml:space="preserve">Güçlü yön olarak bu çalışmanın, bildikleri kadarıyla sitizin ile sigara bırakma tedavisini ele alan erişilebilir ilk tez çalışması olduğunu ve birçok tedavi seçeneğini bir arada değerlendirdiğini vurgulamaktadırlar.</w:t>
       </w:r>
     </w:p>
     <w:p>
@@ -4688,25 +4485,25 @@
         <w:spacing w:after="140" w:before="280"/>
       </w:pPr>
       <w:r>
-        <w:t xml:space="preserve">Slayt 24: Sonuç  (≈ 30 sn)</w:t>
-      </w:r>
-    </w:p>
-    <w:p>
-      <w:pPr>
-        <w:spacing w:after="140" w:line="300"/>
-        <w:jc w:val="both"/>
-      </w:pPr>
-      <w:r>
-        <w:t xml:space="preserve">Yazarların sonucu özetle şöyledir: Hastaların yaklaşık üçte biri sigarayı bırakmıştır. Kombine tedavi alanlarda bırakma oranı diğer seçeneklere göre daha yüksektir. Tedaviye uyum arttıkça bırakma oranı da artmaktadır.</w:t>
-      </w:r>
-    </w:p>
-    <w:p>
-      <w:pPr>
-        <w:spacing w:after="140" w:line="300"/>
-        <w:jc w:val="both"/>
-      </w:pPr>
-      <w:r>
-        <w:t xml:space="preserve">Yazarlar tedavi seansları sırasında hastaların motivasyonunu artırmaya yönelik çabaların yoğunlaştırılmasını önermektedir.</w:t>
+        <w:t xml:space="preserve">Slayt 24: Sonuç ve öneriler  (≈ 30 sn)</w:t>
+      </w:r>
+    </w:p>
+    <w:p>
+      <w:pPr>
+        <w:spacing w:after="140" w:line="300"/>
+        <w:jc w:val="both"/>
+      </w:pPr>
+      <w:r>
+        <w:t xml:space="preserve">Yazarların sonucuna göre hastaların yaklaşık üçte biri sigarayı bırakmıştır. Kombine tedavi alanlarda bırakma oranı diğer seçeneklere göre daha yüksektir ve tedaviye uyum arttıkça başarı da artmaktadır.</w:t>
+      </w:r>
+    </w:p>
+    <w:p>
+      <w:pPr>
+        <w:spacing w:after="140" w:line="300"/>
+        <w:jc w:val="both"/>
+      </w:pPr>
+      <w:r>
+        <w:t xml:space="preserve">Yazarlar tedavi seanslarında hastaların bırakma motivasyonunu artırmaya yönelik çabaların yoğunlaştırılmasını önermektedir.</w:t>
       </w:r>
     </w:p>
     <w:p>
@@ -4724,25 +4521,25 @@
         <w:jc w:val="both"/>
       </w:pPr>
       <w:r>
-        <w:t xml:space="preserve">Şimdi kısa bir olgu üzerinden sizlerin görüşlerini almak istiyorum.</w:t>
-      </w:r>
-    </w:p>
-    <w:p>
-      <w:pPr>
-        <w:spacing w:after="140" w:line="300"/>
-        <w:jc w:val="both"/>
-      </w:pPr>
-      <w:r>
-        <w:t xml:space="preserve">52 yaşında erkek hasta; günde 25 sigara içiyor, 30 paket-yıl öyküsü var ve FNBT puanı 8, yani yüksek bağımlılık. İki yıl önce bupropion ile denemiş ve başaramamış. Eşi de sigara içiyor.</w:t>
-      </w:r>
-    </w:p>
-    <w:p>
-      <w:pPr>
-        <w:spacing w:after="140" w:line="300"/>
-        <w:jc w:val="both"/>
-      </w:pPr>
-      <w:r>
-        <w:t xml:space="preserve">Bu hastada hangi tedaviyi seçerdiniz? Takip sıklığını nasıl planlardınız? Eşini sürece nasıl dahil ederdiniz?</w:t>
+        <w:t xml:space="preserve">Bulguları pratiğe aktarmak için kısa bir olgu üzerinden görüşlerinizi almak istiyorum.</w:t>
+      </w:r>
+    </w:p>
+    <w:p>
+      <w:pPr>
+        <w:spacing w:after="140" w:line="300"/>
+        <w:jc w:val="both"/>
+      </w:pPr>
+      <w:r>
+        <w:t xml:space="preserve">52 yaşında erkek hasta; günde 25 sigara içiyor, 30 paket-yıl öyküsü var, FNBT puanı 8. Daha önce bupropion ile denemiş ve başaramamış. Eşi de sigara içiyor.</w:t>
+      </w:r>
+    </w:p>
+    <w:p>
+      <w:pPr>
+        <w:spacing w:after="140" w:line="300"/>
+        <w:jc w:val="both"/>
+      </w:pPr>
+      <w:r>
+        <w:t xml:space="preserve">Bu hastada hangi tedaviyi seçerdiniz? Takibi nasıl planlardınız? Eşini sürece nasıl dahil ederdiniz?</w:t>
       </w:r>
     </w:p>
     <w:p>
@@ -4756,7 +4553,7 @@
           <w:iCs/>
           <w:color w:val="5F7178"/>
         </w:rPr>
-        <w:t xml:space="preserve">[Burada 2–3 dakika görüş alın. Makaleye göre tartışmayı yönlendirebileceğiniz noktalar: Bupropion tek başına tekrar verilmemeli, kombine NRT veya sitizin/vareniklin temelli tedavi düşünülmeli, ilk ay sık kontrol planlanmalı ve eşe de bırakma danışmanlığı önerilmelidir.]</w:t>
+        <w:t xml:space="preserve">[Burada 2–3 dakika görüş alın. Makalenin bulgularına göre tartışmayı şu noktalara yönlendirebilirsiniz: Kombine tedavi veya vareniklin/sitizin temelli tedavi, sık kontrol görüşmeleri ve eşe de bırakma danışmanlığı önerilmesi.]</w:t>
       </w:r>
     </w:p>
     <w:p>
@@ -4774,25 +4571,16 @@
         <w:jc w:val="both"/>
       </w:pPr>
       <w:r>
-        <w:t xml:space="preserve">Sunumu özetlemek gerekirse beş mesajla ayrılmak istiyorum.</w:t>
-      </w:r>
-    </w:p>
-    <w:p>
-      <w:pPr>
-        <w:spacing w:after="140" w:line="300"/>
-        <w:jc w:val="both"/>
-      </w:pPr>
-      <w:r>
-        <w:t xml:space="preserve">Bupropion tek başına bu çalışmada en zayıf seçenek olmuştur. Kombine tedavi ve NRT, düzeltilmiş eşiği de geçen en güvenilir sonuçları vermiştir.</w:t>
-      </w:r>
-    </w:p>
-    <w:p>
-      <w:pPr>
-        <w:spacing w:after="140" w:line="300"/>
-        <w:jc w:val="both"/>
-      </w:pPr>
-      <w:r>
-        <w:t xml:space="preserve">Hastanın hanesinde sigara içen olup olmadığı mutlaka sorgulanmalıdır. Sık takip başarıyla ilişkilidir. Son olarak, retrospektif ve randomize olmayan tasarım nedeniyle bu sonuçlar dikkatli yorumlanmalıdır.</w:t>
+        <w:t xml:space="preserve">Sunumu beş mesajla özetlemek istiyorum.</w:t>
+      </w:r>
+    </w:p>
+    <w:p>
+      <w:pPr>
+        <w:spacing w:after="140" w:line="300"/>
+        <w:jc w:val="both"/>
+      </w:pPr>
+      <w:r>
+        <w:t xml:space="preserve">Hastaların yaklaşık üçte biri sigarayı bırakmıştır. Kombine tedavide başarı daha yüksektir. Bupropion monoterapisi en düşük başarının görüldüğü seçenektir. Hanesinde sigara içen olup olmadığı sorgulanmalıdır. Sık takip başarıyla ilişkilidir.</w:t>
       </w:r>
     </w:p>
     <w:p>
@@ -4810,7 +4598,7 @@
         <w:jc w:val="both"/>
       </w:pPr>
       <w:r>
-        <w:t xml:space="preserve">Sunumda kullandığım kaynaklar Vancouver stiline uygun olarak, kullanım sırasıyla listelenmiştir. Birinci kaynak sunulan makalenin kendisidir; diğerleri makalenin atıf yaptığı çalışmalardır.</w:t>
+        <w:t xml:space="preserve">Kaynaklar Vancouver stiline uygun olarak, kullanım sırasıyla listelenmiştir. Birinci kaynak sunulan makalenin kendisidir; diğerleri makalenin atıf yaptığı çalışmalardır.</w:t>
       </w:r>
     </w:p>
     <w:p>
@@ -4869,16 +4657,16 @@
           <w:bCs/>
           <w:color w:val="0F4C5C"/>
         </w:rPr>
-        <w:t xml:space="preserve">1. Neden ki-kare yerine lojistik regresyon da yapılmış?</w:t>
-      </w:r>
-    </w:p>
-    <w:p>
-      <w:pPr>
-        <w:spacing w:after="140" w:line="300"/>
-        <w:jc w:val="both"/>
-      </w:pPr>
-      <w:r>
-        <w:t xml:space="preserve">Ki-kare yalnızca iki değişken arasındaki ilişkiyi gösterir. Lojistik regresyon ise birden fazla faktörü aynı anda modele koyarak her birinin diğerlerinden bağımsız etkisini tahmin eder. Sonuç ikili (bıraktı/bırakamadı) olduğu için ikili lojistik regresyon seçilmiştir.</w:t>
+        <w:t xml:space="preserve">1. Lojistik regresyon neden kullanılmış?</w:t>
+      </w:r>
+    </w:p>
+    <w:p>
+      <w:pPr>
+        <w:spacing w:after="140" w:line="300"/>
+        <w:jc w:val="both"/>
+      </w:pPr>
+      <w:r>
+        <w:t xml:space="preserve">Sonuç değişkeni ikilidir (bıraktı/bırakamadı). Lojistik regresyon, birden fazla faktörü aynı anda modele koyarak her birinin bırakma olasılığı üzerindeki bağımsız etkisini tahmin eder.</w:t>
       </w:r>
     </w:p>
     <w:p>
@@ -4891,16 +4679,16 @@
           <w:bCs/>
           <w:color w:val="0F4C5C"/>
         </w:rPr>
-        <w:t xml:space="preserve">2. Bonferroni düzeltmesi neden yapılır, eşik nasıl 0,003 olmuş?</w:t>
-      </w:r>
-    </w:p>
-    <w:p>
-      <w:pPr>
-        <w:spacing w:after="140" w:line="300"/>
-        <w:jc w:val="both"/>
-      </w:pPr>
-      <w:r>
-        <w:t xml:space="preserve">Çok sayıda karşılaştırma yapıldığında tesadüfen anlamlı sonuç bulma olasılığı artar. Bonferroni, 0,05'i karşılaştırma sayısına böler. 0,05 / 16 ≈ 0,003 olduğuna göre yazarlar yaklaşık 16 karşılaştırma yapmış olmalıdır; hangi karşılaştırmaların sayıldığı makalede belirtilmemiştir.</w:t>
+        <w:t xml:space="preserve">2. Tablo 6'daki Exp(B) ne anlama geliyor?</w:t>
+      </w:r>
+    </w:p>
+    <w:p>
+      <w:pPr>
+        <w:spacing w:after="140" w:line="300"/>
+        <w:jc w:val="both"/>
+      </w:pPr>
+      <w:r>
+        <w:t xml:space="preserve">Exp(B) odds oranıdır. Referans gruba göre bırakma odds'unun kaç kat olduğunu gösterir. Örneğin kombine tedavide 3,97 değeri, bupropion monoterapisine göre bırakma odds'unun yaklaşık dört kat yüksek olduğu anlamına gelir. 1'in üzerindeki değerler bırakma lehinedir.</w:t>
       </w:r>
     </w:p>
     <w:p>
@@ -4913,16 +4701,16 @@
           <w:bCs/>
           <w:color w:val="0F4C5C"/>
         </w:rPr>
-        <w:t xml:space="preserve">3. Odds oranı ile risk oranı arasındaki fark nedir?</w:t>
-      </w:r>
-    </w:p>
-    <w:p>
-      <w:pPr>
-        <w:spacing w:after="140" w:line="300"/>
-        <w:jc w:val="both"/>
-      </w:pPr>
-      <w:r>
-        <w:t xml:space="preserve">Risk oranı iki grubun olay oranlarını doğrudan karşılaştırır (%44,0 / %16,5 ≈ 2,7). Odds oranı ise olma/olmama oranlarını karşılaştırır (0,78 / 0,20 ≈ 3,97). Olay nadirse ikisi birbirine yakındır; olay sık ise odds oranı etkiyi büyük gösterir.</w:t>
+        <w:t xml:space="preserve">3. Bonferroni düzeltmesi nedir?</w:t>
+      </w:r>
+    </w:p>
+    <w:p>
+      <w:pPr>
+        <w:spacing w:after="140" w:line="300"/>
+        <w:jc w:val="both"/>
+      </w:pPr>
+      <w:r>
+        <w:t xml:space="preserve">Çok sayıda karşılaştırma yapıldığında tesadüfen anlamlı sonuç bulma olasılığı artar. Bonferroni düzeltmesi, anlamlılık eşiğini karşılaştırma sayısına bölerek bu olasılığı azaltır. Yazarlar düzeltilmiş eşiği p&lt;0,003 olarak belirtmiştir.</w:t>
       </w:r>
     </w:p>
     <w:p>
@@ -4935,16 +4723,16 @@
           <w:bCs/>
           <w:color w:val="0F4C5C"/>
         </w:rPr>
-        <w:t xml:space="preserve">4. Görüşme sayısı ile başarı arasındaki ilişki nedensel midir?</w:t>
-      </w:r>
-    </w:p>
-    <w:p>
-      <w:pPr>
-        <w:spacing w:after="140" w:line="300"/>
-        <w:jc w:val="both"/>
-      </w:pPr>
-      <w:r>
-        <w:t xml:space="preserve">Kesin söylenemez. Ters nedensellik olasıdır: Bırakmayı başaran hasta kontrollere gelmeye devam ederken başaramayan hasta takibi bırakabilir. Retrospektif tasarım bu ayrımı yapamaz.</w:t>
+        <w:t xml:space="preserve">4. FNBT nasıl puanlanıyor?</w:t>
+      </w:r>
+    </w:p>
+    <w:p>
+      <w:pPr>
+        <w:spacing w:after="140" w:line="300"/>
+        <w:jc w:val="both"/>
+      </w:pPr>
+      <w:r>
+        <w:t xml:space="preserve">Altı sorudan oluşur ve 0–10 arasında puanlanır. İlk sigara zamanı ve günlük sigara sayısı 0–3, diğer dört soru 0–1 puan alır. Makalede 0–2 düşük, 3–7 orta, 8–10 yüksek bağımlılık olarak sınıflanmıştır.</w:t>
       </w:r>
     </w:p>
     <w:p>
@@ -4957,16 +4745,16 @@
           <w:bCs/>
           <w:color w:val="0F4C5C"/>
         </w:rPr>
-        <w:t xml:space="preserve">5. İlaçsız grubun başarısı neden bupropionun iki katı?</w:t>
-      </w:r>
-    </w:p>
-    <w:p>
-      <w:pPr>
-        <w:spacing w:after="140" w:line="300"/>
-        <w:jc w:val="both"/>
-      </w:pPr>
-      <w:r>
-        <w:t xml:space="preserve">Bu grup yalnızca 17 hastadır ve fark anlamlı değildir (p=0,075). Büyük olasılıkla bağımlılığı düşük, motivasyonu yüksek hastalardan oluşmaktadır. Randomizasyon olmadığı için tedavi grupları başlangıçta birbirine benzememektedir.</w:t>
+        <w:t xml:space="preserve">5. Cronbach alfa nedir?</w:t>
+      </w:r>
+    </w:p>
+    <w:p>
+      <w:pPr>
+        <w:spacing w:after="140" w:line="300"/>
+        <w:jc w:val="both"/>
+      </w:pPr>
+      <w:r>
+        <w:t xml:space="preserve">Bir ölçeğin iç tutarlılığını, yani soruların aynı kavramı ne ölçüde birlikte ölçtüğünü gösterir. Değer 0 ile 1 arasındadır. FNBT'nin Türkçe çalışmasında 0,56 olarak bildirilmiştir.</w:t>
       </w:r>
     </w:p>
     <w:p>
@@ -4979,16 +4767,16 @@
           <w:bCs/>
           <w:color w:val="0F4C5C"/>
         </w:rPr>
-        <w:t xml:space="preserve">6. FNBT'nin Cronbach alfası 0,56 iken test güvenilir mi?</w:t>
-      </w:r>
-    </w:p>
-    <w:p>
-      <w:pPr>
-        <w:spacing w:after="140" w:line="300"/>
-        <w:jc w:val="both"/>
-      </w:pPr>
-      <w:r>
-        <w:t xml:space="preserve">İç tutarlılık sınırlıdır; ancak özgün İngilizce sürümde de alfa 0,61 civarındadır. Testin altı sorudan oluşması ve soruların farklı boyutları ölçmesi bu durumu açıklamaktadır. Test, kabaca gruplama ve tedavi planlaması için kullanışlı bir tarama aracı olarak değerini korumaktadır.</w:t>
+        <w:t xml:space="preserve">6. Retrospektif, kesitsel çalışma ne demektir?</w:t>
+      </w:r>
+    </w:p>
+    <w:p>
+      <w:pPr>
+        <w:spacing w:after="140" w:line="300"/>
+        <w:jc w:val="both"/>
+      </w:pPr>
+      <w:r>
+        <w:t xml:space="preserve">Retrospektif, verilerin geçmişte tutulmuş kayıtlardan geriye dönük olarak toplandığını; kesitsel, değişkenlerin belirli bir zaman noktasında değerlendirildiğini ifade eder. Bu çalışmada 2020–2024 yılları arasındaki poliklinik kayıtları incelenmiştir.</w:t>
       </w:r>
     </w:p>
     <w:p>
@@ -5001,16 +4789,16 @@
           <w:bCs/>
           <w:color w:val="0F4C5C"/>
         </w:rPr>
-        <w:t xml:space="preserve">7. Bu sonuçlar kendi polikliniğimize genellenebilir mi?</w:t>
-      </w:r>
-    </w:p>
-    <w:p>
-      <w:pPr>
-        <w:spacing w:after="140" w:line="300"/>
-        <w:jc w:val="both"/>
-      </w:pPr>
-      <w:r>
-        <w:t xml:space="preserve">Tek merkezli, eğitim hastanesi kaynaklı ve ilaçların dönemsel olarak ücretsiz verildiği bir örneklemdir. Birinci basamağa genellenirken hasta profili, ilaç erişimi ve takip olanakları farklılıkları göz önünde bulundurulmalıdır.</w:t>
+        <w:t xml:space="preserve">7. Sitizin hakkında ne biliyoruz?</w:t>
+      </w:r>
+    </w:p>
+    <w:p>
+      <w:pPr>
+        <w:spacing w:after="140" w:line="300"/>
+        <w:jc w:val="both"/>
+      </w:pPr>
+      <w:r>
+        <w:t xml:space="preserve">Sitizin, vareniklin gibi α4β2 nikotinik asetilkolin reseptörünün parsiyel agonistidir. Doğu ve Orta Avrupa'da uzun süredir kullanılmaktadır. Klinik çalışmalarda plaseboya üstün, NRT ve vareniklinle benzer etkinlikte bulunmuştur. Makaleye göre ülkemizde belirli dönemlerde ücretsiz sağlanmıştır.</w:t>
       </w:r>
     </w:p>
     <w:sectPr>

</xml_diff>

<commit_message>
Konuşma notları: yazarlara doğrudan atıflar edilgen dile çevrildi
'Yazarlar ... vurgulamaktadır' gibi ifadeler 'Makalede ... vurgulanmaktadır'
biçimine getirildi (11 yer). PowerPoint not bölmesi Word notlarıyla
yeniden eşitlendi.

Co-Authored-By: Claude Opus 5.5 <noreply@anthropic.com>
Claude-Session: https://claude.ai/code/session_013LLNDYinKcb3EYpgyk92AX
</commit_message>
<xml_diff>
--- a/Sunumlar/Konusma_Notlari_Sigara_Birakma.docx
+++ b/Sunumlar/Konusma_Notlari_Sigara_Birakma.docx
@@ -251,7 +251,7 @@
         <w:jc w:val="both"/>
       </w:pPr>
       <w:r>
-        <w:t>Yazarların amacı, kombine tedavinin ve yakın takibin sigara bırakma başarısı üzerindeki etkisini değerlendirmek ve bırakmayı etkileyen hasta özelliklerini belirlemektir.</w:t>
+        <w:t>Çalışmanın amacı, kombine tedavinin ve yakın takibin sigara bırakma başarısı üzerindeki etkisini değerlendirmek ve bırakmayı etkileyen hasta özelliklerini belirlemektir.</w:t>
       </w:r>
     </w:p>
     <w:p>
@@ -658,7 +658,7 @@
         <w:jc w:val="both"/>
       </w:pPr>
       <w:r>
-        <w:t>Tablo 5'te tedavi yöntemlerine göre bırakma oranları yer almaktadır. Yazarlara göre en yüksek bırakma oranı yüzde 44,0 ile kombine tedavi grubundadır ve kombine tedavi diğer tüm seçeneklerden anlamlı derecede üstündür.</w:t>
+        <w:t>Tablo 5'te tedavi yöntemlerine göre bırakma oranları yer almaktadır. Makalede en yüksek bırakma oranının yüzde 44,0 ile kombine tedavi grubunda olduğu ve kombine tedavinin diğer tüm seçeneklerden anlamlı derecede üstün olduğu bildirilmektedir.</w:t>
       </w:r>
     </w:p>
     <w:p>
@@ -703,7 +703,7 @@
         <w:jc w:val="both"/>
       </w:pPr>
       <w:r>
-        <w:t>Hanede sigara içen olmaması bırakma olasılığını yaklaşık iki katına, sigaraya bağlı yakınma olmaması 1,6 katına çıkarmaktadır. Yazarlar ayrıca FNBT puanının bırakma başarısının negatif bir öngörücüsü olduğunu bildirmektedir.</w:t>
+        <w:t>Hanede sigara içen olmaması bırakma olasılığını yaklaşık iki katına, sigaraya bağlı yakınma olmaması 1,6 katına çıkarmaktadır. Ayrıca FNBT puanının bırakma başarısının negatif bir öngörücüsü olduğu bildirilmektedir.</w:t>
       </w:r>
     </w:p>
     <w:p>
@@ -721,7 +721,7 @@
         <w:jc w:val="both"/>
       </w:pPr>
       <w:r>
-        <w:t>Yazarlar bulgularını literatürle karşılaştırmıştır. Vareniklinin bupropiona üstünlüğü büyük ölçekli meta-analizler ve randomize kontrollü çalışmalarla uyumludur. Bu üstünlüğün, vareniklinin α4β2 nikotinik reseptördeki parsiyel agonist etkisiyle ilişkili olduğu düşünülmektedir.</w:t>
+        <w:t>Makalede bulgular literatürle karşılaştırılmaktadır. Vareniklinin bupropiona üstünlüğü büyük ölçekli meta-analizler ve randomize kontrollü çalışmalarla uyumludur. Bu üstünlüğün, vareniklinin α4β2 nikotinik reseptördeki parsiyel agonist etkisiyle ilişkili olduğu düşünülmektedir.</w:t>
       </w:r>
     </w:p>
     <w:p>
@@ -758,7 +758,7 @@
         <w:jc w:val="both"/>
       </w:pPr>
       <w:r>
-        <w:t>Yazarlar davranışsal desteğin önemini vurgulamaktadır: Daha fazla görüşmeye gelen hastalarda bırakma oranı daha yüksektir.</w:t>
+        <w:t>Makalede davranışsal desteğin önemi vurgulanmaktadır: Daha fazla görüşmeye gelen hastalarda bırakma oranı daha yüksektir.</w:t>
       </w:r>
     </w:p>
     <w:p>
@@ -776,7 +776,7 @@
         <w:jc w:val="both"/>
       </w:pPr>
       <w:r>
-        <w:t>Hastaların ortalama FNBT puanı, tedavi arayan sigara içicilerinde bildirilen yaklaşık 5 puanla uyumludur ve yüksek puan düşük başarıyla ilişkilidir. Yakınması olmayan hastalarda başarının daha yüksek olması uzun vadeli sağlığı korumaya yönelik içsel motivasyonla açıklanmaktadır. Yazarlar ikinci bir olasılık olarak, kronik hastalığı veya semptomu olan bireylerin sigarayı bir baş etme aracı olarak kullanıyor olabileceğini ve bunun bırakmayı zorlaştırabileceğini belirtmektedir.</w:t>
+        <w:t>Hastaların ortalama FNBT puanı, tedavi arayan sigara içicilerinde bildirilen yaklaşık 5 puanla uyumludur ve yüksek puan düşük başarıyla ilişkilidir. Yakınması olmayan hastalarda başarının daha yüksek olması uzun vadeli sağlığı korumaya yönelik içsel motivasyonla açıklanmaktadır. İkinci bir olasılık olarak, kronik hastalığı veya semptomu olan bireylerin sigarayı bir baş etme aracı olarak kullanıyor olabileceği ve bunun bırakmayı zorlaştırabileceği belirtilmektedir.</w:t>
       </w:r>
     </w:p>
     <w:p>
@@ -794,16 +794,16 @@
         <w:jc w:val="both"/>
       </w:pPr>
       <w:r>
-        <w:t>Yazarlar kısıtlılık olarak asistan rotasyonlarının takip sürekliliğini etkileyebileceğini, eksik verilerin telefonla ve hasta beyanıyla tamamlandığını ve vareniklinin piyasadan çekilmesinin ilaç seçimini etkilediğini belirtmektedir.</w:t>
-      </w:r>
-    </w:p>
-    <w:p>
-      <w:pPr>
-        <w:spacing w:after="140" w:line="300" w:lineRule="auto"/>
-        <w:jc w:val="both"/>
-      </w:pPr>
-      <w:r>
-        <w:t>Güçlü yön olarak bu çalışmanın, bildikleri kadarıyla sitizin ile sigara bırakma tedavisini ele alan erişilebilir ilk tez çalışması olduğunu ve birçok tedavi seçeneğini bir arada değerlendirdiğini vurgulamaktadırlar.</w:t>
+        <w:t>Makalede kısıtlılık olarak asistan rotasyonlarının takip sürekliliğini etkileyebileceği, eksik verilerin telefonla ve hasta beyanıyla tamamlandığı ve vareniklinin piyasadan çekilmesinin ilaç seçimini etkilediği belirtilmektedir.</w:t>
+      </w:r>
+    </w:p>
+    <w:p>
+      <w:pPr>
+        <w:spacing w:after="140" w:line="300" w:lineRule="auto"/>
+        <w:jc w:val="both"/>
+      </w:pPr>
+      <w:r>
+        <w:t>Güçlü yön olarak, bu çalışmanın bilinen kadarıyla sitizin ile sigara bırakma tedavisini ele alan erişilebilir ilk tez çalışması olduğu ve birçok tedavi seçeneğini bir arada değerlendirdiği vurgulanmaktadır.</w:t>
       </w:r>
     </w:p>
     <w:p>
@@ -821,16 +821,16 @@
         <w:jc w:val="both"/>
       </w:pPr>
       <w:r>
-        <w:t>Yazarların sonucuna göre hastaların yaklaşık üçte biri sigarayı bırakmıştır. Kombine tedavi alanlarda bırakma oranı diğer seçeneklere göre daha yüksektir ve tedaviye uyum arttıkça başarı da artmaktadır.</w:t>
-      </w:r>
-    </w:p>
-    <w:p>
-      <w:pPr>
-        <w:spacing w:after="140" w:line="300" w:lineRule="auto"/>
-        <w:jc w:val="both"/>
-      </w:pPr>
-      <w:r>
-        <w:t>Yazarlar tedavi seanslarında hastaların bırakma motivasyonunu artırmaya yönelik çabaların yoğunlaştırılmasını önermektedir.</w:t>
+        <w:t>Çalışmanın sonucuna göre hastaların yaklaşık üçte biri sigarayı bırakmıştır. Kombine tedavi alanlarda bırakma oranı diğer seçeneklere göre daha yüksektir ve tedaviye uyum arttıkça başarı da artmaktadır.</w:t>
+      </w:r>
+    </w:p>
+    <w:p>
+      <w:pPr>
+        <w:spacing w:after="140" w:line="300" w:lineRule="auto"/>
+        <w:jc w:val="both"/>
+      </w:pPr>
+      <w:r>
+        <w:t>Makalede tedavi seanslarında hastaların bırakma motivasyonunu artırmaya yönelik çabaların yoğunlaştırılması önerilmektedir.</w:t>
       </w:r>
     </w:p>
     <w:p>
@@ -1038,7 +1038,7 @@
         <w:jc w:val="both"/>
       </w:pPr>
       <w:r>
-        <w:t>Çok sayıda karşılaştırma yapıldığında tesadüfen anlamlı sonuç bulma olasılığı artar. Bonferroni düzeltmesi, anlamlılık eşiğini karşılaştırma sayısına bölerek bu olasılığı azaltır. Yazarlar düzeltilmiş eşiği p&lt;0,003 olarak belirtmiştir.</w:t>
+        <w:t>Çok sayıda karşılaştırma yapıldığında tesadüfen anlamlı sonuç bulma olasılığı artar. Bonferroni düzeltmesi, anlamlılık eşiğini karşılaştırma sayısına bölerek bu olasılığı azaltır. Makalede düzeltilmiş eşik p&lt;0,003 olarak belirtilmiştir.</w:t>
       </w:r>
     </w:p>
     <w:p>

</xml_diff>

<commit_message>
Sunum: kullanıcının son düzenlemeleri temel alındı, notlar edilgen dile çevrildi
Kullanıcının olgu slaytını çıkardığı 26 slaytlık sürümü temel alındı;
slayt içeriğine dokunulmadı. Not bölmesindeki yazarlara doğrudan atıflar
edilgen dile çevrildi. Word notlarından olgu bölümü çıkarıldı, başlıklar
1-26 olarak düzenlendi ve 2. slayt notu kullanıcının metniyle eşitlendi.

Co-Authored-By: Claude Opus 5.5 <noreply@anthropic.com>
Claude-Session: https://claude.ai/code/session_013LLNDYinKcb3EYpgyk92AX
</commit_message>
<xml_diff>
--- a/Sunumlar/Konusma_Notlari_Sigara_Birakma.docx
+++ b/Sunumlar/Konusma_Notlari_Sigara_Birakma.docx
@@ -64,7 +64,7 @@
         <w:jc w:val="both"/>
       </w:pPr>
       <w:r>
-        <w:t>Sunum 27 slayttan oluşmaktadır. Konuşma süresi yaklaşık 28 dakikadır.</w:t>
+        <w:t>Sunum 26 slayttan oluşmaktadır. Konuşma süresi yaklaşık 25 dakikadır.</w:t>
       </w:r>
     </w:p>
     <w:p>
@@ -118,16 +118,16 @@
         <w:jc w:val="both"/>
       </w:pPr>
       <w:r>
-        <w:t xml:space="preserve">Sunum 27 slayttan oluşmakta ve yaklaşık yarım saat sürecektir. </w:t>
-      </w:r>
-    </w:p>
-    <w:p>
-      <w:pPr>
-        <w:spacing w:after="140" w:line="300" w:lineRule="auto"/>
-        <w:jc w:val="both"/>
-      </w:pPr>
-      <w:r>
-        <w:t>Makalenin künyesi ve giriş bölümüyle başlayıp gereç ve yöntemi aktaracağım. Bulgular bölümünde makaledeki altı tabloyu özgün halleriyle göstereceğim. Ardından hocalarımızın tartışma ve sonuçlarını aktaracak, son olarak kısa bir olgu üzerinden görüşlerinizi alacağım.</w:t>
+        <w:t>Sunum 26 slayttan oluşmakta ve yaklaşık yirmi dk sürecektir.</w:t>
+      </w:r>
+    </w:p>
+    <w:p>
+      <w:pPr>
+        <w:spacing w:after="140" w:line="300" w:lineRule="auto"/>
+        <w:jc w:val="both"/>
+      </w:pPr>
+      <w:r>
+        <w:t>Makalenin künyesi ve giriş bölümüyle başlayıp gereç ve yöntemi aktaracağım. Bulgular bölümünde makaledeki tabloyu özgün halleriyle göstereceğim. Ardından hocalarımızın tartışma ve sonuçlarını aktaracağım.</w:t>
       </w:r>
     </w:p>
     <w:p>
@@ -839,57 +839,7 @@
         <w:spacing w:before="280" w:after="140"/>
       </w:pPr>
       <w:r>
-        <w:t>Slayt 24: Olgu: Siz ne yapardınız?  (≈ 3 dk)</w:t>
-      </w:r>
-    </w:p>
-    <w:p>
-      <w:pPr>
-        <w:spacing w:after="140" w:line="300" w:lineRule="auto"/>
-        <w:jc w:val="both"/>
-      </w:pPr>
-      <w:r>
-        <w:t>Bulguları pratiğe aktarmak için kısa bir olgu üzerinden görüşlerinizi almak istiyorum.</w:t>
-      </w:r>
-    </w:p>
-    <w:p>
-      <w:pPr>
-        <w:spacing w:after="140" w:line="300" w:lineRule="auto"/>
-        <w:jc w:val="both"/>
-      </w:pPr>
-      <w:r>
-        <w:t>52 yaşında erkek hasta; günde 25 sigara içiyor, 30 paket-yıl öyküsü var, FNBT puanı 8. Daha önce bupropion ile denemiş ve başaramamış. Eşi de sigara içiyor.</w:t>
-      </w:r>
-    </w:p>
-    <w:p>
-      <w:pPr>
-        <w:spacing w:after="140" w:line="300" w:lineRule="auto"/>
-        <w:jc w:val="both"/>
-      </w:pPr>
-      <w:r>
-        <w:t>Bu hastada hangi tedaviyi seçerdiniz? Takibi nasıl planlardınız? Eşini sürece nasıl dahil ederdiniz?</w:t>
-      </w:r>
-    </w:p>
-    <w:p>
-      <w:pPr>
-        <w:spacing w:after="140" w:line="300" w:lineRule="auto"/>
-        <w:jc w:val="both"/>
-      </w:pPr>
-      <w:r>
-        <w:rPr>
-          <w:i/>
-          <w:iCs/>
-          <w:color w:val="5F7178"/>
-        </w:rPr>
-        <w:t>[Burada 2–3 dakika görüş alın. Makalenin bulgularına göre tartışmayı şu noktalara yönlendirebilirsiniz: Kombine tedavi veya vareniklin/sitizin temelli tedavi, sık kontrol görüşmeleri ve eşe de bırakma danışmanlığı önerilmesi.]</w:t>
-      </w:r>
-    </w:p>
-    <w:p>
-      <w:pPr>
-        <w:pStyle w:val="Balk2"/>
-        <w:spacing w:before="280" w:after="140"/>
-      </w:pPr>
-      <w:r>
-        <w:t>Slayt 25: Akılda kalacak mesajlar  (≈ 1 dk)</w:t>
+        <w:t>Slayt 24: Akılda kalacak mesajlar  (≈ 1 dk)</w:t>
       </w:r>
     </w:p>
     <w:p>
@@ -916,7 +866,7 @@
         <w:spacing w:before="280" w:after="140"/>
       </w:pPr>
       <w:r>
-        <w:t>Slayt 26: Kaynaklar  (≈ 15 sn)</w:t>
+        <w:t>Slayt 25: Kaynaklar  (≈ 15 sn)</w:t>
       </w:r>
     </w:p>
     <w:p>
@@ -934,7 +884,7 @@
         <w:spacing w:before="280" w:after="140"/>
       </w:pPr>
       <w:r>
-        <w:t>Slayt 27: Kapanış  (≈ 15 sn)</w:t>
+        <w:t>Slayt 26: Kapanış  (≈ 15 sn)</w:t>
       </w:r>
     </w:p>
     <w:p>

</xml_diff>

<commit_message>
Konuşma notlarını son sunuma göre yeniden hazırla
Sunumun son hali (26 slayt) depoya alındı; konuşma notları bu sürümdeki
slayt notlarından derlendi, yazım hataları düzeltildi, süre planı 20 dk.

Co-Authored-By: Claude Opus 5.5 <noreply@anthropic.com>
Claude-Session: https://claude.ai/code/session_013LLNDYinKcb3EYpgyk92AX
</commit_message>
<xml_diff>
--- a/Sunumlar/Konusma_Notlari_Sigara_Birakma.docx
+++ b/Sunumlar/Konusma_Notlari_Sigara_Birakma.docx
@@ -4,42 +4,37 @@
   <w:body>
     <w:p>
       <w:pPr>
-        <w:spacing w:after="80"/>
+        <w:spacing w:after="120"/>
       </w:pPr>
       <w:r>
         <w:rPr>
           <w:b/>
-          <w:bCs/>
           <w:color w:val="0F4C5C"/>
           <w:sz w:val="44"/>
-          <w:szCs w:val="44"/>
         </w:rPr>
         <w:t>Konuşma Notları</w:t>
       </w:r>
     </w:p>
     <w:p>
       <w:pPr>
-        <w:spacing w:after="240"/>
+        <w:spacing w:after="120"/>
       </w:pPr>
       <w:r>
         <w:rPr>
           <w:color w:val="2A9D8F"/>
           <w:sz w:val="26"/>
-          <w:szCs w:val="26"/>
         </w:rPr>
         <w:t>Makale sunumu: Sigara bırakma polikliniğine başvuran hastaların özellikleri ve bırakma başarısını etkileyen faktörler</w:t>
       </w:r>
     </w:p>
     <w:p>
       <w:pPr>
-        <w:spacing w:after="140" w:line="300" w:lineRule="auto"/>
-        <w:jc w:val="both"/>
+        <w:spacing w:after="120"/>
       </w:pPr>
       <w:r>
         <w:rPr>
           <w:color w:val="5F7178"/>
           <w:sz w:val="20"/>
-          <w:szCs w:val="20"/>
         </w:rPr>
         <w:t>Sunulan makale: Cenberlitaş E, Gökçe A, Öztürk O. Demographic and clinical characteristics of patients applying to a smoking cessation clinic affiliated with a university hospital and factors affecting their smoking cessation status. Turk J Fam Pract. 2026;30(2):97-106. doi:10.54308/TJFP.2026.912</w:t>
       </w:r>
@@ -47,879 +42,834 @@
     <w:p>
       <w:pPr>
         <w:pStyle w:val="Balk1"/>
-        <w:spacing w:before="280"/>
-      </w:pPr>
-      <w:r>
+        <w:spacing w:after="120"/>
+      </w:pPr>
+      <w:r>
+        <w:rPr/>
         <w:t>Genel bilgiler</w:t>
       </w:r>
     </w:p>
     <w:p>
       <w:pPr>
         <w:pStyle w:val="ListeParagraf"/>
-        <w:numPr>
-          <w:ilvl w:val="0"/>
-          <w:numId w:val="1"/>
-        </w:numPr>
-        <w:spacing w:after="80" w:line="290" w:lineRule="auto"/>
-        <w:jc w:val="both"/>
-      </w:pPr>
-      <w:r>
-        <w:t>Sunum 26 slayttan oluşmaktadır. Konuşma süresi yaklaşık 25 dakikadır.</w:t>
+        <w:spacing w:after="120"/>
+      </w:pPr>
+      <w:r>
+        <w:rPr/>
+        <w:t>• Sunum 26 slayttan oluşmaktadır. Konuşma süresi yaklaşık 20 dakikadır.</w:t>
+      </w:r>
+    </w:p>
+    <w:p>
+      <w:pPr>
+        <w:pStyle w:val="ListeParagraf"/>
+        <w:spacing w:after="120"/>
+      </w:pPr>
+      <w:r>
+        <w:rPr/>
+        <w:t>• Künye 2. slaytta, makalenin ilk sayfası gösterilirken sözlü olarak aktarılır.</w:t>
+      </w:r>
+    </w:p>
+    <w:p>
+      <w:pPr>
+        <w:pStyle w:val="ListeParagraf"/>
+        <w:spacing w:after="120"/>
+      </w:pPr>
+      <w:r>
+        <w:rPr/>
+        <w:t>• Telaffuz: Fagerström “Fa-ger-ström”, NRT “en-er-te”, Wald χ² “Vald ki-kare” diye okunur.</w:t>
       </w:r>
     </w:p>
     <w:p>
       <w:pPr>
         <w:pStyle w:val="Balk1"/>
-        <w:spacing w:before="280"/>
-      </w:pPr>
-      <w:r>
+        <w:spacing w:after="120"/>
+      </w:pPr>
+      <w:r>
+        <w:rPr/>
         <w:t>Slayt slayt konuşma metni</w:t>
       </w:r>
     </w:p>
     <w:p>
       <w:pPr>
         <w:pStyle w:val="Balk2"/>
-        <w:spacing w:before="280" w:after="140"/>
-      </w:pPr>
-      <w:r>
-        <w:t>Slayt 1: Başlık  (≈ 1 dk)</w:t>
-      </w:r>
-    </w:p>
-    <w:p>
-      <w:pPr>
-        <w:spacing w:after="140" w:line="300" w:lineRule="auto"/>
-        <w:jc w:val="both"/>
-      </w:pPr>
-      <w:r>
-        <w:t>Günaydın hocalarım, değerli arkadaşlarım. Ben Asistan Dr. Ahmet Kıran.</w:t>
-      </w:r>
-    </w:p>
-    <w:p>
-      <w:pPr>
-        <w:spacing w:after="140" w:line="300" w:lineRule="auto"/>
-        <w:jc w:val="both"/>
-      </w:pPr>
-      <w:r>
-        <w:t>Bugün sizlere Turkish Journal of Family Practice dergisinin 2026 yılı 30. cilt 2. sayısında yayımlanan, Uzm. Dr. Emre Cenberlitaş ve hocalarımızdan Aksanur ve Onur hocamızın “Bir üniversite hastanesine bağlı sigara bırakma polikliniğine başvuran hastaların demografik ve klinik özellikleri ile sigara bırakma durumlarını etkileyen faktörler” başlıklı makalesini sunacağım.</w:t>
-      </w:r>
-    </w:p>
-    <w:p>
-      <w:pPr>
-        <w:pStyle w:val="Balk2"/>
-        <w:spacing w:before="280" w:after="140"/>
-      </w:pPr>
-      <w:r>
-        <w:t>Slayt 2: İçerik  (≈ 30 sn)</w:t>
-      </w:r>
-    </w:p>
-    <w:p>
-      <w:pPr>
-        <w:spacing w:after="140" w:line="300" w:lineRule="auto"/>
-        <w:jc w:val="both"/>
-      </w:pPr>
-      <w:r>
-        <w:t>Sunum 26 slayttan oluşmakta ve yaklaşık yirmi dk sürecektir.</w:t>
-      </w:r>
-    </w:p>
-    <w:p>
-      <w:pPr>
-        <w:spacing w:after="140" w:line="300" w:lineRule="auto"/>
-        <w:jc w:val="both"/>
-      </w:pPr>
-      <w:r>
-        <w:t>Makalenin künyesi ve giriş bölümüyle başlayıp gereç ve yöntemi aktaracağım. Bulgular bölümünde makaledeki tabloyu özgün halleriyle göstereceğim. Ardından hocalarımızın tartışma ve sonuçlarını aktaracağım.</w:t>
-      </w:r>
-    </w:p>
-    <w:p>
-      <w:pPr>
-        <w:pStyle w:val="Balk2"/>
-        <w:spacing w:before="280" w:after="140"/>
-      </w:pPr>
-      <w:r>
-        <w:t xml:space="preserve">Slayt </w:t>
-      </w:r>
-      <w:r>
-        <w:t>3</w:t>
-      </w:r>
-      <w:r>
-        <w:t>: Makale künyesi  (≈ 1 dk)</w:t>
-      </w:r>
-    </w:p>
-    <w:p>
-      <w:pPr>
-        <w:spacing w:after="140" w:line="300" w:lineRule="auto"/>
-        <w:jc w:val="both"/>
-      </w:pPr>
-      <w:r>
-        <w:t xml:space="preserve">Solda makalenin ilk sayfasını görüyorsunuz. Makale Türkiye Aile Hekimleri Uzmanlık Derneği'nin yayın organı olan Turkish Journal of Family Practice'te 2026 yılında yayımlanmıştır. </w:t>
-      </w:r>
-    </w:p>
-    <w:p>
-      <w:pPr>
-        <w:spacing w:after="140" w:line="300" w:lineRule="auto"/>
-        <w:jc w:val="both"/>
-      </w:pPr>
-      <w:r>
+        <w:spacing w:after="120"/>
+      </w:pPr>
+      <w:r>
+        <w:rPr/>
+        <w:t>Slayt 1: Başlık  (≈ 45 sn)</w:t>
+      </w:r>
+    </w:p>
+    <w:p>
+      <w:pPr>
+        <w:spacing w:after="120"/>
+      </w:pPr>
+      <w:r>
+        <w:rPr/>
+        <w:t>Değerli hocalarım, değerli arkadaşlarım. Ben Asistan Dr. Ahmet Kıran.</w:t>
+      </w:r>
+    </w:p>
+    <w:p>
+      <w:pPr>
+        <w:spacing w:after="120"/>
+      </w:pPr>
+      <w:r>
+        <w:rPr/>
+        <w:t>Bugün sizlere Uzm. Dr. Emre Cenberlitaş ve hocalarımızdan Aksanur ve Onur hocamızın “Bir üniversite hastanesine bağlı sigara bırakma polikliniğine başvuran hastaların demografik ve klinik özellikleri ile sigara bırakma durumlarını etkileyen faktörler” başlıklı makalesini sunacağım.</w:t>
+      </w:r>
+    </w:p>
+    <w:p>
+      <w:pPr>
+        <w:pStyle w:val="Balk2"/>
+        <w:spacing w:after="120"/>
+      </w:pPr>
+      <w:r>
+        <w:rPr/>
+        <w:t>Slayt 2: Makalenin ilk sayfası (künye sözlü)  (≈ 45 sn)</w:t>
+      </w:r>
+    </w:p>
+    <w:p>
+      <w:pPr>
+        <w:spacing w:after="120"/>
+      </w:pPr>
+      <w:r>
+        <w:rPr/>
+        <w:t>Makalenin ilk sayfasını görüyorsunuz. Makale, Türkiye Aile Hekimleri Uzmanlık Derneği'nin yayın organı olan Turkish Journal of Family Practice'in 2026 yılı 30. cilt 2. sayısında, 97–106. sayfalar arasında yayımlanmıştır.</w:t>
+      </w:r>
+    </w:p>
+    <w:p>
+      <w:pPr>
+        <w:spacing w:after="120"/>
+      </w:pPr>
+      <w:r>
+        <w:rPr/>
         <w:t>Çalışma retrospektif, kesitsel bir araştırmadır. Veriler Samsun Eğitim ve Araştırma Hastanesi Sigara Bırakma Polikliniği'nden elde edilmiştir.</w:t>
       </w:r>
     </w:p>
     <w:p>
       <w:pPr>
         <w:pStyle w:val="Balk2"/>
-        <w:spacing w:before="280" w:after="140"/>
-      </w:pPr>
-      <w:r>
-        <w:t xml:space="preserve">Slayt </w:t>
-      </w:r>
-      <w:r>
-        <w:t>4</w:t>
-      </w:r>
-      <w:r>
-        <w:t>: Sorunun büyüklüğü  (≈ 1 dk)</w:t>
-      </w:r>
-    </w:p>
-    <w:p>
-      <w:pPr>
-        <w:spacing w:after="140" w:line="300" w:lineRule="auto"/>
-        <w:jc w:val="both"/>
-      </w:pPr>
-      <w:r>
-        <w:t>Giriş bölümünde tütün bağımlılığının önlenebilir ölüm nedenlerinin başında geldiği vurgulanmaktadır. Küresel Yetişkin Tütün Araştırması 2016 verilerine göre Türkiye'de sigara içme sıklığı erkeklerde yüzde 44,1, kadınlarda yüzde 19,2'dir.</w:t>
-      </w:r>
-    </w:p>
-    <w:p>
-      <w:pPr>
-        <w:spacing w:after="140" w:line="300" w:lineRule="auto"/>
-        <w:jc w:val="both"/>
-      </w:pPr>
-      <w:r>
-        <w:lastRenderedPageBreak/>
+        <w:spacing w:after="120"/>
+      </w:pPr>
+      <w:r>
+        <w:rPr/>
+        <w:t>Slayt 3: İçerik  (≈ 30 sn)</w:t>
+      </w:r>
+    </w:p>
+    <w:p>
+      <w:pPr>
+        <w:spacing w:after="120"/>
+      </w:pPr>
+      <w:r>
+        <w:rPr/>
+        <w:t>Sunum 26 slayttan oluşmakta ve yaklaşık yirmi dakika sürecektir.</w:t>
+      </w:r>
+    </w:p>
+    <w:p>
+      <w:pPr>
+        <w:spacing w:after="120"/>
+      </w:pPr>
+      <w:r>
+        <w:rPr/>
+        <w:t>Giriş bölümüyle başlayıp gereç ve yöntemi aktaracağım. Bulgular bölümünde makaledeki tabloları özgün halleriyle göstereceğim. Ardından tartışma ve sonuçları aktaracağım.</w:t>
+      </w:r>
+    </w:p>
+    <w:p>
+      <w:pPr>
+        <w:pStyle w:val="Balk2"/>
+        <w:spacing w:after="120"/>
+      </w:pPr>
+      <w:r>
+        <w:rPr/>
+        <w:t>Slayt 4: Sorunun büyüklüğü  (≈ 1 dk)</w:t>
+      </w:r>
+    </w:p>
+    <w:p>
+      <w:pPr>
+        <w:spacing w:after="120"/>
+      </w:pPr>
+      <w:r>
+        <w:rPr/>
+        <w:t>Tütün bağımlılığı önlenebilir ölüm nedenlerinin başında gelmektedir. Küresel Yetişkin Tütün Araştırması 2016 verilerine göre Türkiye'de sigara içme sıklığı erkeklerde yüzde 44,1, kadınlarda yüzde 19,2'dir.</w:t>
+      </w:r>
+    </w:p>
+    <w:p>
+      <w:pPr>
+        <w:spacing w:after="120"/>
+      </w:pPr>
+      <w:r>
+        <w:rPr/>
         <w:t>Ülkemizde 500'ün üzerinde sigara bırakma polikliniği bulunmakta, bu polikliniklere 2,5 milyondan fazla kişi başvurmuş bulunmaktadır. Polikliniklerde bırakma oranları yüzde 20 ile 50 arasında değişmektedir.</w:t>
       </w:r>
     </w:p>
     <w:p>
       <w:pPr>
         <w:pStyle w:val="Balk2"/>
-        <w:spacing w:before="280" w:after="140"/>
-      </w:pPr>
-      <w:r>
-        <w:t xml:space="preserve">Slayt </w:t>
-      </w:r>
-      <w:r>
-        <w:t>5</w:t>
-      </w:r>
-      <w:r>
-        <w:t>: Tedavi seçenekleri  (≈ 1 dk)</w:t>
-      </w:r>
-    </w:p>
-    <w:p>
-      <w:pPr>
-        <w:spacing w:after="140" w:line="300" w:lineRule="auto"/>
-        <w:jc w:val="both"/>
-      </w:pPr>
-      <w:r>
-        <w:t>Sigara bırakma tedavisi Onur hocamızın da dersinde anlattığı gibi davranışsal yaklaşımlar ve farmakoterapiden oluşmakta. Davranışsal tarafta Sağlık İnanç Modeli, Sağlık Kontrol Odağı, Yeniliklerin Yayılımı Modeli, Pender'in Sağlığı Geliştirme Modeli ve Transteorik Model gibi davranış değişikliği modelleri kullanılmaktadır.</w:t>
-      </w:r>
-    </w:p>
-    <w:p>
-      <w:pPr>
-        <w:spacing w:after="140" w:line="300" w:lineRule="auto"/>
-        <w:jc w:val="both"/>
-      </w:pPr>
-      <w:r>
-        <w:t>Farmakoterapi nikotin replasman tedavisi, bupropion ve vareniklinden oluşmaktadır. Sitizin de yine Onur hocamızın bahsettiği gibi son yıllarda ek bir seçenek olarak kullanıma girmiştir. Farmakoterapinin davranışsal destekle birlikte verilmesi ve gerektiğinde kombinasyonların düşünülmesi önerilmektedir.</w:t>
-      </w:r>
-    </w:p>
-    <w:p>
-      <w:pPr>
-        <w:pStyle w:val="Balk2"/>
-        <w:spacing w:before="280" w:after="140"/>
-      </w:pPr>
-      <w:r>
-        <w:t xml:space="preserve">Slayt </w:t>
-      </w:r>
-      <w:r>
-        <w:t>6</w:t>
-      </w:r>
-      <w:r>
-        <w:t>: Amaç  (≈ 30 sn)</w:t>
-      </w:r>
-    </w:p>
-    <w:p>
-      <w:pPr>
-        <w:spacing w:after="140" w:line="300" w:lineRule="auto"/>
-        <w:jc w:val="both"/>
-      </w:pPr>
-      <w:r>
+        <w:spacing w:after="120"/>
+      </w:pPr>
+      <w:r>
+        <w:rPr/>
+        <w:t>Slayt 5: Tedavi seçenekleri  (≈ 1 dk)</w:t>
+      </w:r>
+    </w:p>
+    <w:p>
+      <w:pPr>
+        <w:spacing w:after="120"/>
+      </w:pPr>
+      <w:r>
+        <w:rPr/>
+        <w:t>Sigara bırakma tedavisi Onur hocamızın da dersinde anlattığı gibi davranışsal yaklaşımlar ve farmakoterapiden oluşmaktadır. Davranışsal tarafta Sağlık İnanç Modeli, Sağlık Kontrol Odağı, Yeniliklerin Yayılımı Modeli, Pender'in Sağlığı Geliştirme Modeli ve Transteorik Model gibi davranış değişikliği modelleri kullanılmaktadır.</w:t>
+      </w:r>
+    </w:p>
+    <w:p>
+      <w:pPr>
+        <w:spacing w:after="120"/>
+      </w:pPr>
+      <w:r>
+        <w:rPr/>
+        <w:t>Farmakoterapi nikotin yerine koyma tedavisi, bupropion ve vareniklinden oluşmaktadır. Sitizin de yine Onur hocamızın bahsettiği gibi son yıllarda ek bir seçenek olarak kullanıma girmiştir. Farmakoterapinin davranışsal destekle birlikte verilmesi ve gerektiğinde kombinasyonların düşünülmesi önerilmektedir.</w:t>
+      </w:r>
+    </w:p>
+    <w:p>
+      <w:pPr>
+        <w:pStyle w:val="Balk2"/>
+        <w:spacing w:after="120"/>
+      </w:pPr>
+      <w:r>
+        <w:rPr/>
+        <w:t>Slayt 6: Çalışmanın amacı  (≈ 30 sn)</w:t>
+      </w:r>
+    </w:p>
+    <w:p>
+      <w:pPr>
+        <w:spacing w:after="120"/>
+      </w:pPr>
+      <w:r>
+        <w:rPr/>
         <w:t>Çalışmanın amacı, kombine tedavinin ve yakın takibin sigara bırakma başarısı üzerindeki etkisini değerlendirmek ve bırakmayı etkileyen hasta özelliklerini belirlemektir.</w:t>
       </w:r>
     </w:p>
     <w:p>
       <w:pPr>
         <w:pStyle w:val="Balk2"/>
-        <w:spacing w:before="280" w:after="140"/>
-      </w:pPr>
-      <w:r>
-        <w:t xml:space="preserve">Slayt </w:t>
-      </w:r>
-      <w:r>
-        <w:t>7</w:t>
-      </w:r>
-      <w:r>
-        <w:t>: Tasarım ve örneklem  (≈ 1 dk)</w:t>
-      </w:r>
-    </w:p>
-    <w:p>
-      <w:pPr>
-        <w:spacing w:after="140" w:line="300" w:lineRule="auto"/>
-        <w:jc w:val="both"/>
-      </w:pPr>
-      <w:r>
+        <w:spacing w:after="120"/>
+      </w:pPr>
+      <w:r>
+        <w:rPr/>
+        <w:t>Slayt 7: Tasarım ve örneklem  (≈ 1 dk)</w:t>
+      </w:r>
+    </w:p>
+    <w:p>
+      <w:pPr>
+        <w:spacing w:after="120"/>
+      </w:pPr>
+      <w:r>
+        <w:rPr/>
         <w:t>Çalışma 1 Ağustos 2020 ile 31 Ağustos 2024 arasını kapsamaktadır. Polikliniğe başvuran, 18 yaş ve üzeri, sigara içen 432 hastanın dosyası taranmıştır.</w:t>
       </w:r>
     </w:p>
     <w:p>
       <w:pPr>
-        <w:spacing w:after="140" w:line="300" w:lineRule="auto"/>
-        <w:jc w:val="both"/>
-      </w:pPr>
-      <w:r>
+        <w:spacing w:after="120"/>
+      </w:pPr>
+      <w:r>
+        <w:rPr/>
         <w:t>Verilerine eksiksiz ulaşılan 399 hasta analize alınmıştır. Tüm kayıtlar kullanıldığından örneklem büyüklüğü hesaplanmamıştır. Yıllık kontrolüne gelmeyen hastaların takip bilgileri asistan hekimlerin yaptığı uzaktan görüşmelerle tamamlanmıştır.</w:t>
       </w:r>
     </w:p>
     <w:p>
       <w:pPr>
         <w:pStyle w:val="Balk2"/>
-        <w:spacing w:before="280" w:after="140"/>
-      </w:pPr>
-      <w:r>
-        <w:t xml:space="preserve">Slayt </w:t>
-      </w:r>
-      <w:r>
-        <w:t>8</w:t>
-      </w:r>
-      <w:r>
-        <w:t>: Veri toplama ve FNBT  (≈ 1 dk)</w:t>
-      </w:r>
-    </w:p>
-    <w:p>
-      <w:pPr>
-        <w:spacing w:after="140" w:line="300" w:lineRule="auto"/>
-        <w:jc w:val="both"/>
-      </w:pPr>
-      <w:r>
+        <w:spacing w:after="120"/>
+      </w:pPr>
+      <w:r>
+        <w:rPr/>
+        <w:t>Slayt 8: Veri toplama ve bağımlılık ölçümü  (≈ 1 dk)</w:t>
+      </w:r>
+    </w:p>
+    <w:p>
+      <w:pPr>
+        <w:spacing w:after="120"/>
+      </w:pPr>
+      <w:r>
+        <w:rPr/>
         <w:t>Hasta dosyalarından yaş, cinsiyet, meslek, alkol kullanımı, kronik hastalık, sigara öyküsü ve uygulanan tedaviler kaydedilmiştir.</w:t>
       </w:r>
     </w:p>
     <w:p>
       <w:pPr>
-        <w:spacing w:after="140" w:line="300" w:lineRule="auto"/>
-        <w:jc w:val="both"/>
-      </w:pPr>
-      <w:r>
-        <w:t>Nikotin bağımlılığı ilk vizitte Fagerström Nikotin Bağımlılık Testi ile değerlendirilmiştir. 0–2 puan düşük, 3–7 puan orta, 8–10 puan yüksek bağımlılık olarak sınıflanmıştır. Testin Türkçe geçerlik ve güvenilirlik çalışması 2004 yılında Uysal ve arkadaşları tarafından yapılmıştır.</w:t>
-      </w:r>
-    </w:p>
-    <w:p>
-      <w:pPr>
-        <w:pStyle w:val="Balk2"/>
-        <w:spacing w:before="280" w:after="140"/>
-      </w:pPr>
-      <w:r>
-        <w:t xml:space="preserve">Slayt </w:t>
-      </w:r>
-      <w:r>
-        <w:t>9</w:t>
-      </w:r>
-      <w:r>
-        <w:t>: Tedavi yaklaşımı  (≈ 1 dk)</w:t>
-      </w:r>
-    </w:p>
-    <w:p>
-      <w:pPr>
-        <w:spacing w:after="140" w:line="300" w:lineRule="auto"/>
-        <w:jc w:val="both"/>
-      </w:pPr>
-      <w:r>
-        <w:t>Tedavi FNBT puanı, kronik hastalıklar, kullanılan ilaçlar, kontrendikasyonlar ve hasta uyumuna göre bireyselleştirilmiştir.</w:t>
-      </w:r>
-    </w:p>
-    <w:p>
-      <w:pPr>
-        <w:spacing w:after="140" w:line="300" w:lineRule="auto"/>
-        <w:jc w:val="both"/>
-      </w:pPr>
-      <w:r>
+        <w:spacing w:after="120"/>
+      </w:pPr>
+      <w:r>
+        <w:rPr/>
+        <w:t>Nikotin bağımlılığı ilk vizitte Fagerström Nikotin Bağımlılık Testi ile değerlendirilmiştir. 0–2 puan düşük, 3–7 puan orta, 8–10 puan yüksek bağımlılık olarak sınıflanmıştır. Testin Türkçe geçerlik ve güvenilirlik çalışmasının 2004 yılında Uysal ve arkadaşları tarafından yapıldığı da makalede belirtilmiştir.</w:t>
+      </w:r>
+    </w:p>
+    <w:p>
+      <w:pPr>
+        <w:pStyle w:val="Balk2"/>
+        <w:spacing w:after="120"/>
+      </w:pPr>
+      <w:r>
+        <w:rPr/>
+        <w:t>Slayt 9: Tedavi yaklaşımı  (≈ 1 dk)</w:t>
+      </w:r>
+    </w:p>
+    <w:p>
+      <w:pPr>
+        <w:spacing w:after="120"/>
+      </w:pPr>
+      <w:r>
+        <w:rPr/>
+        <w:t>Tedavi FNBT (Fagerström Nikotin Bağımlılık Testi) puanı, kronik hastalıklar, kullanılan ilaçlar, kontrendikasyonlar ve hasta uyumuna göre bireyselleştirilmiştir.</w:t>
+      </w:r>
+    </w:p>
+    <w:p>
+      <w:pPr>
+        <w:spacing w:after="120"/>
+      </w:pPr>
+      <w:r>
+        <w:rPr/>
         <w:t>Hastalara yalnızca davranışsal tedavi, monoterapi ya da kombine tedavi uygulanmıştır. Kombine tedavi seçenekleri bupropion ile NRT, vareniklin ile NRT, sitizin ile NRT ve üçlü tedavidir. Sağlık Bakanlığı politikaları doğrultusunda NRT ve sitizin belirli dönemlerde ücretsiz sağlanmıştır.</w:t>
       </w:r>
     </w:p>
     <w:p>
       <w:pPr>
         <w:pStyle w:val="Balk2"/>
-        <w:spacing w:before="280" w:after="140"/>
-      </w:pPr>
-      <w:r>
-        <w:lastRenderedPageBreak/>
-        <w:t>Slayt 1</w:t>
-      </w:r>
-      <w:r>
-        <w:t>0</w:t>
-      </w:r>
-      <w:r>
-        <w:t>: İstatistiksel analiz  (≈ 1 dk)</w:t>
-      </w:r>
-    </w:p>
-    <w:p>
-      <w:pPr>
-        <w:spacing w:after="140" w:line="300" w:lineRule="auto"/>
-        <w:jc w:val="both"/>
-      </w:pPr>
-      <w:r>
+        <w:spacing w:after="120"/>
+      </w:pPr>
+      <w:r>
+        <w:rPr/>
+        <w:t>Slayt 10: İstatistiksel analiz  (≈ 45 sn)</w:t>
+      </w:r>
+    </w:p>
+    <w:p>
+      <w:pPr>
+        <w:spacing w:after="120"/>
+      </w:pPr>
+      <w:r>
+        <w:rPr/>
         <w:t>Analizler SPSS 25 ile yapılmıştır. Normallik histogram ve Kolmogorov–Smirnov testiyle değerlendirilmiştir.</w:t>
       </w:r>
     </w:p>
     <w:p>
       <w:pPr>
-        <w:spacing w:after="140" w:line="300" w:lineRule="auto"/>
-        <w:jc w:val="both"/>
-      </w:pPr>
-      <w:r>
+        <w:spacing w:after="120"/>
+      </w:pPr>
+      <w:r>
+        <w:rPr/>
         <w:t>Kategorik değişkenler ki-kare testiyle, iki grup karşılaştırmaları Mann–Whitney U, ikiden fazla grup karşılaştırmaları Kruskal–Wallis testiyle yapılmıştır. Post-hoc karşılaştırmalarda Duncan testi kullanılmıştır.</w:t>
       </w:r>
     </w:p>
     <w:p>
       <w:pPr>
-        <w:spacing w:after="140" w:line="300" w:lineRule="auto"/>
-        <w:jc w:val="both"/>
-      </w:pPr>
-      <w:r>
+        <w:spacing w:after="120"/>
+      </w:pPr>
+      <w:r>
+        <w:rPr/>
         <w:t>Tedavi yöntemlerinin bırakma üzerindeki etkisi ikili lojistik regresyonla değerlendirilmiş ve Bonferroni düzeltmesi uygulanmıştır.</w:t>
       </w:r>
     </w:p>
     <w:p>
       <w:pPr>
         <w:pStyle w:val="Balk2"/>
-        <w:spacing w:before="280" w:after="140"/>
-      </w:pPr>
-      <w:r>
-        <w:t>Slayt 1</w:t>
-      </w:r>
-      <w:r>
-        <w:t>1</w:t>
-      </w:r>
-      <w:r>
-        <w:t>: Katılımcıların genel özellikleri  (≈ 1 dk)</w:t>
-      </w:r>
-    </w:p>
-    <w:p>
-      <w:pPr>
-        <w:spacing w:after="140" w:line="300" w:lineRule="auto"/>
-        <w:jc w:val="both"/>
-      </w:pPr>
-      <w:r>
-        <w:t>Bulgulara geçiyorum. Analize 399 hasta alınmıştır. Yaş ortalaması 44,7 yıldır ve hastaların yüzde 63,7'si erkektir.</w:t>
-      </w:r>
-    </w:p>
-    <w:p>
-      <w:pPr>
-        <w:spacing w:after="140" w:line="300" w:lineRule="auto"/>
-        <w:jc w:val="both"/>
-      </w:pPr>
-      <w:r>
-        <w:t>Ortalama FNBT puanı 5,66, ortalama tüketim 27,4 paket-yıl, hasta başına ortalama görüşme sayısı 2,21'dir. Hastaların yüzde 34,1'i, yani yaklaşık üçte biri sigarayı bırakmıştır.</w:t>
-      </w:r>
-    </w:p>
-    <w:p>
-      <w:pPr>
-        <w:pStyle w:val="Balk2"/>
-        <w:spacing w:before="280" w:after="140"/>
-      </w:pPr>
-      <w:r>
-        <w:t>Slayt 1</w:t>
-      </w:r>
-      <w:r>
-        <w:t>2</w:t>
-      </w:r>
-      <w:r>
-        <w:t>: Bağımlılık düzeyi ve deneme öyküsü  (≈ 1 dk)</w:t>
-      </w:r>
-    </w:p>
-    <w:p>
-      <w:pPr>
-        <w:spacing w:after="140" w:line="300" w:lineRule="auto"/>
-        <w:jc w:val="both"/>
-      </w:pPr>
-      <w:r>
-        <w:t>FNBT puanlarına göre hastaların yüzde 13,2'si düşük, yüzde 61,3'ü orta, yüzde 25,5'i yüksek bağımlılık düzeyindedir.</w:t>
-      </w:r>
-    </w:p>
-    <w:p>
-      <w:pPr>
-        <w:spacing w:after="140" w:line="300" w:lineRule="auto"/>
-        <w:jc w:val="both"/>
-      </w:pPr>
-      <w:r>
-        <w:t>Hastaların yüzde 75,7'si daha önce sigarayı bırakmayı denemiş ve bunların yaklaşık yarısı bu denemede profesyonel destek almıştır. Yüzde 7,2'si sigara dışında elektronik sigara, nargile veya puro gibi tütün ürünleri kullanmaktadır.</w:t>
-      </w:r>
-    </w:p>
-    <w:p>
-      <w:pPr>
-        <w:pStyle w:val="Balk2"/>
-        <w:spacing w:before="280" w:after="140"/>
-      </w:pPr>
-      <w:r>
-        <w:t>Slayt 1</w:t>
-      </w:r>
-      <w:r>
-        <w:t>3</w:t>
-      </w:r>
-      <w:r>
-        <w:t>: Tablo 1: Sosyodemografik özellikler  (≈ 1 dk)</w:t>
-      </w:r>
-    </w:p>
-    <w:p>
-      <w:pPr>
-        <w:spacing w:after="140" w:line="300" w:lineRule="auto"/>
-        <w:jc w:val="both"/>
-      </w:pPr>
-      <w:r>
-        <w:t>Tablo 1'de katılımcıların sosyodemografik özellikleri yer almaktadır. En kalabalık yaş grubu yüzde 45,6 ile 26–44 yaş grubudur. Hastaların yüzde 82'si evlidir ve yüzde 43'ü yükseköğretim mezunudur.</w:t>
-      </w:r>
-    </w:p>
-    <w:p>
-      <w:pPr>
-        <w:spacing w:after="140" w:line="300" w:lineRule="auto"/>
-        <w:jc w:val="both"/>
-      </w:pPr>
-      <w:r>
-        <w:t>Hastaların yüzde 86'sı il merkezinde yaşamaktadır. Yüzde 39,6'sının hanesinde sigara içen başka biri bulunmaktadır.</w:t>
-      </w:r>
-    </w:p>
-    <w:p>
-      <w:pPr>
-        <w:pStyle w:val="Balk2"/>
-        <w:spacing w:before="280" w:after="140"/>
-      </w:pPr>
-      <w:r>
-        <w:t>Slayt 1</w:t>
-      </w:r>
-      <w:r>
-        <w:t>4</w:t>
-      </w:r>
-      <w:r>
-        <w:t>: Tablo 2: Sosyodemografik özellikler ve bırakma (1)  (≈ 1 dk)</w:t>
-      </w:r>
-    </w:p>
-    <w:p>
-      <w:pPr>
-        <w:spacing w:after="140" w:line="300" w:lineRule="auto"/>
-        <w:jc w:val="both"/>
-      </w:pPr>
-      <w:r>
-        <w:t xml:space="preserve">Tablo 2'de sosyodemografik özelliklere göre bırakma durumu karşılaştırılmıştır. </w:t>
-      </w:r>
-      <w:r>
-        <w:t xml:space="preserve">Bu tablo aslında uzun bir tablo </w:t>
-      </w:r>
-      <w:r>
-        <w:t xml:space="preserve">ikiye böldüm yarısı diğer slaytta. </w:t>
-      </w:r>
-      <w:r>
-        <w:t>Tablonun ilk bölümünde cinsiyet, yaş grubu, medeni durum ve eğitim durumu yer almaktadır.</w:t>
-      </w:r>
-    </w:p>
-    <w:p>
-      <w:pPr>
-        <w:spacing w:after="140" w:line="300" w:lineRule="auto"/>
-        <w:jc w:val="both"/>
-      </w:pPr>
-      <w:r>
+        <w:spacing w:after="120"/>
+      </w:pPr>
+      <w:r>
+        <w:rPr/>
+        <w:t>Slayt 11: Katılımcıların genel özellikleri  (≈ 45 sn)</w:t>
+      </w:r>
+    </w:p>
+    <w:p>
+      <w:pPr>
+        <w:spacing w:after="120"/>
+      </w:pPr>
+      <w:r>
+        <w:rPr/>
+        <w:t>Bulgulara geçiyorum. Analize 399 hasta alınmıştır. Yaş ortalaması 44,69 yıldır ve hastaların yüzde 63,66'sı erkektir.</w:t>
+      </w:r>
+    </w:p>
+    <w:p>
+      <w:pPr>
+        <w:spacing w:after="120"/>
+      </w:pPr>
+      <w:r>
+        <w:rPr/>
+        <w:t>Ortalama FNBT (Fagerström Nikotin Bağımlılık Testi) puanı 5,66, ortalama tüketim 27,38 paket-yıl, hasta başına ortalama görüşme sayısı 2,21'dir. Hastaların yüzde 34,09'u, yani yaklaşık üçte biri sigarayı bırakmıştır.</w:t>
+      </w:r>
+    </w:p>
+    <w:p>
+      <w:pPr>
+        <w:pStyle w:val="Balk2"/>
+        <w:spacing w:after="120"/>
+      </w:pPr>
+      <w:r>
+        <w:rPr/>
+        <w:t>Slayt 12: Bağımlılık düzeyi ve deneme öyküsü  (≈ 45 sn)</w:t>
+      </w:r>
+    </w:p>
+    <w:p>
+      <w:pPr>
+        <w:spacing w:after="120"/>
+      </w:pPr>
+      <w:r>
+        <w:rPr/>
+        <w:t>FNBT (Fagerström Nikotin Bağımlılık Testi) puanlarına göre hastaların yüzde 13,19'u düşük, yüzde 61,34'ü orta, yüzde 25,46'sı yüksek bağımlılık düzeyindedir.</w:t>
+      </w:r>
+    </w:p>
+    <w:p>
+      <w:pPr>
+        <w:spacing w:after="120"/>
+      </w:pPr>
+      <w:r>
+        <w:rPr/>
+        <w:t>Hastaların yüzde 75,69'u daha önce sigarayı bırakmayı denemiş ve bunların yaklaşık yarısı bu denemede profesyonel destek almıştır. Yüzde 7,19'u sigara dışında elektronik sigara, nargile veya puro gibi tütün ürünleri kullanmaktadır.</w:t>
+      </w:r>
+    </w:p>
+    <w:p>
+      <w:pPr>
+        <w:pStyle w:val="Balk2"/>
+        <w:spacing w:after="120"/>
+      </w:pPr>
+      <w:r>
+        <w:rPr/>
+        <w:t>Slayt 13: Sosyodemografik özellikler (Tablo 1)  (≈ 45 sn)</w:t>
+      </w:r>
+    </w:p>
+    <w:p>
+      <w:pPr>
+        <w:spacing w:after="120"/>
+      </w:pPr>
+      <w:r>
+        <w:rPr/>
+        <w:t>Tabloda katılımcıların sosyodemografik özellikleri yer almaktadır. En kalabalık yaş grubu yüzde 45,61 ile 26–44 yaş grubudur. Hastaların yüzde 81,96'sı evlidir ve yüzde 43,36'sı yükseköğretim mezunudur.</w:t>
+      </w:r>
+    </w:p>
+    <w:p>
+      <w:pPr>
+        <w:spacing w:after="120"/>
+      </w:pPr>
+      <w:r>
+        <w:rPr/>
+        <w:t>Hastaların yüzde 85,96'sı il merkezinde yaşamaktadır. Yüzde 39,6'sının hanesinde sigara içen başka biri bulunmaktadır.</w:t>
+      </w:r>
+    </w:p>
+    <w:p>
+      <w:pPr>
+        <w:pStyle w:val="Balk2"/>
+        <w:spacing w:after="120"/>
+      </w:pPr>
+      <w:r>
+        <w:rPr/>
+        <w:t>Slayt 14: Sosyodemografik özelliklere göre bırakma (Tablo 2, birinci bölüm)  (≈ 45 sn)</w:t>
+      </w:r>
+    </w:p>
+    <w:p>
+      <w:pPr>
+        <w:spacing w:after="120"/>
+      </w:pPr>
+      <w:r>
+        <w:rPr/>
+        <w:t>Bu tabloda sosyodemografik özelliklere göre bırakma durumu karşılaştırılmıştır. Tablo uzun olduğu için iki slayta bölünmüştür; ikinci bölümü bir sonraki slayttadır. Tablonun ilk bölümünde cinsiyet, yaş grubu, medeni durum ve eğitim durumu yer almaktadır.</w:t>
+      </w:r>
+    </w:p>
+    <w:p>
+      <w:pPr>
+        <w:spacing w:after="120"/>
+      </w:pPr>
+      <w:r>
+        <w:rPr/>
         <w:t>Bu değişkenlerin hiçbirinde başarılı ve başarısız gruplar arasında anlamlı fark bulunmamıştır.</w:t>
       </w:r>
     </w:p>
     <w:p>
       <w:pPr>
         <w:pStyle w:val="Balk2"/>
-        <w:spacing w:before="280" w:after="140"/>
-      </w:pPr>
-      <w:r>
-        <w:t>Slayt 1</w:t>
-      </w:r>
-      <w:r>
-        <w:t>5</w:t>
-      </w:r>
-      <w:r>
-        <w:t>: Tablo 2: Sosyodemografik özellikler ve bırakma (2)  (≈ 1 dk)</w:t>
-      </w:r>
-    </w:p>
-    <w:p>
-      <w:pPr>
-        <w:spacing w:after="140" w:line="300" w:lineRule="auto"/>
-        <w:jc w:val="both"/>
-      </w:pPr>
-      <w:r>
+        <w:spacing w:after="120"/>
+      </w:pPr>
+      <w:r>
+        <w:rPr/>
+        <w:t>Slayt 15: Sosyodemografik özelliklere göre bırakma (Tablo 2, devam)  (≈ 45 sn)</w:t>
+      </w:r>
+    </w:p>
+    <w:p>
+      <w:pPr>
+        <w:spacing w:after="120"/>
+      </w:pPr>
+      <w:r>
+        <w:rPr/>
         <w:t>Tablonun ikinci bölümünde yerleşim yeri, çalışma durumu, hanede başka sigara içen varlığı ve alkol kullanımı yer almaktadır.</w:t>
       </w:r>
     </w:p>
     <w:p>
       <w:pPr>
-        <w:spacing w:after="140" w:line="300" w:lineRule="auto"/>
-        <w:jc w:val="both"/>
-      </w:pPr>
-      <w:r>
-        <w:lastRenderedPageBreak/>
-        <w:t>Anlamlı fark yalnızca hanede başka sigara içen varlığında bulunmuştur. Hanesinde sigara içen olmayanların yüzde 39,8'i, olanların yüzde 25,3'ü sigarayı bırakmıştır; p değeri 0,003'tür.</w:t>
-      </w:r>
-    </w:p>
-    <w:p>
-      <w:pPr>
-        <w:pStyle w:val="Balk2"/>
-        <w:spacing w:before="280" w:after="140"/>
-      </w:pPr>
-      <w:r>
-        <w:t>Slayt 1</w:t>
-      </w:r>
-      <w:r>
-        <w:t>6</w:t>
-      </w:r>
-      <w:r>
-        <w:t>: Tablo 3: Tedavi seçenekleri  (≈ 1 dk)</w:t>
-      </w:r>
-    </w:p>
-    <w:p>
-      <w:pPr>
-        <w:spacing w:after="140" w:line="300" w:lineRule="auto"/>
-        <w:jc w:val="both"/>
-      </w:pPr>
-      <w:r>
-        <w:t>Tablo 3'te uygulanan tedaviler görülmektedir. En sık uygulanan yöntem 141 hasta ile kombine tedavidir. Bunu 109 hasta ile bupropion ve 80 hasta ile NRT monoterapisi izlemektedir.</w:t>
-      </w:r>
-    </w:p>
-    <w:p>
-      <w:pPr>
-        <w:spacing w:after="140" w:line="300" w:lineRule="auto"/>
-        <w:jc w:val="both"/>
-      </w:pPr>
-      <w:r>
-        <w:t>Kombine tedavi alan hastaların 125'i bupropion ile NRT almıştır. Vareniklin 18, sitizin 34 hastada tek başına kullanılmış; 17 hastaya yalnızca farmakolojik olmayan tedavi uygulanmıştır.</w:t>
-      </w:r>
-    </w:p>
-    <w:p>
-      <w:pPr>
-        <w:pStyle w:val="Balk2"/>
-        <w:spacing w:before="280" w:after="140"/>
-      </w:pPr>
-      <w:r>
-        <w:t>Slayt 1</w:t>
-      </w:r>
-      <w:r>
-        <w:t>7</w:t>
-      </w:r>
-      <w:r>
-        <w:t>: Tablo 4: Görüşme sayısı, FNBT ve paket-yıl  (≈ 1 dk)</w:t>
-      </w:r>
-    </w:p>
-    <w:p>
-      <w:pPr>
-        <w:spacing w:after="140" w:line="300" w:lineRule="auto"/>
-        <w:jc w:val="both"/>
-      </w:pPr>
-      <w:r>
-        <w:t>Tablo 4'te sürekli değişkenler bırakma durumuna göre karşılaştırılmıştır. Sigarayı bırakanlar ortalama 2,83 kez, bırakamayanlar 1,96 kez görüşmeye gelmiştir; fark anlamlıdır, p&lt;0,001.</w:t>
-      </w:r>
-    </w:p>
-    <w:p>
-      <w:pPr>
-        <w:spacing w:after="140" w:line="300" w:lineRule="auto"/>
-        <w:jc w:val="both"/>
-      </w:pPr>
-      <w:r>
-        <w:t>Bırakanların FNBT puanı daha düşüktür: 5,26'ya karşı 5,85; p değeri 0,024'tür. Paket-yıl açısından iki grup arasında anlamlı fark bulunmamıştır.</w:t>
-      </w:r>
-    </w:p>
-    <w:p>
-      <w:pPr>
-        <w:pStyle w:val="Balk2"/>
-        <w:spacing w:before="280" w:after="140"/>
-      </w:pPr>
-      <w:r>
-        <w:t>Slayt 1</w:t>
-      </w:r>
-      <w:r>
-        <w:t>8</w:t>
-      </w:r>
-      <w:r>
-        <w:t>: Tablo 5: Tedaviye göre bırakma  (≈ 1 dk 30 sn)</w:t>
-      </w:r>
-    </w:p>
-    <w:p>
-      <w:pPr>
-        <w:spacing w:after="140" w:line="300" w:lineRule="auto"/>
-        <w:jc w:val="both"/>
-      </w:pPr>
-      <w:r>
-        <w:t>Tablo 5'te tedavi yöntemlerine göre bırakma oranları yer almaktadır. Makalede en yüksek bırakma oranının yüzde 44,0 ile kombine tedavi grubunda olduğu ve kombine tedavinin diğer tüm seçeneklerden anlamlı derecede üstün olduğu bildirilmektedir.</w:t>
-      </w:r>
-    </w:p>
-    <w:p>
-      <w:pPr>
-        <w:spacing w:after="140" w:line="300" w:lineRule="auto"/>
-        <w:jc w:val="both"/>
-      </w:pPr>
-      <w:r>
-        <w:t>NRT grubunda oran yüzde 37,5, sitizin ve yalnızca davranışsal tedavi gruplarında yüzde 35,3'tür. En düşük oran yüzde 16,5 ile bupropion monoterapisindedir. Gruplar arasındaki fark anlamlıdır, p&lt;0,001.</w:t>
-      </w:r>
-    </w:p>
-    <w:p>
-      <w:pPr>
-        <w:pStyle w:val="Balk2"/>
-        <w:spacing w:before="280" w:after="140"/>
-      </w:pPr>
-      <w:r>
-        <w:t>Slayt 19: Tablo 6: Lojistik regresyon  (≈ 1 dk 30 sn)</w:t>
-      </w:r>
-    </w:p>
-    <w:p>
-      <w:pPr>
-        <w:spacing w:after="140" w:line="300" w:lineRule="auto"/>
-        <w:jc w:val="both"/>
-      </w:pPr>
-      <w:r>
-        <w:t>Tablo 6'da lojistik regresyon sonuçları görülmektedir. Referans grup bupropion monoterapisidir ve Exp(B) sütunu odds oranını vermektedir.</w:t>
-      </w:r>
-    </w:p>
-    <w:p>
-      <w:pPr>
-        <w:spacing w:after="140" w:line="300" w:lineRule="auto"/>
-        <w:jc w:val="both"/>
-      </w:pPr>
-      <w:r>
+        <w:spacing w:after="120"/>
+      </w:pPr>
+      <w:r>
+        <w:rPr/>
+        <w:t>Anlamlı fark yalnızca hanede başka sigara içen varlığında bulunmuştur. Hanesinde sigara içen biri olmayanların yüzde 39,8'i, olanların yüzde 25,3'ü sigarayı bırakmıştır; p değeri 0,003'tür.</w:t>
+      </w:r>
+    </w:p>
+    <w:p>
+      <w:pPr>
+        <w:pStyle w:val="Balk2"/>
+        <w:spacing w:after="120"/>
+      </w:pPr>
+      <w:r>
+        <w:rPr/>
+        <w:t>Slayt 16: Kullanılan tedavi seçenekleri (Tablo 3)  (≈ 45 sn)</w:t>
+      </w:r>
+    </w:p>
+    <w:p>
+      <w:pPr>
+        <w:spacing w:after="120"/>
+      </w:pPr>
+      <w:r>
+        <w:rPr/>
+        <w:t>Tabloda uygulanan tedaviler görülmektedir. En sık uygulanan yöntem 141 hasta ile kombine tedavidir. Bunu 109 hasta ile bupropion ve 80 hasta ile NRT monoterapisi izlemektedir.</w:t>
+      </w:r>
+    </w:p>
+    <w:p>
+      <w:pPr>
+        <w:spacing w:after="120"/>
+      </w:pPr>
+      <w:r>
+        <w:rPr/>
+        <w:t>Kombine tedavi alan hastaların 125'i bupropion ile NRT almıştır. Vareniklin 18, sitizin 34 hastada tek başına kullanılmış; 17 hastaya yalnızca non-farmakolojik (davranışsal) tedavi uygulanmıştır.</w:t>
+      </w:r>
+    </w:p>
+    <w:p>
+      <w:pPr>
+        <w:pStyle w:val="Balk2"/>
+        <w:spacing w:after="120"/>
+      </w:pPr>
+      <w:r>
+        <w:rPr/>
+        <w:t>Slayt 17: Görüşme sayısı, FNBT ve paket-yıl (Tablo 4)  (≈ 45 sn)</w:t>
+      </w:r>
+    </w:p>
+    <w:p>
+      <w:pPr>
+        <w:spacing w:after="120"/>
+      </w:pPr>
+      <w:r>
+        <w:rPr/>
+        <w:t>Bu tabloda sigara içme ve tedaviye ilişkin bazı parametreler sigara bırakma durumu ile karşılaştırılmıştır. Sigarayı bırakanlar ortalama 2,83 kez, bırakamayanlar 1,96 kez görüşmeye gelmiştir; fark anlamlıdır, p&lt;0,001.</w:t>
+      </w:r>
+    </w:p>
+    <w:p>
+      <w:pPr>
+        <w:spacing w:after="120"/>
+      </w:pPr>
+      <w:r>
+        <w:rPr/>
+        <w:t>Bırakanların FNBT (Fagerström Nikotin Bağımlılık Testi) puanı daha düşüktür: 5,26'ya karşı 5,85; p değeri 0,024'tür.</w:t>
+      </w:r>
+    </w:p>
+    <w:p>
+      <w:pPr>
+        <w:spacing w:after="120"/>
+      </w:pPr>
+      <w:r>
+        <w:rPr/>
+        <w:t>Paket-yıl açısından iki grup arasında anlamlı fark bulunmamıştır.</w:t>
+      </w:r>
+    </w:p>
+    <w:p>
+      <w:pPr>
+        <w:pStyle w:val="Balk2"/>
+        <w:spacing w:after="120"/>
+      </w:pPr>
+      <w:r>
+        <w:rPr/>
+        <w:t>Slayt 18: Tedavi yöntemine göre bırakma (Tablo 5)  (≈ 1 dk)</w:t>
+      </w:r>
+    </w:p>
+    <w:p>
+      <w:pPr>
+        <w:spacing w:after="120"/>
+      </w:pPr>
+      <w:r>
+        <w:rPr/>
+        <w:t>Bu tabloda tedavi yöntemlerine göre bırakma oranları yer almaktadır. Makalede en yüksek bırakma oranının yüzde 43,98 ile kombine tedavi grubunda olduğu ve kombine tedavinin diğer tüm seçeneklerden anlamlı derecede üstün olduğu bildirilmektedir.</w:t>
+      </w:r>
+    </w:p>
+    <w:p>
+      <w:pPr>
+        <w:spacing w:after="120"/>
+      </w:pPr>
+      <w:r>
+        <w:rPr/>
+        <w:t>NRT grubunda oran yüzde 37,5, sitizin ve yalnızca davranışsal tedavi gruplarında yüzde 35,3'tür. En düşük oran yüzde 16,52 ile bupropion monoterapisindedir. Gruplar arasındaki fark anlamlıdır, p&lt;0,001.</w:t>
+      </w:r>
+    </w:p>
+    <w:p>
+      <w:pPr>
+        <w:pStyle w:val="Balk2"/>
+        <w:spacing w:after="120"/>
+      </w:pPr>
+      <w:r>
+        <w:rPr/>
+        <w:t>Slayt 19: Lojistik regresyon (Tablo 6)  (≈ 1 dk 15 sn)</w:t>
+      </w:r>
+    </w:p>
+    <w:p>
+      <w:pPr>
+        <w:spacing w:after="120"/>
+      </w:pPr>
+      <w:r>
+        <w:rPr/>
+        <w:t>Burada lojistik regresyon sonuçları görülmektedir. Referans grup bupropion monoterapisidir ve Exp(B) sütunu odds oranını vermektedir.</w:t>
+      </w:r>
+    </w:p>
+    <w:p>
+      <w:pPr>
+        <w:spacing w:after="120"/>
+      </w:pPr>
+      <w:r>
+        <w:rPr/>
         <w:t>Bupropiona göre bırakma olasılığı vareniklinde 4,0, kombine tedavide 4,0, NRT'de 3,0, sitizinde 2,8 kat yüksektir. Farmakolojik tedavi almayanlarda görülen 2,8 katlık fark anlamlı değildir.</w:t>
       </w:r>
     </w:p>
     <w:p>
       <w:pPr>
-        <w:spacing w:after="140" w:line="300" w:lineRule="auto"/>
-        <w:jc w:val="both"/>
-      </w:pPr>
-      <w:r>
-        <w:t>Hanede sigara içen olmaması bırakma olasılığını yaklaşık iki katına, sigaraya bağlı yakınma olmaması 1,6 katına çıkarmaktadır. Ayrıca FNBT puanının bırakma başarısının negatif bir öngörücüsü olduğu bildirilmektedir.</w:t>
-      </w:r>
-    </w:p>
-    <w:p>
-      <w:pPr>
-        <w:pStyle w:val="Balk2"/>
-        <w:spacing w:before="280" w:after="140"/>
-      </w:pPr>
-      <w:r>
-        <w:t>Slayt 20: Tartışma: tedaviler  (≈ 1 dk 30 sn)</w:t>
-      </w:r>
-    </w:p>
-    <w:p>
-      <w:pPr>
-        <w:spacing w:after="140" w:line="300" w:lineRule="auto"/>
-        <w:jc w:val="both"/>
-      </w:pPr>
-      <w:r>
+        <w:spacing w:after="120"/>
+      </w:pPr>
+      <w:r>
+        <w:rPr/>
+        <w:t>Hanede sigara içen olmaması bırakma olasılığını yaklaşık iki katına, sigaraya bağlı yakınma olmaması 1,6 katına çıkarmaktadır.</w:t>
+      </w:r>
+    </w:p>
+    <w:p>
+      <w:pPr>
+        <w:pStyle w:val="Balk2"/>
+        <w:spacing w:after="120"/>
+      </w:pPr>
+      <w:r>
+        <w:rPr/>
+        <w:t>Slayt 20: Tartışma: tedaviler ve literatür  (≈ 1 dk)</w:t>
+      </w:r>
+    </w:p>
+    <w:p>
+      <w:pPr>
+        <w:spacing w:after="120"/>
+      </w:pPr>
+      <w:r>
+        <w:rPr/>
         <w:t>Makalede bulgular literatürle karşılaştırılmaktadır. Vareniklinin bupropiona üstünlüğü büyük ölçekli meta-analizler ve randomize kontrollü çalışmalarla uyumludur. Bu üstünlüğün, vareniklinin α4β2 nikotinik reseptördeki parsiyel agonist etkisiyle ilişkili olduğu düşünülmektedir.</w:t>
       </w:r>
     </w:p>
     <w:p>
       <w:pPr>
-        <w:spacing w:after="140" w:line="300" w:lineRule="auto"/>
-        <w:jc w:val="both"/>
-      </w:pPr>
-      <w:r>
-        <w:lastRenderedPageBreak/>
-        <w:t>Sitizin vareniklinle benzer mekanizmaya sahip, maliyet-etkin bir seçenektir; plaseboya üstün ve NRT ile benzer etkinlikte bulunmuştur. Kombine tedavinin üstünlüğü, monoterapi yetersiz kaldığında kombinasyon öneren kılavuzlarla uyumludur.</w:t>
-      </w:r>
-    </w:p>
-    <w:p>
-      <w:pPr>
-        <w:spacing w:after="140" w:line="300" w:lineRule="auto"/>
-        <w:jc w:val="both"/>
-      </w:pPr>
-      <w:r>
+        <w:spacing w:after="120"/>
+      </w:pPr>
+      <w:r>
+        <w:rPr/>
+        <w:t>Sitizin vareniklinle benzer mekanizmaya sahip, maliyet-etkin bir seçenektir; plaseboya üstün ve NRT ile benzer etkinlikte bulunmuştur.</w:t>
+      </w:r>
+    </w:p>
+    <w:p>
+      <w:pPr>
+        <w:spacing w:after="120"/>
+      </w:pPr>
+      <w:r>
+        <w:rPr/>
+        <w:t>Kombine tedavinin üstünlüğü, monoterapi yetersiz kaldığında kombinasyon öneren kılavuzlarla uyumludur.</w:t>
+      </w:r>
+    </w:p>
+    <w:p>
+      <w:pPr>
+        <w:spacing w:after="120"/>
+      </w:pPr>
+      <w:r>
+        <w:rPr/>
         <w:t>Benli ve arkadaşlarının çalışmasında da vareniklin ilk altı ayda bupropiondan daha yüksek bırakma oranı sağlamıştır.</w:t>
       </w:r>
     </w:p>
     <w:p>
       <w:pPr>
         <w:pStyle w:val="Balk2"/>
-        <w:spacing w:before="280" w:after="140"/>
-      </w:pPr>
-      <w:r>
-        <w:t>Slayt 21: Tartışma: başarıyı etkileyen faktörler  (≈ 1 dk 30 sn)</w:t>
-      </w:r>
-    </w:p>
-    <w:p>
-      <w:pPr>
-        <w:spacing w:after="140" w:line="300" w:lineRule="auto"/>
-        <w:jc w:val="both"/>
-      </w:pPr>
-      <w:r>
+        <w:spacing w:after="120"/>
+      </w:pPr>
+      <w:r>
+        <w:rPr/>
+        <w:t>Slayt 21: Tartışma: başarıyı etkileyen faktörler  (≈ 1 dk 15 sn)</w:t>
+      </w:r>
+    </w:p>
+    <w:p>
+      <w:pPr>
+        <w:spacing w:after="120"/>
+      </w:pPr>
+      <w:r>
+        <w:rPr/>
         <w:t>Makalede davranışsal desteğin önemi vurgulanmaktadır: Daha fazla görüşmeye gelen hastalarda bırakma oranı daha yüksektir.</w:t>
       </w:r>
     </w:p>
     <w:p>
       <w:pPr>
-        <w:spacing w:after="140" w:line="300" w:lineRule="auto"/>
-        <w:jc w:val="both"/>
-      </w:pPr>
-      <w:r>
+        <w:spacing w:after="120"/>
+      </w:pPr>
+      <w:r>
+        <w:rPr/>
         <w:t>Hanede sigara içen olmaması bırakma olasılığını neredeyse iki katına çıkarmaktadır. Literatürde eşin veya aile bireylerinin sigara içmesi hem tetikleyici hem de motivasyon engeli olarak tanımlanmaktadır.</w:t>
       </w:r>
     </w:p>
     <w:p>
       <w:pPr>
-        <w:spacing w:after="140" w:line="300" w:lineRule="auto"/>
-        <w:jc w:val="both"/>
-      </w:pPr>
-      <w:r>
-        <w:t>Hastaların ortalama FNBT puanı, tedavi arayan sigara içicilerinde bildirilen yaklaşık 5 puanla uyumludur ve yüksek puan düşük başarıyla ilişkilidir. Yakınması olmayan hastalarda başarının daha yüksek olması uzun vadeli sağlığı korumaya yönelik içsel motivasyonla açıklanmaktadır. İkinci bir olasılık olarak, kronik hastalığı veya semptomu olan bireylerin sigarayı bir baş etme aracı olarak kullanıyor olabileceği ve bunun bırakmayı zorlaştırabileceği belirtilmektedir.</w:t>
-      </w:r>
-    </w:p>
-    <w:p>
-      <w:pPr>
-        <w:pStyle w:val="Balk2"/>
-        <w:spacing w:before="280" w:after="140"/>
-      </w:pPr>
-      <w:r>
-        <w:t>Slayt 22: Kısıtlılıklar ve güçlü yönler  (≈ 1 dk)</w:t>
-      </w:r>
-    </w:p>
-    <w:p>
-      <w:pPr>
-        <w:spacing w:after="140" w:line="300" w:lineRule="auto"/>
-        <w:jc w:val="both"/>
-      </w:pPr>
-      <w:r>
+        <w:spacing w:after="120"/>
+      </w:pPr>
+      <w:r>
+        <w:rPr/>
+        <w:t>Hastaların ortalama FNBT (Fagerström Nikotin Bağımlılık Testi) puanı, tedavi arayan sigara içicilerinde bildirilen yaklaşık 5 puanla uyumludur ve yüksek puan düşük başarıyla ilişkilidir.</w:t>
+      </w:r>
+    </w:p>
+    <w:p>
+      <w:pPr>
+        <w:spacing w:after="120"/>
+      </w:pPr>
+      <w:r>
+        <w:rPr/>
+        <w:t>Yakınması olmayan hastalarda başarının daha yüksek olması, bu bireylerin anlık tepkisel korkudan ziyade uzun vadeli sağlığı koruma amacıyla içsel bir bırakma motivasyonuna sahip olabilmeleriyle açıklanmaktadır. İkinci bir olasılık olarak, kronik hastalığı veya semptomu olan bireylerin sigarayı bir baş etme aracı olarak kullanıyor olabileceği ve bunun bırakmayı zorlaştırabileceği belirtilmektedir.</w:t>
+      </w:r>
+    </w:p>
+    <w:p>
+      <w:pPr>
+        <w:pStyle w:val="Balk2"/>
+        <w:spacing w:after="120"/>
+      </w:pPr>
+      <w:r>
+        <w:rPr/>
+        <w:t>Slayt 22: Kısıtlılıklar ve güçlü yönler  (≈ 45 sn)</w:t>
+      </w:r>
+    </w:p>
+    <w:p>
+      <w:pPr>
+        <w:spacing w:after="120"/>
+      </w:pPr>
+      <w:r>
+        <w:rPr/>
         <w:t>Makalede kısıtlılık olarak asistan rotasyonlarının takip sürekliliğini etkileyebileceği, eksik verilerin telefonla ve hasta beyanıyla tamamlandığı ve vareniklinin piyasadan çekilmesinin ilaç seçimini etkilediği belirtilmektedir.</w:t>
       </w:r>
     </w:p>
     <w:p>
       <w:pPr>
-        <w:spacing w:after="140" w:line="300" w:lineRule="auto"/>
-        <w:jc w:val="both"/>
-      </w:pPr>
-      <w:r>
+        <w:spacing w:after="120"/>
+      </w:pPr>
+      <w:r>
+        <w:rPr/>
         <w:t>Güçlü yön olarak, bu çalışmanın bilinen kadarıyla sitizin ile sigara bırakma tedavisini ele alan erişilebilir ilk tez çalışması olduğu ve birçok tedavi seçeneğini bir arada değerlendirdiği vurgulanmaktadır.</w:t>
       </w:r>
     </w:p>
     <w:p>
       <w:pPr>
         <w:pStyle w:val="Balk2"/>
-        <w:spacing w:before="280" w:after="140"/>
-      </w:pPr>
-      <w:r>
+        <w:spacing w:after="120"/>
+      </w:pPr>
+      <w:r>
+        <w:rPr/>
         <w:t>Slayt 23: Sonuç ve öneriler  (≈ 30 sn)</w:t>
       </w:r>
     </w:p>
     <w:p>
       <w:pPr>
-        <w:spacing w:after="140" w:line="300" w:lineRule="auto"/>
-        <w:jc w:val="both"/>
-      </w:pPr>
-      <w:r>
+        <w:spacing w:after="120"/>
+      </w:pPr>
+      <w:r>
+        <w:rPr/>
         <w:t>Çalışmanın sonucuna göre hastaların yaklaşık üçte biri sigarayı bırakmıştır. Kombine tedavi alanlarda bırakma oranı diğer seçeneklere göre daha yüksektir ve tedaviye uyum arttıkça başarı da artmaktadır.</w:t>
       </w:r>
     </w:p>
     <w:p>
       <w:pPr>
-        <w:spacing w:after="140" w:line="300" w:lineRule="auto"/>
-        <w:jc w:val="both"/>
-      </w:pPr>
-      <w:r>
+        <w:spacing w:after="120"/>
+      </w:pPr>
+      <w:r>
+        <w:rPr/>
         <w:t>Makalede tedavi seanslarında hastaların bırakma motivasyonunu artırmaya yönelik çabaların yoğunlaştırılması önerilmektedir.</w:t>
       </w:r>
     </w:p>
     <w:p>
       <w:pPr>
         <w:pStyle w:val="Balk2"/>
-        <w:spacing w:before="280" w:after="140"/>
-      </w:pPr>
-      <w:r>
-        <w:t>Slayt 24: Akılda kalacak mesajlar  (≈ 1 dk)</w:t>
-      </w:r>
-    </w:p>
-    <w:p>
-      <w:pPr>
-        <w:spacing w:after="140" w:line="300" w:lineRule="auto"/>
-        <w:jc w:val="both"/>
-      </w:pPr>
-      <w:r>
+        <w:spacing w:after="120"/>
+      </w:pPr>
+      <w:r>
+        <w:rPr/>
+        <w:t>Slayt 24: Akılda kalacak mesajlar  (≈ 45 sn)</w:t>
+      </w:r>
+    </w:p>
+    <w:p>
+      <w:pPr>
+        <w:spacing w:after="120"/>
+      </w:pPr>
+      <w:r>
+        <w:rPr/>
         <w:t>Sunumu beş mesajla özetlemek istiyorum.</w:t>
       </w:r>
     </w:p>
     <w:p>
       <w:pPr>
-        <w:spacing w:after="140" w:line="300" w:lineRule="auto"/>
-        <w:jc w:val="both"/>
-      </w:pPr>
-      <w:r>
+        <w:spacing w:after="120"/>
+      </w:pPr>
+      <w:r>
+        <w:rPr/>
         <w:t>Hastaların yaklaşık üçte biri sigarayı bırakmıştır. Kombine tedavide başarı daha yüksektir. Bupropion monoterapisi en düşük başarının görüldüğü seçenektir. Hanede sigara içen olması başarıyı azaltmaktadır. Sık takip başarıyla ilişkilidir.</w:t>
       </w:r>
     </w:p>
     <w:p>
       <w:pPr>
         <w:pStyle w:val="Balk2"/>
-        <w:spacing w:before="280" w:after="140"/>
-      </w:pPr>
-      <w:r>
+        <w:spacing w:after="120"/>
+      </w:pPr>
+      <w:r>
+        <w:rPr/>
         <w:t>Slayt 25: Kaynaklar  (≈ 15 sn)</w:t>
       </w:r>
     </w:p>
     <w:p>
       <w:pPr>
-        <w:spacing w:after="140" w:line="300" w:lineRule="auto"/>
-        <w:jc w:val="both"/>
-      </w:pPr>
-      <w:r>
-        <w:t>Kaynaklar Vancouver stiline uygun olarak, kullanım sırasıyla listelenmiştir. Birinci kaynak sunulan makalenin kendisidir; diğerleri makalenin atıf yaptığı çalışmalardır.</w:t>
-      </w:r>
-    </w:p>
-    <w:p>
-      <w:pPr>
-        <w:pStyle w:val="Balk2"/>
-        <w:spacing w:before="280" w:after="140"/>
-      </w:pPr>
-      <w:r>
+        <w:spacing w:after="120"/>
+      </w:pPr>
+      <w:r>
+        <w:rPr/>
+        <w:t>Kaynaklar kullanım sırasına göre listelenmiştir. Birinci kaynak sunulan makalenin kendisidir; diğerleri makalenin atıf yaptığı çalışmalardır.</w:t>
+      </w:r>
+    </w:p>
+    <w:p>
+      <w:pPr>
+        <w:pStyle w:val="Balk2"/>
+        <w:spacing w:after="120"/>
+      </w:pPr>
+      <w:r>
+        <w:rPr/>
         <w:t>Slayt 26: Kapanış  (≈ 15 sn)</w:t>
       </w:r>
     </w:p>
     <w:p>
       <w:pPr>
-        <w:spacing w:after="140" w:line="300" w:lineRule="auto"/>
-        <w:jc w:val="both"/>
-      </w:pPr>
-      <w:r>
+        <w:spacing w:after="120"/>
+      </w:pPr>
+      <w:r>
+        <w:rPr/>
         <w:t>İlginiz ve katkılarınız için teşekkür ederim. Sorularınızı ve görüşlerinizi almaktan memnuniyet duyarım.</w:t>
       </w:r>
     </w:p>
     <w:p>
-      <w:r>
-        <w:br w:type="page"/>
-      </w:r>
-    </w:p>
-    <w:p>
       <w:pPr>
         <w:pStyle w:val="Balk1"/>
-        <w:spacing w:before="280"/>
-      </w:pPr>
-      <w:r>
-        <w:lastRenderedPageBreak/>
+        <w:spacing w:after="120"/>
+      </w:pPr>
+      <w:r>
+        <w:rPr/>
         <w:t>Olası sorular ve yanıtlar</w:t>
       </w:r>
     </w:p>
     <w:p>
       <w:pPr>
-        <w:spacing w:after="140" w:line="300" w:lineRule="auto"/>
-        <w:jc w:val="both"/>
+        <w:spacing w:after="120"/>
       </w:pPr>
       <w:r>
         <w:rPr>
           <w:i/>
-          <w:iCs/>
           <w:color w:val="5F7178"/>
         </w:rPr>
         <w:t>Tartışma bölümünde hocalardan ve asistanlardan gelebilecek sorular için hazırlık notlarıdır.</w:t>
@@ -927,12 +877,11 @@
     </w:p>
     <w:p>
       <w:pPr>
-        <w:spacing w:before="160" w:after="80"/>
+        <w:spacing w:after="120"/>
       </w:pPr>
       <w:r>
         <w:rPr>
           <w:b/>
-          <w:bCs/>
           <w:color w:val="0F4C5C"/>
         </w:rPr>
         <w:t>1. Lojistik regresyon neden kullanılmış?</w:t>
@@ -940,21 +889,20 @@
     </w:p>
     <w:p>
       <w:pPr>
-        <w:spacing w:after="140" w:line="300" w:lineRule="auto"/>
-        <w:jc w:val="both"/>
-      </w:pPr>
-      <w:r>
+        <w:spacing w:after="120"/>
+      </w:pPr>
+      <w:r>
+        <w:rPr/>
         <w:t>Sonuç değişkeni ikilidir (bıraktı/bırakamadı). Lojistik regresyon, birden fazla faktörü aynı anda modele koyarak her birinin bırakma olasılığı üzerindeki bağımsız etkisini tahmin eder.</w:t>
       </w:r>
     </w:p>
     <w:p>
       <w:pPr>
-        <w:spacing w:before="160" w:after="80"/>
+        <w:spacing w:after="120"/>
       </w:pPr>
       <w:r>
         <w:rPr>
           <w:b/>
-          <w:bCs/>
           <w:color w:val="0F4C5C"/>
         </w:rPr>
         <w:t>2. Tablo 6'daki Exp(B) ne anlama geliyor?</w:t>
@@ -962,121 +910,200 @@
     </w:p>
     <w:p>
       <w:pPr>
-        <w:spacing w:after="140" w:line="300" w:lineRule="auto"/>
-        <w:jc w:val="both"/>
-      </w:pPr>
-      <w:r>
-        <w:t>Exp(B) odds oranıdır. Referans gruba göre bırakma odds'unun kaç kat olduğunu gösterir. Örneğin kombine tedavide 3,97 değeri, bupropion monoterapisine göre bırakma odds'unun yaklaşık dört kat yüksek olduğu anlamına gelir. 1'in üzerindeki değerler bırakma lehinedir.</w:t>
-      </w:r>
-    </w:p>
-    <w:p>
-      <w:pPr>
-        <w:spacing w:before="160" w:after="80"/>
+        <w:spacing w:after="120"/>
+      </w:pPr>
+      <w:r>
+        <w:rPr/>
+        <w:t>Exp(B) odds oranıdır. Referans gruba göre bırakma odds'unun kaç kat olduğunu gösterir. Örneğin kombine tedavide 3,968 değeri, bupropion monoterapisine göre bırakma odds'unun yaklaşık dört kat yüksek olduğu anlamına gelir. 1'in üzerindeki değerler bırakma lehinedir.</w:t>
+      </w:r>
+    </w:p>
+    <w:p>
+      <w:pPr>
+        <w:spacing w:after="120"/>
       </w:pPr>
       <w:r>
         <w:rPr>
           <w:b/>
-          <w:bCs/>
           <w:color w:val="0F4C5C"/>
         </w:rPr>
-        <w:t>3. Bonferroni düzeltmesi nedir?</w:t>
-      </w:r>
-    </w:p>
-    <w:p>
-      <w:pPr>
-        <w:spacing w:after="140" w:line="300" w:lineRule="auto"/>
-        <w:jc w:val="both"/>
-      </w:pPr>
-      <w:r>
-        <w:t>Çok sayıda karşılaştırma yapıldığında tesadüfen anlamlı sonuç bulma olasılığı artar. Bonferroni düzeltmesi, anlamlılık eşiğini karşılaştırma sayısına bölerek bu olasılığı azaltır. Makalede düzeltilmiş eşik p&lt;0,003 olarak belirtilmiştir.</w:t>
-      </w:r>
-    </w:p>
-    <w:p>
-      <w:pPr>
-        <w:spacing w:before="160" w:after="80"/>
+        <w:t>3. Tablo 6'daki B katsayısı nedir?</w:t>
+      </w:r>
+    </w:p>
+    <w:p>
+      <w:pPr>
+        <w:spacing w:after="120"/>
+      </w:pPr>
+      <w:r>
+        <w:rPr/>
+        <w:t>B, lojistik regresyondaki ham katsayıdır ve logaritmik ölçektedir. Pozitif değer bırakma lehine, negatif değer aleyhine etkiyi gösterir. Exp(B), yani e üzeri B, bu katsayının odds oranına çevrilmiş halidir.</w:t>
+      </w:r>
+    </w:p>
+    <w:p>
+      <w:pPr>
+        <w:spacing w:after="120"/>
       </w:pPr>
       <w:r>
         <w:rPr>
           <w:b/>
-          <w:bCs/>
           <w:color w:val="0F4C5C"/>
         </w:rPr>
-        <w:t>4. FNBT nasıl puanlanıyor?</w:t>
-      </w:r>
-    </w:p>
-    <w:p>
-      <w:pPr>
-        <w:spacing w:after="140" w:line="300" w:lineRule="auto"/>
-        <w:jc w:val="both"/>
-      </w:pPr>
-      <w:r>
-        <w:t>Altı sorudan oluşur ve 0–10 arasında puanlanır. İlk sigara zamanı ve günlük sigara sayısı 0–3, diğer dört soru 0–1 puan alır. Makalede 0–2 düşük, 3–7 orta, 8–10 yüksek bağımlılık olarak sınıflanmıştır.</w:t>
-      </w:r>
-    </w:p>
-    <w:p>
-      <w:pPr>
-        <w:spacing w:before="160" w:after="80"/>
+        <w:t>4. Wald χ² nedir, nasıl okunur?</w:t>
+      </w:r>
+    </w:p>
+    <w:p>
+      <w:pPr>
+        <w:spacing w:after="120"/>
+      </w:pPr>
+      <w:r>
+        <w:rPr/>
+        <w:t>“Vald ki-kare” diye okunur. Her bir değişkenin katsayısının sıfırdan anlamlı derecede farklı olup olmadığını test eder; B'nin standart hatasına bölünüp karesi alınarak hesaplanır. Değer büyüdükçe p değeri küçülür.</w:t>
+      </w:r>
+    </w:p>
+    <w:p>
+      <w:pPr>
+        <w:spacing w:after="120"/>
       </w:pPr>
       <w:r>
         <w:rPr>
           <w:b/>
-          <w:bCs/>
           <w:color w:val="0F4C5C"/>
         </w:rPr>
-        <w:t>5. Cronbach alfa nedir?</w:t>
-      </w:r>
-    </w:p>
-    <w:p>
-      <w:pPr>
-        <w:spacing w:after="140" w:line="300" w:lineRule="auto"/>
-        <w:jc w:val="both"/>
-      </w:pPr>
-      <w:r>
-        <w:t>Bir ölçeğin iç tutarlılığını, yani soruların aynı kavramı ne ölçüde birlikte ölçtüğünü gösterir. Değer 0 ile 1 arasındadır. FNBT'nin Türkçe çalışmasında 0,56 olarak bildirilmiştir.</w:t>
-      </w:r>
-    </w:p>
-    <w:p>
-      <w:pPr>
-        <w:spacing w:before="160" w:after="80"/>
+        <w:t>5. Bonferroni düzeltmesi nedir?</w:t>
+      </w:r>
+    </w:p>
+    <w:p>
+      <w:pPr>
+        <w:spacing w:after="120"/>
+      </w:pPr>
+      <w:r>
+        <w:rPr/>
+        <w:t>Çok sayıda karşılaştırma yapıldığında tesadüfen anlamlı sonuç bulma olasılığı artar. Bonferroni düzeltmesi, anlamlılık eşiğini karşılaştırma sayısına bölerek bu olasılığı azaltır. Makalede düzeltilmiş anlamlılık düzeyi p&lt;0,003 olarak belirtilmiştir.</w:t>
+      </w:r>
+    </w:p>
+    <w:p>
+      <w:pPr>
+        <w:spacing w:after="120"/>
       </w:pPr>
       <w:r>
         <w:rPr>
           <w:b/>
-          <w:bCs/>
           <w:color w:val="0F4C5C"/>
         </w:rPr>
-        <w:t>6. Retrospektif, kesitsel çalışma ne demektir?</w:t>
-      </w:r>
-    </w:p>
-    <w:p>
-      <w:pPr>
-        <w:spacing w:after="140" w:line="300" w:lineRule="auto"/>
-        <w:jc w:val="both"/>
-      </w:pPr>
-      <w:r>
-        <w:t>Retrospektif, verilerin geçmişte tutulmuş kayıtlardan geriye dönük olarak toplandığını; kesitsel, değişkenlerin belirli bir zaman noktasında değerlendirildiğini ifade eder. Bu çalışmada 2020–2024 yılları arasındaki poliklinik kayıtları incelenmiştir.</w:t>
-      </w:r>
-    </w:p>
-    <w:p>
-      <w:pPr>
-        <w:spacing w:before="160" w:after="80"/>
+        <w:t>6. Neden Mann–Whitney U ve Kruskal–Wallis testleri kullanılmış?</w:t>
+      </w:r>
+    </w:p>
+    <w:p>
+      <w:pPr>
+        <w:spacing w:after="120"/>
+      </w:pPr>
+      <w:r>
+        <w:rPr/>
+        <w:t>Makalede normal dağılım göstermeyen sürekli değişkenler için bu testlerin kullanıldığı belirtilmektedir. Bunlar parametrik olmayan testlerdir; iki grup için Mann–Whitney U, ikiden fazla grup için Kruskal–Wallis kullanılır.</w:t>
+      </w:r>
+    </w:p>
+    <w:p>
+      <w:pPr>
+        <w:spacing w:after="120"/>
       </w:pPr>
       <w:r>
         <w:rPr>
           <w:b/>
-          <w:bCs/>
           <w:color w:val="0F4C5C"/>
         </w:rPr>
-        <w:t>7. Sitizin hakkında ne biliyoruz?</w:t>
-      </w:r>
-    </w:p>
-    <w:p>
-      <w:pPr>
-        <w:spacing w:after="140" w:line="300" w:lineRule="auto"/>
-        <w:jc w:val="both"/>
-      </w:pPr>
-      <w:r>
-        <w:t>Sitizin, vareniklin gibi α4β2 nikotinik asetilkolin reseptörünün parsiyel agonistidir. Doğu ve Orta Avrupa'da uzun süredir kullanılmaktadır. Klinik çalışmalarda plaseboya üstün, NRT ve vareniklinle benzer etkinlikte bulunmuştur. Makaleye göre ülkemizde belirli dönemlerde ücretsiz sağlanmıştır.</w:t>
+        <w:t>7. FNBT nasıl puanlanıyor?</w:t>
+      </w:r>
+    </w:p>
+    <w:p>
+      <w:pPr>
+        <w:spacing w:after="120"/>
+      </w:pPr>
+      <w:r>
+        <w:rPr/>
+        <w:t>Altı sorudan oluşur ve 0–10 arasında puanlanır. İlk sigara zamanı ve günlük sigara sayısı 0–3, diğer dört soru 0–1 puan alır. Makalede 0–2 düşük, 3–7 orta, 8–10 yüksek bağımlılık olarak sınıflanmıştır.</w:t>
+      </w:r>
+    </w:p>
+    <w:p>
+      <w:pPr>
+        <w:spacing w:after="120"/>
+      </w:pPr>
+      <w:r>
+        <w:rPr>
+          <w:b/>
+          <w:color w:val="0F4C5C"/>
+        </w:rPr>
+        <w:t>8. Cronbach alfa nedir?</w:t>
+      </w:r>
+    </w:p>
+    <w:p>
+      <w:pPr>
+        <w:spacing w:after="120"/>
+      </w:pPr>
+      <w:r>
+        <w:rPr/>
+        <w:t>Bir ölçeğin iç tutarlılığını, yani soruların aynı kavramı ne ölçüde birlikte ölçtüğünü gösterir. Değer 0 ile 1 arasındadır. FNBT'nin Türkçe çalışmasında 0,56 olarak bildirilmiştir.</w:t>
+      </w:r>
+    </w:p>
+    <w:p>
+      <w:pPr>
+        <w:spacing w:after="120"/>
+      </w:pPr>
+      <w:r>
+        <w:rPr>
+          <w:b/>
+          <w:color w:val="0F4C5C"/>
+        </w:rPr>
+        <w:t>9. Retrospektif, kesitsel çalışma ne demektir?</w:t>
+      </w:r>
+    </w:p>
+    <w:p>
+      <w:pPr>
+        <w:spacing w:after="120"/>
+      </w:pPr>
+      <w:r>
+        <w:rPr/>
+        <w:t>Retrospektif, verilerin geçmişte tutulmuş kayıtlardan geriye dönük olarak toplandığını; kesitsel, değişkenlerin belirli bir zaman noktasında değerlendirildiğini ifade eder. Bu çalışmada 2020–2024 yılları arasındaki poliklinik kayıtları incelenmiştir.</w:t>
+      </w:r>
+    </w:p>
+    <w:p>
+      <w:pPr>
+        <w:spacing w:after="120"/>
+      </w:pPr>
+      <w:r>
+        <w:rPr>
+          <w:b/>
+          <w:color w:val="0F4C5C"/>
+        </w:rPr>
+        <w:t>10. Neden örneklem hesabı yapılmamış?</w:t>
+      </w:r>
+    </w:p>
+    <w:p>
+      <w:pPr>
+        <w:spacing w:after="120"/>
+      </w:pPr>
+      <w:r>
+        <w:rPr/>
+        <w:t>Çalışma döneminde polikliniğe başvuran tüm hastaların kayıtları alındığı için ayrıca bir örneklem büyüklüğü hesaplanmasına gerek duyulmamıştır.</w:t>
+      </w:r>
+    </w:p>
+    <w:p>
+      <w:pPr>
+        <w:spacing w:after="120"/>
+      </w:pPr>
+      <w:r>
+        <w:rPr>
+          <w:b/>
+          <w:color w:val="0F4C5C"/>
+        </w:rPr>
+        <w:t>11. Sitizin hakkında ne biliyoruz?</w:t>
+      </w:r>
+    </w:p>
+    <w:p>
+      <w:pPr>
+        <w:spacing w:after="120"/>
+      </w:pPr>
+      <w:r>
+        <w:rPr/>
+        <w:t>Sitizin, vareniklin gibi α4β2 nikotinik asetilkolin reseptörünün parsiyel agonistidir. Klinik çalışmalarda plaseboya üstün, NRT ile benzer etkinlikte bulunmuştur. Makaleye göre ülkemizde belirli dönemlerde ücretsiz sağlanmıştır.</w:t>
       </w:r>
     </w:p>
     <w:sectPr>

</xml_diff>